<commit_message>
Add CAMI II marine stability probe to paper release
</commit_message>
<xml_diff>
--- a/paper/paper_manuscript.docx
+++ b/paper/paper_manuscript.docx
@@ -41,7 +41,7 @@
     </w:p>
     <w:p>
       <w:r>
-        <w:t>Short-read metagenomic next-generation sequencing (mNGS) pipelines typically process trimmed, ambiguous, or locally perturbed reads, whose useful information may degrade before classifiers or database lookups are applied. In this context, accuracy-led evaluation is incomplete because downstream performance cannot distinguish whether losses of identity, biochemical, or positional information arise in the representation layer or only later in the classifier. Here we introduce a representation-diagnostics framework for controlled short-read (69-150 bp) mNGS settings that dissects short-read representations into four quantifiable dimensions: exact identity retention, biochemical perturbation stability, positional readability, and local mutation sensitivity. Our core compact representation, CK4P-MSP, integrates reverse-complement canonical 4-mer identity with biochemical summaries and multi-scale property pooling; it is evaluated against full-position matrices as a diagnostic upper bound and a canonical spaced-property (CSP) control as a boundary comparator. Across controlled WGS-derived perturbations, ART simulations, CAMI readout probes, and local mutation sensitivity tasks, consistent evidence shows that compact property-aware representations can improve stability while preserving low-dimensional diagnostic readability. Full-position matrices further reveal that fine-grained positional information can add readout value, but at substantially higher dimensional cost, whereas spaced-seed priors transfer to dense read-level descriptors only in scenario-specific contexts, such as particular read lengths or perturbation conditions. These results support a bounded architectural implication: short-read mNGS pipelines should retain exact k-mer, alignment, or curated database evidence as the identity backbone, while compact biochemical and position-aware summaries may serve as auxiliary channels for representation-level robustness auditing rather than as standalone deployment models.</w:t>
+        <w:t>Short-read metagenomic next-generation sequencing (mNGS) pipelines typically process trimmed, ambiguous, or locally perturbed reads, whose useful information may degrade before classifiers or database lookups are applied. In this context, accuracy-led evaluation is incomplete because downstream performance cannot distinguish whether losses of identity, biochemical, or positional information arise in the representation layer or only later in the classifier. Here we introduce a representation-diagnostics framework for controlled short-read (69-150 bp) mNGS settings that dissects short-read representations into four quantifiable dimensions: exact identity retention, biochemical perturbation stability, positional readability, and local mutation sensitivity. Our core compact representation, CK4P-MSP, integrates reverse-complement canonical 4-mer identity with biochemical summaries and multi-scale property pooling; it is evaluated against full-position matrices as a diagnostic upper bound and a canonical spaced-property (CSP) control as a boundary comparator. Across controlled WGS-derived perturbations, ART simulations, CAMI_TOY_low readout probes, a CAMI II marine anonymous-read stability probe, and local mutation sensitivity tasks, consistent evidence shows that compact property-aware representations can improve stability while preserving low-dimensional diagnostic readability. Full-position matrices further reveal that fine-grained positional information can add readout value, but at substantially higher dimensional cost, whereas spaced-seed priors transfer to dense read-level descriptors only in scenario-specific contexts, such as particular read lengths or perturbation conditions. These results support a bounded architectural implication: short-read mNGS pipelines should retain exact k-mer, alignment, or curated database evidence as the identity backbone, while compact biochemical and position-aware summaries may serve as auxiliary channels for representation-level robustness auditing rather than as standalone deployment models.</w:t>
       </w:r>
     </w:p>
     <w:p>
@@ -1157,12 +1157,17 @@
     </w:p>
     <w:p>
       <w:r>
-        <w:t>The experiments were organized into seven data layers, with the scale of each layer reported in Table 2. The WGS perturbation layer contained 25,200 rows from 3,600 clean templates across six genera, 21 species and six read lengths. The position-property ablation layer expanded this to 36,000 rows over the same template set and length grid. ART Illumina-like simulation contributed 75,592 paired rows from 37,796 templates across 69-150 bp reads. CAMI_TOY_low probes used a 104,166-row initial labelled subset and a 216,000-row expanded subset with 30 labels at 69, 75 and 100 bp. The local mutation layer used 250 triplets per analysis cell across 12 representations, four local modes and three read lengths. WGS-derived paired perturbations measured clean-versus-perturbed stability. ART Illumina-like simulation tested whether the same trends persisted under simulator-derived sequencing errors. A quality-stratified ART audit further split simulator outputs by read-quality strata, providing an error-aware check without claiming to model all clinical error processes. CAMI_TOY_low probes tested external metagenomic readability. Controlled position and order tasks tested whether positional information was recoverable. Local mutation sensitivity compared structured local changes with matched nuisance perturbation. Boundary probes tested spaced-seed transfer, context visibility and ARG/SNP limits.</w:t>
+        <w:t>The experiments were organized into eight data layers, with the scale of each layer reported in Table 2. The WGS perturbation layer contained 25,200 rows from 3,600 clean templates across six genera, 21 species and six read lengths. The position-property ablation layer expanded this to 36,000 rows over the same template set and length grid. ART Illumina-like simulation contributed 75,592 paired rows from 37,796 templates across 69-150 bp reads. CAMI_TOY_low probes used a 104,166-row initial labelled subset and a 216,000-row expanded subset with 30 labels at 69, 75 and 100 bp. The CAMI II marine lightweight probe used 4,000 anonymous source reads and 48,000 length/condition rows at 69, 75 and 100 bp. The local mutation layer used 250 triplets per analysis cell across 12 representations, four local modes and three read lengths. WGS-derived paired perturbations measured clean-versus-perturbed stability. ART Illumina-like simulation tested whether the same trends persisted under simulator-derived sequencing errors. A quality-stratified ART audit further split simulator outputs by read-quality strata, providing an error-aware check without claiming to model all clinical error processes. CAMI_TOY_low probes tested external metagenomic readability, whereas the CAMI II marine subset tested perturbation stability on anonymous external metagenomic reads without read-level taxonomic labels in this lightweight analysis. Controlled position and order tasks tested whether positional information was recoverable. Local mutation sensitivity compared structured local changes with matched nuisance perturbation. Boundary probes tested spaced-seed transfer, context visibility and ARG/SNP limits.</w:t>
       </w:r>
     </w:p>
     <w:p>
       <w:r>
         <w:t>For CAMI_TOY_low, labels were normalized to a species-level view when available, and genus-level and target-versus-background probes were derived from the same normalized label field. Background or unclassified reads were retained only for probes that explicitly required a target/background split, whereas the labelled subsets were used for lightweight external readout at 30 labels across 69, 75 and 100 bp. The initial labelled subset supported the first external probe, and the expanded subset was used when the probe required broader label coverage. This lightweight CAMI use was intended to test whether representation-level readability survives an external metagenomic probe, not to approximate production-scale community profiling.</w:t>
+      </w:r>
+    </w:p>
+    <w:p>
+      <w:r>
+        <w:t>We also added a lightweight CAMI II marine subset as an external short-read stability probe. We streamed a prefix of CAMI II marine short-read sample 0 and parsed 4,000 anonymous 150 bp reads from the embedded anonymous_reads.fq.gz member. These reads were truncated to 69, 75 and 100 bp and expanded into clean, N_3pct, substitution_1pct and substitution_1pct_N_3pct conditions, yielding 48,000 length/condition rows. CAMI II provides benchmark truth resources, but the anonymous FASTQ headers did not provide read-level taxonomic labels in the streamed-read file used here, and the separate OTU-specific truth bundles were not reconstructed for this lightweight analysis. This CAMI II probe was therefore restricted to paired perturbation-stability metrics. It should be interpreted as an external metagenomic stability check, not as CAMI II taxonomic validation.</w:t>
       </w:r>
     </w:p>
     <w:p>
@@ -1833,6 +1838,128 @@
                 <w:rFonts w:ascii="Times New Roman" w:hAnsi="Times New Roman"/>
                 <w:sz w:val="16"/>
               </w:rPr>
+              <w:t>CAMI II marine anonymous-read probe</w:t>
+            </w:r>
+          </w:p>
+        </w:tc>
+        <w:tc>
+          <w:tcPr>
+            <w:tcW w:type="dxa" w:w="2350"/>
+            <w:vAlign w:val="center"/>
+            <w:tcMar>
+              <w:top w:w="80" w:type="dxa"/>
+              <w:start w:w="120" w:type="dxa"/>
+              <w:bottom w:w="80" w:type="dxa"/>
+              <w:end w:w="120" w:type="dxa"/>
+            </w:tcMar>
+          </w:tcPr>
+          <w:p>
+            <w:pPr>
+              <w:spacing w:after="0" w:line="240" w:lineRule="auto"/>
+            </w:pPr>
+            <w:r>
+              <w:rPr>
+                <w:rFonts w:ascii="Times New Roman" w:hAnsi="Times New Roman"/>
+                <w:sz w:val="16"/>
+              </w:rPr>
+              <w:t>48,000 rows from 4,000 anonymous source reads; lengths 69,75,100 bp</w:t>
+            </w:r>
+          </w:p>
+        </w:tc>
+        <w:tc>
+          <w:tcPr>
+            <w:tcW w:type="dxa" w:w="2000"/>
+            <w:vAlign w:val="center"/>
+            <w:tcMar>
+              <w:top w:w="80" w:type="dxa"/>
+              <w:start w:w="120" w:type="dxa"/>
+              <w:bottom w:w="80" w:type="dxa"/>
+              <w:end w:w="120" w:type="dxa"/>
+            </w:tcMar>
+          </w:tcPr>
+          <w:p>
+            <w:pPr>
+              <w:spacing w:after="0" w:line="240" w:lineRule="auto"/>
+            </w:pPr>
+            <w:r>
+              <w:rPr>
+                <w:rFonts w:ascii="Times New Roman" w:hAnsi="Times New Roman"/>
+                <w:sz w:val="16"/>
+              </w:rPr>
+              <w:t>Do stability trends persist in a more complex external metagenomic read source?</w:t>
+            </w:r>
+          </w:p>
+        </w:tc>
+        <w:tc>
+          <w:tcPr>
+            <w:tcW w:type="dxa" w:w="1800"/>
+            <w:vAlign w:val="center"/>
+            <w:tcMar>
+              <w:top w:w="80" w:type="dxa"/>
+              <w:start w:w="120" w:type="dxa"/>
+              <w:bottom w:w="80" w:type="dxa"/>
+              <w:end w:w="120" w:type="dxa"/>
+            </w:tcMar>
+          </w:tcPr>
+          <w:p>
+            <w:pPr>
+              <w:spacing w:after="0" w:line="240" w:lineRule="auto"/>
+            </w:pPr>
+            <w:r>
+              <w:rPr>
+                <w:rFonts w:ascii="Times New Roman" w:hAnsi="Times New Roman"/>
+                <w:sz w:val="16"/>
+              </w:rPr>
+              <w:t>paired cosine, L2 drift, retrieval</w:t>
+            </w:r>
+          </w:p>
+        </w:tc>
+        <w:tc>
+          <w:tcPr>
+            <w:tcW w:type="dxa" w:w="1860"/>
+            <w:vAlign w:val="center"/>
+            <w:tcMar>
+              <w:top w:w="80" w:type="dxa"/>
+              <w:start w:w="120" w:type="dxa"/>
+              <w:bottom w:w="80" w:type="dxa"/>
+              <w:end w:w="120" w:type="dxa"/>
+            </w:tcMar>
+          </w:tcPr>
+          <w:p>
+            <w:pPr>
+              <w:spacing w:after="0" w:line="240" w:lineRule="auto"/>
+            </w:pPr>
+            <w:r>
+              <w:rPr>
+                <w:rFonts w:ascii="Times New Roman" w:hAnsi="Times New Roman"/>
+                <w:sz w:val="16"/>
+              </w:rPr>
+              <w:t>paired stability without reconstructed read-level taxonomic labels</w:t>
+            </w:r>
+          </w:p>
+        </w:tc>
+      </w:tr>
+      <w:tr>
+        <w:tc>
+          <w:tcPr>
+            <w:tcW w:type="dxa" w:w="1350"/>
+            <w:vAlign w:val="center"/>
+            <w:tcMar>
+              <w:top w:w="80" w:type="dxa"/>
+              <w:start w:w="120" w:type="dxa"/>
+              <w:bottom w:w="80" w:type="dxa"/>
+              <w:end w:w="120" w:type="dxa"/>
+            </w:tcMar>
+          </w:tcPr>
+          <w:p>
+            <w:pPr>
+              <w:spacing w:after="0" w:line="240" w:lineRule="auto"/>
+            </w:pPr>
+            <w:r>
+              <w:rPr>
+                <w:rFonts w:ascii="Times New Roman" w:hAnsi="Times New Roman"/>
+                <w:sz w:val="16"/>
+              </w:rPr>
               <w:t>controlled position tasks</w:t>
             </w:r>
           </w:p>
@@ -2195,7 +2322,7 @@
     </w:p>
     <w:p>
       <w:r>
-        <w:t>The mixed-feature question was also tested through empirical information and counterfactual audits. For a perturbation label Y and representation-derived distance or readout features X, we estimated discretized pooled and conditional MI proxies using equal-frequency binning. The main pooled distance audits used eight bins, joint P/MSP summaries used five- or six-bin discretizations depending on the audit, and empirical permutation baselines used 200 shuffles per cell. These values are reported as estimator-dependent descriptive proxies rather than absolute physical information quantities. To test estimator sensitivity, we also ran a Ross/KSG-style k-nearest-neighbor MI robustness audit for continuous distance summaries and a discrete local-versus-noise perturbation label. This audit used k=5, 50 label permutations, 50 stratified subsampling repetitions and low-dimensional summaries including d_K, d_P, d_M, d_K+d_P, d_K+d_M, and d_K+d_P+d_M across the 69, 100 and 150 bp local-mutation cells. To separate the global and positional property layers, we additionally evaluated CK4, CK4+P, CK4+MSP and CK4P-MSP under the same block-normalized assembly rule. This direct contribution audit measured paired stability and local delta-readout, and was paired with a redundancy audit based on rank, canonical-correlation analysis and row-wise P/MSP alignment. To test whether the P/MSP contribution was more than additional dimensions, we also constructed CK4 plus permuted P/MSP blocks and CK4 plus Gaussian P/MSP blocks. These controls preserve a larger feature space but remove the sequence-linked biochemical mapping. The analysis was used as empirical support for perturbation-relevant information in the added property layers. It was not treated as a dataset-independent proof that I([CK4, P];Y) is always greater than I(CK4;Y) or that P and MSP are mathematically orthogonal.</w:t>
+        <w:t>The mixed-feature question was also tested through empirical information and counterfactual audits. For a perturbation label Y and representation-derived distance or readout features X, we estimated discretized pooled and conditional MI proxies using equal-frequency binning. The main pooled distance audits used eight bins, joint P/MSP summaries used five- or six-bin discretizations depending on the audit, and empirical permutation baselines used 200 shuffles per cell. These values are reported as estimator-dependent descriptive proxies rather than absolute physical information quantities. To test estimator sensitivity, we also ran a Ross/KSG-style k-nearest-neighbor MI robustness audit for continuous distance summaries and a discrete local-versus-noise perturbation label. This audit used k=5, 50 label permutations, 50 stratified subsampling repetitions and low-dimensional summaries including d_K, d_P, d_M, d_K+d_P, d_K+d_M, and d_K+d_P+d_M across the 69, 100 and 150 bp local-mutation cells. To separate the global and positional property layers, we additionally evaluated CK4, CK4+P, CK4+MSP and CK4P-MSP under the same block-normalized assembly rule. This direct contribution audit measured paired stability and local delta-readout, and was paired with a redundancy audit based on rank, canonical-correlation analysis and row-wise P/MSP alignment. To test whether the P/MSP contribution was more than additional dimensions, we also constructed CK4 plus permuted P/MSP blocks and CK4 plus Gaussian P/MSP blocks. These controls preserve a larger feature space but remove the sequence-linked biochemical mapping. The analysis was used as empirical support for perturbation-relevant information in the added property layers, not as a dataset-independent information-theoretic guarantee or as evidence that P and MSP are independent physical axes.</w:t>
       </w:r>
     </w:p>
     <w:p>
@@ -2213,7 +2340,7 @@
     </w:p>
     <w:p>
       <w:r>
-        <w:t>All generated results used local scripts and result tables stored under the project workspace. Main figure assets are in info/paper/figures, table assets are in info/paper/tables, the baseline supplementary figures are generated by info/scripts/generate_paper_supplementary_figures.py, the kNN MI robustness audit by info/scripts/run_knn_mi_robustness_audit.py, the high-k compressed baseline audit by info/scripts/run_high_k_compressed_baselines.py, the P/MSP contribution audit by info/scripts/run_p_msp_contribution_audit.py, the P/MSP redundancy and runtime audit by info/scripts/run_property_redundancy_and_runtime_audit.py, and the P-channel counterfactual audit by info/scripts/run_p_channel_counterfactual_audit.py. The manuscript should not be read as using restricted hospital reads, as claiming clinical validation, or as proposing a replacement for exact matching systems. Its supported scope is narrower: compact biochemical and position-aware summaries can serve as auxiliary diagnostic channels for representation-level robustness auditing in controlled short-read settings.</w:t>
+        <w:t>All generated results used local scripts and result tables stored under the project workspace. Main figure assets are in info/paper/figures, table assets are in info/paper/tables, the baseline supplementary figures are generated by info/scripts/generate_paper_supplementary_figures.py, the kNN MI robustness audit by info/scripts/run_knn_mi_robustness_audit.py, the high-k compressed baseline audit by info/scripts/run_high_k_compressed_baselines.py, the P/MSP contribution audit by info/scripts/run_p_msp_contribution_audit.py, the P/MSP redundancy and runtime audit by info/scripts/run_property_redundancy_and_runtime_audit.py, the P-channel counterfactual audit by info/scripts/run_p_channel_counterfactual_audit.py, the CAMI II marine lightweight probe by info/scripts/run_cami2_marine_lightweight_probe.py, and its supplementary figure by info/scripts/generate_supp_fig_s10_cami2_marine_probe.py. The manuscript should not be read as using restricted hospital reads, as claiming clinical validation, or as proposing a replacement for exact matching systems. Its supported scope is narrower: compact biochemical and position-aware summaries can serve as auxiliary diagnostic channels for representation-level robustness auditing in controlled short-read settings.</w:t>
       </w:r>
     </w:p>
     <w:p>
@@ -2234,7 +2361,7 @@
     </w:p>
     <w:p>
       <w:r>
-        <w:t>We first tested whether the added biochemical channel carried perturbation-relevant information rather than simply changing the scale of a mixed feature space. In the local-mutation audit, the equal-frequency MI proxy gave a higher pooled value for joint CK4+P/MSP distances than for CK4 distance alone, and the conditional proxy remained positive after conditioning on CK4 distance. Because discretized MI estimates are estimator-dependent, we treated this result as a descriptive screen and repeated the analysis with a k-nearest-neighbor MI robustness audit on low-dimensional distance summaries. Across the 12 local-mutation cells, the kNN audit estimated higher MI for the joint d_K+d_P+d_M summaries than for d_K alone, with a mean incremental estimate of approximately 0.138 bits beyond d_K and permutation support across the tested cells. This result does not establish a universal information-theoretic theorem, but it supports the narrower conclusion that, on the tested perturbation grid and estimators, P/MSP distances carried empirical perturbation information beyond a pure identity-only distance.</w:t>
+        <w:t>We first tested whether the added biochemical channel carried perturbation-relevant information rather than simply changing the scale of a mixed feature space. In the local-mutation audit, the equal-frequency MI proxy gave a higher pooled value for joint CK4+P/MSP distances than for CK4 distance alone, and the conditional proxy remained positive after conditioning on CK4 distance. Because discretized MI estimates are estimator-dependent, we treated this result as a descriptive screen and repeated the analysis with a k-nearest-neighbor MI robustness audit on low-dimensional distance summaries. Across the 12 local-mutation cells, the kNN audit estimated higher MI for the joint d_K+d_P+d_M summaries than for d_K alone, with a mean incremental estimate of approximately 0.138 bits beyond d_K and permutation support across the tested cells. This result is reported as estimator-dependent empirical evidence: on the tested perturbation grid and estimators, P/MSP distances carried perturbation information beyond a pure identity-only distance.</w:t>
       </w:r>
     </w:p>
     <w:p>
@@ -2421,7 +2548,7 @@
     </w:p>
     <w:p>
       <w:r>
-        <w:t>The redundancy audit also cautions against overinterpreting P and MSP as orthogonal. Across the tested lengths, the first canonical correlation between P and MSP was near one and their first principal components were strongly aligned, as expected because both blocks are derived from the same biochemical property family. However, MSP had higher numerical rank than P, and row-wise P/MSP alignment after compression was incomplete. We therefore interpret the blocks as related layers at different scales, not as interchangeable evidence sources or as independent physical axes.</w:t>
+        <w:t>The redundancy audit also cautions against overinterpreting P and MSP as independent axes. Across the tested lengths, the first canonical correlation between P and MSP was near one and their first principal components were strongly aligned, as expected because both blocks are derived from the same biochemical property family. However, MSP had higher numerical rank than P, and row-wise P/MSP alignment after compression was incomplete. We therefore interpret the blocks as related layers at different scales, not as interchangeable evidence sources or as independent physical axes.</w:t>
       </w:r>
     </w:p>
     <w:p>
@@ -3526,12 +3653,17 @@
     </w:p>
     <w:p>
       <w:r>
-        <w:t>ART and CAMI were used to test whether the representation trend survived outside the handcrafted perturbation grid. ART provided simulator-derived sequencing-error evidence, and CAMI_TOY_low provided an external metagenomic readout probe. In both settings, compact property-aware representations retained the broad separation between identity-only stability and property-aware stability. CAMI also showed that target/background information could remain readable even when label-probe performance was limited, reinforcing the distinction between representation readability and production-grade classification.</w:t>
+        <w:t>ART and CAMI were used to test whether the representation trend survived outside the handcrafted perturbation grid. ART provided simulator-derived sequencing-error evidence, and CAMI_TOY_low provided an external metagenomic readout probe. In both settings, compact property-aware representations retained the broad separation between identity-only stability and property-aware stability. CAMI_TOY_low also showed that target/background information could remain readable even when label-probe performance was limited, reinforcing the distinction between representation readability and production-grade classification.</w:t>
       </w:r>
     </w:p>
     <w:p>
       <w:r>
-        <w:t>The quality-stratified ART audit complements this result by showing that simulator consistency persisted across read-quality bins. Together, these analyses support external consistency under controlled simulator and benchmark resources, while stopping short of any claim of clinical deployment performance.</w:t>
+        <w:t>The quality-stratified ART audit complements this result by showing that simulator consistency persisted across read-quality bins. To test whether the compact-stability trend was restricted to CAMI_TOY_low, we added the CAMI II marine anonymous-read subset probe (Supplementary Figure S10). Across all nine combinations of length (69, 75 and 100 bp) and perturbation (N_3pct, substitution_1pct and substitution_1pct_N_3pct), CK4P-MSP had the lowest mean L2 drift among the tested compact representations and retained nearest-clean retrieval. Mean paired cosine for CK4P-MSP was approximately 0.995 under N masking, 0.998 under substitution and 0.992-0.993 under the combined perturbation, with mean L2 drift ranges of 0.095-0.102, 0.047-0.048 and 0.114-0.121, respectively. This result supports the external stability pattern in a more complex CAMI II metagenomic read source, while remaining a stability probe without read-level taxonomic labels in this lightweight analysis rather than a taxonomic validation.</w:t>
+      </w:r>
+    </w:p>
+    <w:p>
+      <w:r>
+        <w:t>Together, these analyses support external consistency under controlled simulator and benchmark resources, while stopping short of any claim of clinical deployment performance.</w:t>
       </w:r>
     </w:p>
     <w:p>
@@ -3589,6 +3721,59 @@
     <w:p/>
     <w:p>
       <w:pPr>
+        <w:pStyle w:val="Caption"/>
+        <w:keepNext/>
+      </w:pPr>
+      <w:r>
+        <w:rPr>
+          <w:b/>
+        </w:rPr>
+        <w:t>Supplementary Figure S10. CAMI II marine anonymous-read stability probe.</w:t>
+      </w:r>
+    </w:p>
+    <w:p>
+      <w:pPr>
+        <w:keepLines/>
+        <w:jc w:val="center"/>
+      </w:pPr>
+      <w:r>
+        <w:drawing>
+          <wp:inline xmlns:a="http://schemas.openxmlformats.org/drawingml/2006/main" xmlns:pic="http://schemas.openxmlformats.org/drawingml/2006/picture">
+            <wp:extent cx="5257800" cy="4466973"/>
+            <wp:docPr id="13" name="Picture 13" descr="Picture 13"/>
+            <wp:cNvGraphicFramePr>
+              <a:graphicFrameLocks noChangeAspect="1"/>
+            </wp:cNvGraphicFramePr>
+            <a:graphic>
+              <a:graphicData uri="http://schemas.openxmlformats.org/drawingml/2006/picture">
+                <pic:pic>
+                  <pic:nvPicPr>
+                    <pic:cNvPr id="0" name="supp_fig_s10_cami2_marine_probe.jpg"/>
+                    <pic:cNvPicPr/>
+                  </pic:nvPicPr>
+                  <pic:blipFill>
+                    <a:blip r:embed="rId21"/>
+                    <a:stretch>
+                      <a:fillRect/>
+                    </a:stretch>
+                  </pic:blipFill>
+                  <pic:spPr>
+                    <a:xfrm>
+                      <a:off x="0" y="0"/>
+                      <a:ext cx="5257800" cy="4466973"/>
+                    </a:xfrm>
+                    <a:prstGeom prst="rect"/>
+                  </pic:spPr>
+                </pic:pic>
+              </a:graphicData>
+            </a:graphic>
+          </wp:inline>
+        </w:drawing>
+      </w:r>
+    </w:p>
+    <w:p/>
+    <w:p>
+      <w:pPr>
         <w:pStyle w:val="Heading3"/>
       </w:pPr>
       <w:r>
@@ -3626,7 +3811,7 @@
         <w:drawing>
           <wp:inline xmlns:a="http://schemas.openxmlformats.org/drawingml/2006/main" xmlns:pic="http://schemas.openxmlformats.org/drawingml/2006/picture">
             <wp:extent cx="5577840" cy="2795118"/>
-            <wp:docPr id="13" name="Picture 13" descr="Picture 13"/>
+            <wp:docPr id="14" name="Picture 14" descr="Picture 14"/>
             <wp:cNvGraphicFramePr>
               <a:graphicFrameLocks noChangeAspect="1"/>
             </wp:cNvGraphicFramePr>
@@ -3638,7 +3823,7 @@
                     <pic:cNvPicPr/>
                   </pic:nvPicPr>
                   <pic:blipFill>
-                    <a:blip r:embed="rId21"/>
+                    <a:blip r:embed="rId22"/>
                     <a:stretch>
                       <a:fillRect/>
                     </a:stretch>
@@ -3697,7 +3882,7 @@
         <w:drawing>
           <wp:inline xmlns:a="http://schemas.openxmlformats.org/drawingml/2006/main" xmlns:pic="http://schemas.openxmlformats.org/drawingml/2006/picture">
             <wp:extent cx="5577840" cy="3083306"/>
-            <wp:docPr id="14" name="Picture 14" descr="Picture 14"/>
+            <wp:docPr id="15" name="Picture 15" descr="Picture 15"/>
             <wp:cNvGraphicFramePr>
               <a:graphicFrameLocks noChangeAspect="1"/>
             </wp:cNvGraphicFramePr>
@@ -3709,7 +3894,7 @@
                     <pic:cNvPicPr/>
                   </pic:nvPicPr>
                   <pic:blipFill>
-                    <a:blip r:embed="rId22"/>
+                    <a:blip r:embed="rId23"/>
                     <a:stretch>
                       <a:fillRect/>
                     </a:stretch>
@@ -5318,7 +5503,7 @@
         <w:drawing>
           <wp:inline xmlns:a="http://schemas.openxmlformats.org/drawingml/2006/main" xmlns:pic="http://schemas.openxmlformats.org/drawingml/2006/picture">
             <wp:extent cx="5669280" cy="3152750"/>
-            <wp:docPr id="15" name="Picture 15" descr="Picture 15"/>
+            <wp:docPr id="16" name="Picture 16" descr="Picture 16"/>
             <wp:cNvGraphicFramePr>
               <a:graphicFrameLocks noChangeAspect="1"/>
             </wp:cNvGraphicFramePr>
@@ -5330,7 +5515,7 @@
                     <pic:cNvPicPr/>
                   </pic:nvPicPr>
                   <pic:blipFill>
-                    <a:blip r:embed="rId23"/>
+                    <a:blip r:embed="rId24"/>
                     <a:stretch>
                       <a:fillRect/>
                     </a:stretch>
@@ -5714,12 +5899,12 @@
     </w:p>
     <w:p>
       <w:r>
-        <w:t>The additional analyses sharpen this interpretation. Same-dimension PCA/SVD controls show that the compact mixed representation is not simply benefiting from a larger feature budget. Dimension-matched high-k compressed baselines show that the stability result is not limited to comparisons with short contiguous k-mer counts: CK4P-MSP remained more stable than k=15 MinHash, hashed and random-projection controls at a comparable feature budget, although shallow readout differences were modest. Block-weight audits show that the conclusion is not tied to one arbitrary identity/property scaling. Paired Wilcoxon tests verify that the main stability contrasts are reproducible across matched analysis cells. The empirical MI and k-nearest-neighbor MI audits indicate that P/MSP distance summaries retain perturbation-relevant information beyond CK4 distance in the tested local-mutation regime. The direct P/MSP contribution audit showed that both CK4+P and CK4+MSP reduced drift relative to CK4, whereas MSP carried most of the local delta-readout gain. The redundancy audit further showed that P and MSP share a strong global property component but are not interchangeable: MSP has higher numerical rank and incomplete row-wise alignment with P. The P/MSP counterfactual audit separates sequence-linked biochemical information from feature-space expansion: permuted P/MSP blocks approach some stability behavior but do not reproduce the strongest delta-readout, whereas Gaussian auxiliary blocks fail both stability and readout. These analyses do not turn the result into a universal theorem, but they reduce the likelihood that the geometric pattern is explained only by mixed-space dilution, feature count, redundancy or a single weighting choice.</w:t>
+        <w:t>The additional analyses sharpen this interpretation. Same-dimension PCA/SVD controls show that the compact mixed representation is not simply benefiting from a larger feature budget. Dimension-matched high-k compressed baselines show that the stability result is not limited to comparisons with short contiguous k-mer counts: CK4P-MSP remained more stable than k=15 MinHash, hashed and random-projection controls at a comparable feature budget, although shallow readout differences were modest. Block-weight audits show that the conclusion is not tied to one arbitrary identity/property scaling. Paired Wilcoxon tests verify that the main stability contrasts are reproducible across matched analysis cells. The empirical MI and k-nearest-neighbor MI audits indicate that P/MSP distance summaries retain perturbation-relevant information beyond CK4 distance in the tested local-mutation regime. The direct P/MSP contribution audit showed that both CK4+P and CK4+MSP reduced drift relative to CK4, whereas MSP carried most of the local delta-readout gain. The redundancy audit further showed that P and MSP share a strong global property component but are not interchangeable: MSP has higher numerical rank and incomplete row-wise alignment with P. The P/MSP counterfactual audit separates sequence-linked biochemical information from feature-space expansion: permuted P/MSP blocks approach some stability behavior but do not reproduce the strongest delta-readout, whereas Gaussian auxiliary blocks fail both stability and readout. These analyses do not provide a general mathematical guarantee, but they reduce the likelihood that the geometric pattern is explained only by mixed-space dilution, feature count, redundancy or a single weighting choice.</w:t>
       </w:r>
     </w:p>
     <w:p>
       <w:r>
-        <w:t>The perturbation analyses also clarify the scope of the evidence. Uniform substitutions and local mutation sweeps provide controlled tests of representation behavior. ART adds a simulator-derived Illumina-like layer, and the quality-stratified ART audit shows that the main pattern persists across read-quality strata. CAMI_TOY_low provides an external metagenomic readout probe. Together, these data form a consistent body of evidence for representation-level robustness and readability. The manuscript reports the scale of each data layer so that controlled grids, simulator checks and external probes are not conflated. These data do not constitute clinical validation, and they should not be described as such.</w:t>
+        <w:t>The perturbation analyses also clarify the scope of the evidence. Uniform substitutions and local mutation sweeps provide controlled tests of representation behavior. ART adds a simulator-derived Illumina-like layer, and the quality-stratified ART audit shows that the main pattern persists across read-quality strata. CAMI_TOY_low provides a labelled external metagenomic readout probe, whereas the CAMI II marine subset provides a more complex anonymous-read external stability probe without read-level taxonomic labels in this lightweight analysis. Together, these data form a consistent body of evidence for representation-level robustness and readability. The manuscript reports the scale of each data layer so that controlled grids, simulator checks, labelled lightweight readout probes and anonymous-read stability probes are not conflated. These data do not constitute clinical validation, and they should not be described as such.</w:t>
       </w:r>
     </w:p>
     <w:p>
@@ -5742,7 +5927,7 @@
     </w:p>
     <w:p>
       <w:r>
-        <w:t>The second limitation is the perturbation model. Controlled substitutions, ambiguous-base perturbations and local mutation sweeps are useful because they isolate representation behavior, but they do not reproduce every physical process in sequencing data. ART and the quality-stratified ART audit partly address this issue by adding simulator-derived and quality-aware evidence. However, the resulting conclusions remain bounded to controlled short-read and simulator-supported settings, not to unobserved clinical error distributions.</w:t>
+        <w:t>The second limitation is the perturbation model and external benchmark scale. Controlled substitutions, ambiguous-base perturbations and local mutation sweeps are useful because they isolate representation behavior, but they do not reproduce every physical process in sequencing data. ART and the quality-stratified ART audit partly address this issue by adding simulator-derived and quality-aware evidence. CAMI_TOY_low and CAMI II marine add external metagenomic resources, but with different roles: the former supports lightweight labelled readout, and the latter supports only paired stability because read-level taxonomic labels were not reconstructed for the anonymous reads in this lightweight probe. The resulting conclusions therefore remain bounded to controlled short-read, simulator-supported and external stability/readout settings, not to production-scale community profiling or unobserved clinical error distributions.</w:t>
       </w:r>
     </w:p>
     <w:p>
@@ -5826,7 +6011,7 @@
     </w:p>
     <w:p>
       <w:r>
-        <w:t>Publicly reused resources include simulator- and benchmark-derived materials used for ART and CAMI analyses, which should be cited through the corresponding primary publications and public resource records in the final reference list. The restricted clinical sequencing provenance was used only to motivate the 69 and 75 bp read-length conditions, and the underlying clinical sequencing reads were not used as experimental input, are not part of the study data package, and cannot be publicly shared because they derive from a restricted clinical sequencing context.</w:t>
+        <w:t>Publicly reused resources include simulator- and benchmark-derived materials used for ART, CAMI_TOY_low and CAMI II marine analyses, which should be cited through the corresponding primary publications and public resource records in the final reference list. The CAMI II marine lightweight probe used the public short-read sample 0 archive (https://frl.publisso.de/data/frl:6425521/marine/short_read/marmgCAMI2_sample_0_reads.tar.gz) and setup archive (https://frl.publisso.de/data/frl:6425521/marine/short_read/marmgCAMI2_setup.tar.gz). Only a streamed prefix was parsed for the lightweight stability probe, and read-level taxonomic labels were not reconstructed from the separate truth resources for this analysis; the generated subset tables, stability summaries and source figure table should be released with the processed data package. The restricted clinical sequencing provenance was used only to motivate the 69 and 75 bp read-length conditions, and the underlying clinical sequencing reads were not used as experimental input, are not part of the study data package, and cannot be publicly shared because they derive from a restricted clinical sequencing context.</w:t>
       </w:r>
     </w:p>
     <w:p>
@@ -5839,7 +6024,7 @@
     </w:p>
     <w:p>
       <w:r>
-        <w:t>The analysis scripts used to generate tables, figures and reviewer-response audits are maintained under info/scripts and will be released with the processed data package before submission. Key audit scripts include run_knn_mi_robustness_audit.py, run_high_k_compressed_baselines.py, run_p_msp_contribution_audit.py, run_property_redundancy_and_runtime_audit.py, generate_supp_fig_s8_redundancy_runtime_audit.py, run_p_channel_counterfactual_audit.py and run_msp_bin_gamma_sensitivity_audit.py. The final repository URL, software licence and archived release identifier are to be inserted before journal submission.</w:t>
+        <w:t>The analysis scripts used to generate tables, figures and reviewer-response audits are maintained under info/scripts and will be released with the processed data package before submission. Key audit scripts include run_knn_mi_robustness_audit.py, run_high_k_compressed_baselines.py, run_p_msp_contribution_audit.py, run_property_redundancy_and_runtime_audit.py, generate_supp_fig_s8_redundancy_runtime_audit.py, run_p_channel_counterfactual_audit.py, run_msp_bin_gamma_sensitivity_audit.py, run_cami2_marine_lightweight_probe.py and generate_supp_fig_s10_cami2_marine_probe.py. The final repository URL, software licence and archived release identifier are to be inserted before journal submission.</w:t>
       </w:r>
     </w:p>
     <w:p>

</xml_diff>

<commit_message>
Refine Figure 4 narrative and figure layouts
</commit_message>
<xml_diff>
--- a/paper/paper_manuscript.docx
+++ b/paper/paper_manuscript.docx
@@ -2695,7 +2695,7 @@
       <w:r>
         <w:drawing>
           <wp:inline xmlns:a="http://schemas.openxmlformats.org/drawingml/2006/main" xmlns:pic="http://schemas.openxmlformats.org/drawingml/2006/picture">
-            <wp:extent cx="5669280" cy="1889760"/>
+            <wp:extent cx="5669280" cy="3838538"/>
             <wp:docPr id="7" name="Picture 7" descr="Picture 7"/>
             <wp:cNvGraphicFramePr>
               <a:graphicFrameLocks noChangeAspect="1"/>
@@ -2716,7 +2716,7 @@
                   <pic:spPr>
                     <a:xfrm>
                       <a:off x="0" y="0"/>
-                      <a:ext cx="5669280" cy="1889760"/>
+                      <a:ext cx="5669280" cy="3838538"/>
                     </a:xfrm>
                     <a:prstGeom prst="rect"/>
                   </pic:spPr>
@@ -2890,7 +2890,7 @@
       <w:r>
         <w:drawing>
           <wp:inline xmlns:a="http://schemas.openxmlformats.org/drawingml/2006/main" xmlns:pic="http://schemas.openxmlformats.org/drawingml/2006/picture">
-            <wp:extent cx="5257800" cy="5257800"/>
+            <wp:extent cx="5257800" cy="5681580"/>
             <wp:docPr id="10" name="Picture 10" descr="Picture 10"/>
             <wp:cNvGraphicFramePr>
               <a:graphicFrameLocks noChangeAspect="1"/>
@@ -2911,7 +2911,7 @@
                   <pic:spPr>
                     <a:xfrm>
                       <a:off x="0" y="0"/>
-                      <a:ext cx="5257800" cy="5257800"/>
+                      <a:ext cx="5257800" cy="5681580"/>
                     </a:xfrm>
                     <a:prstGeom prst="rect"/>
                   </pic:spPr>
@@ -2966,7 +2966,7 @@
       <w:r>
         <w:drawing>
           <wp:inline xmlns:a="http://schemas.openxmlformats.org/drawingml/2006/main" xmlns:pic="http://schemas.openxmlformats.org/drawingml/2006/picture">
-            <wp:extent cx="5577840" cy="2615387"/>
+            <wp:extent cx="5577840" cy="2914119"/>
             <wp:docPr id="11" name="Picture 11" descr="Picture 11"/>
             <wp:cNvGraphicFramePr>
               <a:graphicFrameLocks noChangeAspect="1"/>
@@ -2987,7 +2987,7 @@
                   <pic:spPr>
                     <a:xfrm>
                       <a:off x="0" y="0"/>
-                      <a:ext cx="5577840" cy="2615387"/>
+                      <a:ext cx="5577840" cy="2914119"/>
                     </a:xfrm>
                     <a:prstGeom prst="rect"/>
                   </pic:spPr>
@@ -3648,12 +3648,12 @@
         <w:pStyle w:val="Heading3"/>
       </w:pPr>
       <w:r>
-        <w:t>External ART and CAMI probes support consistency beyond the controlled grid</w:t>
+        <w:t>External ART and CAMI probes separate stability from task-limited readability</w:t>
       </w:r>
     </w:p>
     <w:p>
       <w:r>
-        <w:t>ART and CAMI were used to test whether the representation trend survived outside the handcrafted perturbation grid. ART provided simulator-derived sequencing-error evidence, and CAMI_TOY_low provided an external metagenomic readout probe. In both settings, compact property-aware representations retained the broad separation between identity-only stability and property-aware stability. CAMI_TOY_low also showed that target/background information could remain readable even when label-probe performance was limited, reinforcing the distinction between representation readability and production-grade classification.</w:t>
+        <w:t>ART and CAMI were used to test whether the representation trend survived outside the handcrafted perturbation grid, while keeping stability and readout as separate questions. ART provided simulator-derived sequencing-error evidence: in the paired-cosine summary, property-aware and spaced-property representations retained higher clean-versus-perturbed similarity than the identity-only k-mer comparators (Figure 4A). CAMI_TOY_low provided an external metagenomic readout probe with two different granularities. A coarse target-versus-background task remained readable across compact representations (Figure 4B), whereas the 30-label fine probe was substantially lower in absolute macro-F1 (Figure 4C). Thus, the external CAMI result supports representation-level readability at a coarse task level, but it also shows that fine-grained label readout remains task-limited and should not be interpreted as production-grade taxonomic classification.</w:t>
       </w:r>
     </w:p>
     <w:p>
@@ -3663,7 +3663,7 @@
     </w:p>
     <w:p>
       <w:r>
-        <w:t>Together, these analyses support external consistency under controlled simulator and benchmark resources, while stopping short of any claim of clinical deployment performance.</w:t>
+        <w:t>Together, these analyses support external consistency under controlled simulator and benchmark resources, while preserving the manuscript boundary: ART supports simulator-derived stability consistency, CAMI_TOY_low supports external readability at a task-limited level, and CAMI II marine supports anonymous-read stability rather than taxonomic validation.</w:t>
       </w:r>
     </w:p>
     <w:p>
@@ -3675,7 +3675,7 @@
         <w:rPr>
           <w:b/>
         </w:rPr>
-        <w:t>Figure 4. External ART and CAMI consistency probes.</w:t>
+        <w:t>Figure 4. ART stability and CAMI coarse/fine readout probes.</w:t>
       </w:r>
     </w:p>
     <w:p>
@@ -3686,7 +3686,7 @@
       <w:r>
         <w:drawing>
           <wp:inline xmlns:a="http://schemas.openxmlformats.org/drawingml/2006/main" xmlns:pic="http://schemas.openxmlformats.org/drawingml/2006/picture">
-            <wp:extent cx="5577840" cy="2686660"/>
+            <wp:extent cx="5577840" cy="2521624"/>
             <wp:docPr id="12" name="Picture 12" descr="Picture 12"/>
             <wp:cNvGraphicFramePr>
               <a:graphicFrameLocks noChangeAspect="1"/>
@@ -3707,7 +3707,7 @@
                   <pic:spPr>
                     <a:xfrm>
                       <a:off x="0" y="0"/>
-                      <a:ext cx="5577840" cy="2686660"/>
+                      <a:ext cx="5577840" cy="2521624"/>
                     </a:xfrm>
                     <a:prstGeom prst="rect"/>
                   </pic:spPr>
@@ -3739,7 +3739,7 @@
       <w:r>
         <w:drawing>
           <wp:inline xmlns:a="http://schemas.openxmlformats.org/drawingml/2006/main" xmlns:pic="http://schemas.openxmlformats.org/drawingml/2006/picture">
-            <wp:extent cx="5257800" cy="4466973"/>
+            <wp:extent cx="5257800" cy="4646707"/>
             <wp:docPr id="13" name="Picture 13" descr="Picture 13"/>
             <wp:cNvGraphicFramePr>
               <a:graphicFrameLocks noChangeAspect="1"/>
@@ -3760,7 +3760,7 @@
                   <pic:spPr>
                     <a:xfrm>
                       <a:off x="0" y="0"/>
-                      <a:ext cx="5257800" cy="4466973"/>
+                      <a:ext cx="5257800" cy="4646707"/>
                     </a:xfrm>
                     <a:prstGeom prst="rect"/>
                   </pic:spPr>
@@ -3810,7 +3810,7 @@
       <w:r>
         <w:drawing>
           <wp:inline xmlns:a="http://schemas.openxmlformats.org/drawingml/2006/main" xmlns:pic="http://schemas.openxmlformats.org/drawingml/2006/picture">
-            <wp:extent cx="5577840" cy="2795118"/>
+            <wp:extent cx="5577840" cy="2873246"/>
             <wp:docPr id="14" name="Picture 14" descr="Picture 14"/>
             <wp:cNvGraphicFramePr>
               <a:graphicFrameLocks noChangeAspect="1"/>
@@ -3831,7 +3831,7 @@
                   <pic:spPr>
                     <a:xfrm>
                       <a:off x="0" y="0"/>
-                      <a:ext cx="5577840" cy="2795118"/>
+                      <a:ext cx="5577840" cy="2873246"/>
                     </a:xfrm>
                     <a:prstGeom prst="rect"/>
                   </pic:spPr>

</xml_diff>

<commit_message>
Prepare private reviewer-access submission release
</commit_message>
<xml_diff>
--- a/paper/paper_manuscript.docx
+++ b/paper/paper_manuscript.docx
@@ -41,7 +41,7 @@
     </w:p>
     <w:p>
       <w:r>
-        <w:t>Short-read metagenomic next-generation sequencing (mNGS) pipelines typically process trimmed, ambiguous, or locally perturbed reads, whose useful information may degrade before classifiers or database lookups are applied. In this context, accuracy-led evaluation is incomplete because downstream performance cannot distinguish whether losses of identity, biochemical, or positional information arise in the representation layer or only later in the classifier. Here we introduce a representation-diagnostics framework for controlled short-read (69-150 bp) mNGS settings that dissects short-read representations into four quantifiable dimensions: exact identity retention, biochemical perturbation stability, positional readability, and local mutation sensitivity. Our core compact representation, CK4P-MSP, integrates reverse-complement canonical 4-mer identity with biochemical summaries and multi-scale property pooling; it is evaluated against full-position matrices as a diagnostic upper bound and a canonical spaced-property (CSP) control as a boundary comparator. Across controlled WGS-derived perturbations, ART simulations, CAMI_TOY_low readout probes, a CAMI II marine anonymous-read stability probe, and local mutation sensitivity tasks, consistent evidence shows that compact property-aware representations can improve stability while preserving low-dimensional diagnostic readability. Full-position matrices further reveal that fine-grained positional information can add readout value, but at substantially higher dimensional cost, whereas spaced-seed priors transfer to dense read-level descriptors only in scenario-specific contexts, such as particular read lengths or perturbation conditions. These results support a bounded architectural implication: short-read mNGS pipelines should retain exact k-mer, alignment, or curated database evidence as the identity backbone, while compact biochemical and position-aware summaries may serve as auxiliary channels for representation-level robustness auditing rather than as standalone deployment models.</w:t>
+        <w:t>Short-read metagenomic next-generation sequencing (mNGS) pipelines often process trimmed, ambiguous or locally perturbed reads. Their useful sequence evidence may be compressed before classifiers or database lookups are applied. In this setting, accuracy-led evaluation is incomplete because downstream performance alone cannot show whether losses of identity, biochemical or positional information arise in the representation layer. Here we introduce a representation-diagnostics framework for controlled short-read (69-150 bp) mNGS settings. The framework dissects representations into four quantifiable dimensions: exact identity retention, biochemical perturbation stability, positional readability and local mutation sensitivity. Our compact representation, CK4P-MSP, combines reverse-complement canonical 4-mer identity with biochemical summaries and multi-scale property pooling. It is evaluated against full-position matrices as a positional upper bound and canonical spaced-property (CSP) as a boundary comparator. Across controlled WGS-derived perturbations, ART simulations, CAMI_TOY_low readout probes, a CAMI II marine anonymous-read stability probe and local mutation sensitivity tasks, compact property-aware representations showed lower standardized perturbation drift while retaining low-dimensional representation readability. Full-position matrices further showed that fine-grained positional information can add readout value at substantially higher dimensional cost, whereas spaced-seed priors transferred to dense read-level descriptors only in scenario-specific contexts. These results support a bounded architectural implication: exact k-mer, alignment and curated database evidence should remain the identity backbone, while compact biochemical and coarse position-aware summaries can provide block-decomposable coordinates for representation-level perturbation auditing.</w:t>
       </w:r>
     </w:p>
     <w:p>
@@ -54,12 +54,12 @@
     </w:p>
     <w:p>
       <w:r>
-        <w:t>Metagenomic next-generation sequencing can interrogate complex or unexpected microbial mixtures without a fixed target panel, and it has become an important route for infectious-disease investigation when targeted assays are insufficient [1,2,3]. Yet the reads entering downstream analysis are often short, trimmed, ambiguous, and locally corrupted; adapter removal, quality trimming, and low-biomass contamination can all change the effective sequence evidence available to a pipeline before classification begins [4,5,6]. In controlled short-read (69-150 bp) mNGS settings, these physical constraints can cause information loss before any classifier is applied. A read representation may already have discarded local identity, biochemical regularity, or positional information long before a benchmark reports success or failure. For this reason, short-read representation is not merely a preprocessing step. It defines which categories of information remain available to any later classifier, alignment routine, or database query. In this manuscript, the 69 and 75 bp settings are used only as length conditions; the underlying clinical data are not publicly available and are not used as experimental input.</w:t>
+        <w:t>Metagenomic next-generation sequencing can interrogate complex or unexpected microbial mixtures without a fixed target panel, and it has become an important route for infectious-disease investigation when targeted assays are insufficient [1,2,3]. Yet the reads entering downstream analysis are often short, trimmed, ambiguous and locally corrupted. Adapter removal, quality trimming and low-biomass contamination can all change the effective sequence evidence available to a pipeline before classification begins [4,5,6]. In controlled short-read (69-150 bp) mNGS settings, these physical constraints do not mean that classification is impossible. They can still reduce the identity margin relative to longer reads and make it harder to see which categories of information remain available. A read representation may already have compressed local identity, biochemical regularity or positional information before a downstream benchmark reports success or failure. For this reason, short-read representation is not merely a preprocessing step. It defines which categories of information remain available to any later classifier, alignment routine or database query. In this manuscript, the 69 and 75 bp settings are used only as representative lower-read-length conditions; the underlying clinical data are not publicly available and are not used as experimental input.</w:t>
       </w:r>
     </w:p>
     <w:p>
       <w:r>
-        <w:t xml:space="preserve">Current metagenomic workflows are strongest when they preserve exact or near-exact identity evidence. Canonical k-mer, minimizer, alignment, and database-backed systems such as </w:t>
+        <w:t xml:space="preserve">Current metagenomic workflows are strongest when they preserve exact or near-exact identity evidence. Canonical k-mer, minimizer, alignment and database-backed systems such as </w:t>
       </w:r>
       <w:r>
         <w:rPr>
@@ -95,37 +95,37 @@
         <w:t>Kaiju</w:t>
       </w:r>
       <w:r>
-        <w:t>, and related indexing frameworks have established the practical value of explicit sequence matching for taxonomic assignment and downstream biological interpretation [7,8,9,10,11]. Community benchmarks further show that performance depends on database coverage, sample composition, novelty, and evaluation context, not only on the classifier name [12,13]. These methods should therefore be acknowledged rather than displaced: exact identity evidence remains the backbone for tasks such as species discrimination, allele-sensitive interpretation, and resistance-gene calling. Spaced-seed indexing further extends this line by tuning match patterns for sensitivity under mutation, but its goal is still matching accuracy rather than layered diagnostic analysis [14]. That limitation is amplified in 69-75 bp ultra-short reads, where the number of uniquely matching k-mers drops sharply. At the same time, these systems are designed to answer a different question from the one asked here. They determine what a read matches, but they do not directly diagnose which kinds of information remain visible in the representation itself when reads are short, noisy, or partially degraded.</w:t>
+        <w:t xml:space="preserve"> and related indexing frameworks have established the practical value of explicit sequence matching for taxonomic assignment and downstream biological interpretation [7,8,9,10,11]. Community benchmarks further show that performance depends on database coverage, sample composition, novelty and evaluation context, not only on the classifier name [12,13]. These methods should therefore be acknowledged rather than displaced: exact identity evidence remains the backbone for tasks such as species discrimination, allele-sensitive interpretation and resistance-gene calling. Spaced-seed indexing further extends this line by tuning match patterns for sensitivity under mutation, but its goal is still matching accuracy rather than layered diagnostic analysis [14]. The value of additional audit coordinates can become more visible in 69-75 bp lower-read-length settings, where exact identity evidence has less redundancy than at 150 bp. At the same time, these systems are designed to answer a different question from the one asked here. They determine what a read matches, but they do not directly diagnose which kinds of information remain visible in the representation itself when reads are short, noisy or partially degraded.</w:t>
       </w:r>
     </w:p>
     <w:p>
       <w:r>
-        <w:t>Vectorized k-mer representations provide the first broad alternative to explicit matching. Here the central operation is to collapse each read or fragment into a composition profile, such as count, frequency, relative-frequency, TF-IDF, or background-adjusted features. PlasFlow and the BMC Bioinformatics 2018 bacteria classifier show that this compact route can be highly competitive when the task is composition-driven rather than order-driven [15,16]. Resource-saving k-mer classification extends the same logic by showing that low-dimensional k-mer distributions plus classical machine learning can remain strong even when deep models are not the only option [17]. However, these vectorized k-mer methods rely solely on composition statistics and do not explicitly layer biochemical stability or positional information alongside identity evidence. That distinction becomes more consequential in 69-75 bp reads, where local composition survives only in compressed form. These methods are not weak baselines; they are a distinct representation family whose success depends on how much local composition survives the short-read regime.</w:t>
+        <w:t>Vectorized k-mer representations provide the first broad alternative to explicit matching. Here the central operation is to collapse each read or fragment into a composition profile, such as count, frequency, relative-frequency, TF-IDF, or background-adjusted features. PlasFlow and the BMC Bioinformatics 2018 bacteria classifier show that this compact route can be highly competitive when the task is composition-driven rather than order-driven [15,16]. Resource-saving k-mer classification extends the same logic by showing that low-dimensional k-mer distributions plus classical machine learning can remain competitive even when deep models are not the only option [17]. However, these vectorized k-mer methods rely solely on composition statistics and do not explicitly layer biochemical stability or positional information alongside identity evidence. That distinction becomes more consequential in 69-75 bp reads, where local composition survives only in compressed form. These methods are not weak baselines; they are a distinct representation family whose success depends on how much local composition survives the short-read regime.</w:t>
       </w:r>
     </w:p>
     <w:p>
       <w:r>
-        <w:t>Hashing and sketching form a separate compression family rather than a lower-rank version of SVD. MinHash, LSH, histosketch, and related sketching strategies map k-mer sets or profiles into fixed-length signatures for rapid similarity search, large-scale database indexing, or ultra-lightweight compression [18,19]. In the local literature map, Kssd and the HULK/histosketch line fill this role most clearly: they compress the representation in service of indexing or neighborhood search, not in service of preserving linear variance structure. That distinction matters here because our vector route is not asking for the cheapest signature possible; it is asking whether a sparse composition vector still contains recoverable class signal once the short-read regime and the downstream classifier are fixed. Sketching papers therefore belong in the related work, but as a neighboring compression paradigm, not as a substitute for vectorized k-mer analysis.</w:t>
+        <w:t>Hashing and sketching form a separate compression family rather than a lower-rank version of SVD. MinHash, LSH, histosketch, and related sketching strategies map k-mer sets or profiles into fixed-length signatures for rapid similarity search, large-scale database indexing, or ultra-lightweight compression [18,19]. In the local literature map, Kssd and the HULK/histosketch line fill this role most clearly: they compress the representation in service of indexing or neighborhood search, not in service of preserving linear variance structure. That distinction matters here because our vector route is not asking for the cheapest signature possible; it is asking whether a sparse composition vector retains linearly accessible signal once the short-read regime and the downstream probe are fixed. Sketching papers therefore belong in the related work, but as a neighboring compression paradigm, not as a substitute for vectorized k-mer analysis.</w:t>
       </w:r>
     </w:p>
     <w:p>
       <w:r>
-        <w:t>Biochemical and signal-based encodings add a second alternative representation family. Chaos-game and genomic-signal formulations, together with numerical mappings such as Voss, tetrahedron, and EIIP-style encodings, expose structure that is not reducible to literal token identity alone [20,21,22,23,24,25,26]. These encodings matter because they keep the question on the representation itself: what survives after a read is translated into a signal, not only what survives after it is matched. In 69-75 bp ultra-short reads, such encodings are especially relevant because they can expose stability patterns even when exact matches thin out. However, existing biochemical encodings are usually used as standalone features rather than layered alongside exact identity evidence, and their perturbation-stabilizing value under controlled ultra-short-read conditions remains largely unquantified.</w:t>
+        <w:t>Biochemical and signal-based encodings add a second alternative representation family. Chaos-game and genomic-signal formulations, together with numerical mappings such as Voss, tetrahedron, and electron-ion interaction potential (EIIP)-style encodings, expose structure that is not reducible to literal token identity alone [20,21,22,23,24,25,26]. These encodings matter because they keep the question on the representation itself: what survives after a read is translated into a signal, not only what survives after it is matched. In lower-read-length settings, such encodings are especially relevant because they can expose stability patterns when exact identity evidence has a smaller margin. However, existing biochemical encodings are usually used as standalone features rather than layered alongside exact identity evidence, and their perturbation-stabilizing value under controlled short-read conditions remains largely unquantified.</w:t>
       </w:r>
     </w:p>
     <w:p>
       <w:r>
-        <w:t>Sequence-token deep learning classifiers make the neighboring problem space especially relevant. DeepMicrobes introduced deep learning for metagenomic taxonomic classification, using canonical k-mer tokenization, embedding, BiLSTM, and attention for read-level assignment [27]. MetaTransformer extended the same general family with self-attention and alternative tokenization or embedding schemes, including character-level, BPE, k-mer, and hash/LSH variants [28]. BERTax showed that a small-k Transformer can support hierarchical taxonomy if the pretraining and output heads are aligned to the task [29]. BarcodeBERT then demonstrated that barcode-scale biodiversity tasks can benefit from domain-specific pretraining and masking choices, but its setting is still a barcode-specific classification problem rather than shotgun short-read mNGS [30]. Large pre-trained DNA language models further extend this representation family as general-purpose encoders, but they matter here as background representation paradigms rather than as direct 69-75 bp comparators [31,32,33,34,35]. Their black-box optimization, reliance on long-range genomic context, and higher computational overhead make them poorly suited for front-end diagnostic auditing of ultra-short reads; moreover, their embeddings are not naturally decomposed into interpretable identity, biochemical, and positional channels. These studies motivate learned representations as powerful downstream classifiers or reusable sequence encoders, but their primary objective is predictive performance or representation transfer, not controlled decomposition of short-read evidence into identity, biochemical stability, and positional readability.</w:t>
+        <w:t>Sequence-token deep learning classifiers make the neighboring problem space especially relevant. DeepMicrobes introduced deep learning for metagenomic taxonomic classification, using canonical k-mer tokenization, embedding, BiLSTM and attention for read-level assignment [27]. MetaTransformer extended the same general family with self-attention and alternative tokenization or embedding schemes, including character-level, BPE, k-mer and hash/LSH variants [28]. BERTax showed that a small-k Transformer can support hierarchical taxonomy if the pretraining and output heads are aligned to the task [29]. BarcodeBERT then demonstrated that barcode-scale biodiversity tasks can benefit from domain-specific pretraining and masking choices, but its setting is still a barcode-specific classification problem rather than shotgun short-read mNGS [30]. Large pre-trained DNA language models further extend this representation family as general-purpose encoders [31,32,33,34,35]. These learned embeddings can be strong, and in some downstream probes they may outperform compact hand-defined representations. The question asked here is different. We do not test whether CK4P-MSP is a stronger predictive encoder than a Transformer. We ask whether a low-dimensional, training-free and block-decomposable representation can make identity, biochemical and coarse positional evidence separately inspectable under controlled short-read perturbation.</w:t>
       </w:r>
     </w:p>
     <w:p>
       <w:r>
-        <w:t>Raw-sequence and position-aware models complete the picture. GeNet learns representations directly from raw DNA while exploiting the hierarchical label structure of metagenomic classification, and it shows that deep learning can reduce memory use without eliminating the need to compare against established mappers [36]. DeepVirFinder, Virtifier, and DETIRE demonstrate that CNN or hybrid architectures can extract useful motif- and composition-level signal from viral fragments, but their target is viral detection rather than multi-class short-read taxonomy [37,38,39]. KmerAperture adds an important boundary case by showing that ordinary k-mer set comparisons can lose synteny, whereas matching k-mers back to their original lists can recover positional information about core and accessory differences [40]. Collectively, these advances matured each representation family in isolation, but they still do not provide a unified diagnostic framework that decomposes ultra-short-read representations along identity, biochemical, and positional axes under controlled perturbation.</w:t>
+        <w:t>Raw-sequence and position-aware models complete the picture. GeNet learns representations directly from raw DNA while exploiting the hierarchical label structure of metagenomic classification, and it shows that deep learning can reduce memory use without eliminating the need to compare against established mappers [36]. DeepVirFinder, Virtifier, and DETIRE demonstrate that CNN or hybrid architectures can extract useful motif- and composition-level signal from viral fragments, but their target is viral detection rather than multi-class short-read taxonomy [37,38,39]. KmerAperture adds an important boundary case by showing that ordinary k-mer set comparisons can lose synteny, whereas matching k-mers back to their original lists can retain positional information about core and accessory differences [40]. Collectively, these advances matured each representation family in isolation, but they still do not provide a unified diagnostic framework that decomposes ultra-short-read representations into identity, biochemical, and positional channels under controlled perturbation.</w:t>
       </w:r>
     </w:p>
     <w:p>
       <w:r>
-        <w:t>Against this background, we study short-read representation as a diagnostics problem rather than as a single-model accuracy competition. We ask how exact identity retention, biochemical perturbation stability, positional readability, and compactness trade off across controlled short-read settings. Our compact main method, CK4P-MSP, combines reverse-complement canonical 4-mer identity with biochemical summaries and multi-scale property pooling to produce a low-dimensional auxiliary descriptor. Full-position matrices serve as diagnostic upper bounds that reveal what fine-grained positional resolution can add, whereas the canonical spaced-property (CSP) control is retained as a mechanistic boundary comparator for testing whether matching-oriented spaced-seed priors transfer to dense read-level representations. The study also incorporates same-dimension reduction controls, paired non-parametric significance tests, block-weight audits of mixed feature spaces, k-nearest-neighbor mutual-information robustness checks, dimension-matched high-k compressed k-mer baselines, and local mutation fraction sweeps. The aim is therefore not to replace exact matching systems, but to clarify what each representation family preserves, what it obscures, and where its useful operating boundary lies.</w:t>
+        <w:t>Against this background, we study short-read representation as a representation-audit problem rather than as a single-model accuracy competition. We ask how exact identity retention, biochemical perturbation stability, positional readability and compactness trade off across controlled short-read settings. Our compact main method, CK4P-MSP, combines reverse-complement canonical 4-mer identity with biochemical summaries and multi-scale property pooling to produce a low-dimensional, block-decomposable audit coordinate system. Full-position matrices serve as positional upper bounds that reveal what fine-grained positional resolution can add, whereas the canonical spaced-property (CSP) control is retained as a mechanistic boundary comparator for testing whether matching-oriented spaced-seed priors transfer to dense read-level representations. The study also incorporates same-dimension reduction controls, paired non-parametric significance tests, block-weight audits of mixed feature spaces, k-nearest-neighbor mutual-information robustness checks, dimension-matched high-k compressed k-mer baselines and local mutation fraction sweeps. The aim is therefore to clarify what each representation family preserves, what it obscures and where its useful operating boundary lies under a compact, interpretable feature budget.</w:t>
       </w:r>
     </w:p>
     <w:p>
@@ -146,12 +146,12 @@
     </w:p>
     <w:p>
       <w:r>
-        <w:t>We designed the study as a representation-diagnostic analysis rather than an end-to-end clinical classification benchmark. The central question was what information remains available in short-read sequence representations after controlled perturbation, and whether biochemical and coarse positional summaries add usable evidence beyond an exact identity backbone. CK4 and CK5 were used as reverse-complement canonical k-mer identity baselines, P denoted global biochemical-property summaries, MSP denoted multi-scale positional property pooling, CK4+P, CK4+MSP and CK4P-MSP tested compact mixed representations, full-position matrices were treated as diagnostic upper bounds, and the canonical spaced-property (CSP) control served as a spaced-seed mechanism comparator.</w:t>
+        <w:t>We designed the study as a representation-diagnostic analysis of controlled short-read perturbation settings. The central question was what information remains inspectable in short-read sequence representations after controlled perturbation. We specifically asked whether biochemical and coarse positional summaries add auditable evidence beyond an exact identity backbone. CK4 and CK5 were used as reverse-complement canonical k-mer identity baselines, P denoted global biochemical-property summaries, MSP denoted multi-scale positional property pooling, CK4+P, CK4+MSP and CK4P-MSP tested compact mixed representations, full-position matrices were treated as positional upper bounds, and the canonical spaced-property (CSP) control served as a spaced-seed mechanism comparator.</w:t>
       </w:r>
     </w:p>
     <w:p>
       <w:r>
-        <w:t>This design makes two claims testable. First, a compact mixed representation should remain close to its clean counterpart under nuisance perturbation while retaining enough information for shallow readout. Second, any benefit of the P or MSP channels should not be reducible to dimensionality, normalization, or dilution in a mixed L2 space. We therefore evaluated compact stability, same-dimension PCA/SVD controls, dimension-matched high-k compressed k-mer baselines, block-weight sensitivity, paired non-parametric tests, k-nearest-neighbor mutual-information robustness checks, P/MSP contribution and counterfactual controls, P/MSP redundancy, feature-extraction runtime and error-aware ART strata as parts of one evidence chain. Throughout, L2 in a mixed representation is interpreted as a standardized diagnostic drift after block construction and normalization, not as a natural biophysical distance between commensurate physical units.</w:t>
+        <w:t>This design makes two questions testable. First, whether a compact mixed representation remains close to its clean counterpart under nuisance perturbation while retaining representation-level readability. Second, whether any apparent benefit of the P or MSP channels can be separated from dimensionality, normalization or dilution in a mixed L2 space. We therefore evaluated compact stability, same-dimension PCA/SVD controls, dimension-matched high-k compressed k-mer baselines, block-weight sensitivity, paired non-parametric tests, k-nearest-neighbor mutual-information robustness checks, P/MSP contribution and counterfactual controls, P/MSP redundancy, feature-extraction runtime and error-aware ART strata as parts of one evidence chain. Shallow readout probes were used to test whether signal remains linearly accessible, not to define the main performance objective. Throughout, L2 in a mixed representation is interpreted as a standardized diagnostic drift after block construction and normalization, not as a natural biophysical distance between commensurate physical units.</w:t>
       </w:r>
     </w:p>
     <w:p>
@@ -165,7 +165,7 @@
         <w:t>Practice and Progress of mNGS Report Interpretation</w:t>
       </w:r>
       <w:r>
-        <w:t>, p. 99). The underlying clinical reads were not used as experimental inputs and are not publicly available; only this length choice informed the experimental design. The remaining lengths were selected for sensitivity analysis: 100, 125 and 150 bp test whether the trends persist as reads become less extreme, and 300 bp is used only as an extended-read reference in selected boundary analyses.</w:t>
+        <w:t>, p. 99). These lengths were used as lower-read-length conditions in which identity evidence has less redundancy than at 150 bp, not as a claim that short reads are unusable. No patient-level reads, labels or sequence content from local restricted sequencing records were analyzed; those records informed only the choice of representative lower-read-length conditions. The remaining lengths were selected for sensitivity analysis: 100, 125 and 150 bp test whether the trends persist as reads become less extreme, and 300 bp is used only as an extended-read reference in selected boundary analyses.</w:t>
       </w:r>
     </w:p>
     <w:p>
@@ -231,7 +231,7 @@
     </w:p>
     <w:p>
       <w:r>
-        <w:t>The representation families were defined to separate identity, global biochemical summaries and coarse positional information. CK4 and CK5 count reverse-complement canonical contiguous k-mers. P summarizes hydrogen-bond class, GC content, purine content, EIIP-like values, N fraction, entropy and length-related properties at the read level. MSP applies the same property family over relative-position bins; its purpose is not to create a larger sequence vocabulary, but to return low-dimensional positional information to an otherwise order-poor k-mer frequency vector. CK4+P concatenates canonical 4-mer identity with global property summaries, CK4+MSP tests positionalized property pooling without the global P block, and CK4P-MSP combines all three blocks. Full-position identity or property matrices retain per-position information and were used only to estimate an upper bound on positional readability. CSP combines spaced-seed counts with property summaries and was used to test whether matching-oriented spaced-seed priors transfer into dense representation diagnostics.</w:t>
+        <w:t>The representation families were defined to separate identity, global biochemical summaries and coarse positional information. CK4 and CK5 count reverse-complement canonical contiguous k-mers. P summarizes hydrogen-bond class, GC content, purine content, electron-ion interaction potential (EIIP)-like values, N fraction, entropy and length-related properties at the read level. MSP applies per-base property channels over relative-position bins. Its purpose is not to create a larger sequence vocabulary or to reconstruct full position. Instead, it adds a coarse positional property summary to an otherwise order-poor k-mer frequency vector. The default 2+3+4+6 binset was chosen as a coarse-to-fine relative-position summary whose finest scale remains above single-position resolution across the 69-150 bp regime. CK4+P concatenates canonical 4-mer identity with global property summaries, CK4+MSP tests positionalized property pooling without the global P block, and CK4P-MSP combines all three blocks. Full-position identity or property matrices retain per-position information and were used only to estimate an upper bound on positional readability. CSP combines spaced-seed counts with property summaries and was used to test whether matching-oriented spaced-seed priors transfer into dense representation diagnostics.</w:t>
       </w:r>
     </w:p>
     <w:p>
@@ -272,7 +272,7 @@
     </w:p>
     <w:p>
       <w:r>
-        <w:t>where α, β and γ are block weights and [· ; ·] denotes concatenation. Because the block norms are fixed before concatenation, the denominator is a fixed scalar for a given weight setting rather than a read-specific global norm. The reported global drift metric was</w:t>
+        <w:t>where α, β and γ are block weights and [· ; ·] denotes concatenation. Unless otherwise stated, all three weights were set to 1. The block-weight audit varied these weights to test whether the observed pattern depended on a single identity/property scaling. Because the block norms are fixed before concatenation, the denominator is a fixed scalar for a given weight setting rather than a read-specific global norm. The reported global drift metric was</w:t>
       </w:r>
     </w:p>
     <w:p>
@@ -1167,12 +1167,12 @@
     </w:p>
     <w:p>
       <w:r>
-        <w:t>We also added a lightweight CAMI II marine subset as an external short-read stability probe. We streamed a prefix of CAMI II marine short-read sample 0 and parsed 4,000 anonymous 150 bp reads from the embedded anonymous_reads.fq.gz member. These reads were truncated to 69, 75 and 100 bp and expanded into clean, N_3pct, substitution_1pct and substitution_1pct_N_3pct conditions, yielding 48,000 length/condition rows. CAMI II provides benchmark truth resources, but the anonymous FASTQ headers did not provide read-level taxonomic labels in the streamed-read file used here, and the separate OTU-specific truth bundles were not reconstructed for this lightweight analysis. This CAMI II probe was therefore restricted to paired perturbation-stability metrics. It should be interpreted as an external metagenomic stability check, not as CAMI II taxonomic validation.</w:t>
+        <w:t>We also added a lightweight CAMI II marine subset as an external short-read stability probe. We streamed a prefix of CAMI II marine short-read sample 0 and parsed 4,000 anonymous 150 bp reads from the embedded anonymous_reads.fq.gz member. These reads were truncated to 69, 75 and 100 bp and expanded into clean, N_3pct, substitution_1pct and substitution_1pct_N_3pct conditions, yielding 48,000 length/condition rows. CAMI II provides benchmark truth resources, but the anonymous FASTQ headers did not provide read-level taxonomic labels in the streamed-read file used here, and the separate OTU-specific truth bundles were not reconstructed for this lightweight analysis. This CAMI II probe therefore reports paired perturbation-stability metrics on an external metagenomic sequence source rather than CAMI II taxonomic validation.</w:t>
       </w:r>
     </w:p>
     <w:p>
       <w:r>
-        <w:t>This layered simulation design was used because each component isolates a different failure mode. The controlled WGS grid makes perturbation type, read length and representation family directly comparable. ART adds a recognized Illumina-like simulator layer, but it is retained as a consistency check rather than treated as ground-truth clinical sequencing physics. The quality-stratified ART audit adds a more explicit error-aware view of the same simulator-derived layer. It supports statements about robustness across quality strata, but it does not by itself establish clinical validation.</w:t>
+        <w:t>This layered simulation design was used because each component isolates a different failure mode. The controlled WGS grid makes perturbation type, read length and representation family directly comparable. ART adds a recognized Illumina-like simulator layer, but it is retained as a consistency check rather than treated as ground-truth clinical sequencing physics. The quality-stratified ART audit adds a more explicit error-aware view of the same simulator-derived layer. It supports statements about robustness across quality strata, but it does not by itself establish validation on clinical sequencing data.</w:t>
       </w:r>
     </w:p>
     <w:p>
@@ -2317,12 +2317,12 @@
     </w:p>
     <w:p>
       <w:r>
-        <w:t>Perturbation stability was quantified by paired cosine similarity, paired L2 drift and nearest-clean retrieval. Readout was quantified by macro-F1 and accuracy from shallow probes, mainly logistic regression and nearest-centroid classification. Compactness was measured by feature dimension. Local mutation analysis used selective-sensitivity ratios and delta-readout to distinguish nuisance stability from sensitivity to structured local change. Bootstrap intervals summarized cell-level variation. Paired Wilcoxon tests with Benjamini-Hochberg correction were used for matched stability comparisons. Same-dimension PCA/SVD controls addressed dimensionality effects, and block-weight audits tested whether mixed-feature conclusions were stable under reasonable reweighting of identity and property blocks.</w:t>
+        <w:t>Perturbation stability was quantified by paired cosine similarity, paired L2 drift and nearest-clean retrieval. Representation readability was quantified by macro-F1 and accuracy from shallow probes, mainly logistic regression and nearest-centroid classification. These readout metrics were used as accessibility probes for low-dimensional features, not as claims of production classifier performance. Compactness was measured by feature dimension. Local mutation analysis used selective-sensitivity ratios and delta-readout to distinguish nuisance stability from sensitivity to structured local change. Bootstrap intervals summarized cell-level variation. Paired Wilcoxon tests with Benjamini-Hochberg correction were used for matched stability comparisons. Same-dimension PCA/SVD controls addressed dimensionality effects, and block-weight audits tested whether mixed-feature conclusions were stable under reasonable reweighting of identity and property blocks.</w:t>
       </w:r>
     </w:p>
     <w:p>
       <w:r>
-        <w:t>The mixed-feature question was also tested through empirical information and counterfactual audits. For a perturbation label Y and representation-derived distance or readout features X, we estimated discretized pooled and conditional MI proxies using equal-frequency binning. The main pooled distance audits used eight bins, joint P/MSP summaries used five- or six-bin discretizations depending on the audit, and empirical permutation baselines used 200 shuffles per cell. These values are reported as estimator-dependent descriptive proxies rather than absolute physical information quantities. To test estimator sensitivity, we also ran a Ross/KSG-style k-nearest-neighbor MI robustness audit for continuous distance summaries and a discrete local-versus-noise perturbation label. This audit used k=5, 50 label permutations, 50 stratified subsampling repetitions and low-dimensional summaries including d_K, d_P, d_M, d_K+d_P, d_K+d_M, and d_K+d_P+d_M across the 69, 100 and 150 bp local-mutation cells. To separate the global and positional property layers, we additionally evaluated CK4, CK4+P, CK4+MSP and CK4P-MSP under the same block-normalized assembly rule. This direct contribution audit measured paired stability and local delta-readout, and was paired with a redundancy audit based on rank, canonical-correlation analysis and row-wise P/MSP alignment. To test whether the P/MSP contribution was more than additional dimensions, we also constructed CK4 plus permuted P/MSP blocks and CK4 plus Gaussian P/MSP blocks. These controls preserve a larger feature space but remove the sequence-linked biochemical mapping. The analysis was used as empirical support for perturbation-relevant information in the added property layers, not as a dataset-independent information-theoretic guarantee or as evidence that P and MSP are independent physical axes.</w:t>
+        <w:t>The mixed-feature question was also tested through empirical information and counterfactual audits. For a perturbation label Y and representation-derived distance or readout features X, we estimated discretized pooled and conditional MI proxies using equal-frequency binning. The main pooled distance audits used eight bins, joint P/MSP summaries used five- or six-bin discretizations depending on the audit, and empirical permutation baselines used 200 shuffles per cell. These values are reported as estimator-dependent descriptive proxies rather than absolute physical information quantities. To test estimator sensitivity, we also ran a nearest-neighbor MI robustness audit using Ross/Kraskov-Stogbauer-Grassberger (KSG)-style estimators for continuous distance summaries and a discrete local-versus-noise perturbation label. This audit used k=5, 50 label permutations, 50 stratified subsampling repetitions and low-dimensional summaries including d_K, d_P, d_M, d_K+d_P, d_K+d_M, and d_K+d_P+d_M across the 69, 100 and 150 bp local-mutation cells. To separate the global and positional property layers, we additionally evaluated CK4, CK4+P, CK4+MSP and CK4P-MSP under the same block-normalized assembly rule. This direct contribution audit measured paired stability and local delta-readout, and was paired with a redundancy audit based on rank, canonical-correlation analysis and row-wise P/MSP alignment. To test whether the P/MSP contribution was more than additional dimensions, we also constructed CK4 plus permuted P/MSP blocks and CK4 plus Gaussian P/MSP blocks. These controls preserve a larger feature space but remove the sequence-linked biochemical mapping. The analysis was used as empirical support for perturbation-associated signal in the added property layers, not as a dataset-independent information-theoretic guarantee or as evidence that P and MSP measure unrelated physical quantities.</w:t>
       </w:r>
     </w:p>
     <w:p>
@@ -2340,7 +2340,7 @@
     </w:p>
     <w:p>
       <w:r>
-        <w:t>All generated results used local scripts and result tables stored under the project workspace. Main figure assets are in info/paper/figures, table assets are in info/paper/tables, the baseline supplementary figures are generated by info/scripts/generate_paper_supplementary_figures.py, the kNN MI robustness audit by info/scripts/run_knn_mi_robustness_audit.py, the high-k compressed baseline audit by info/scripts/run_high_k_compressed_baselines.py, the P/MSP contribution audit by info/scripts/run_p_msp_contribution_audit.py, the P/MSP redundancy and runtime audit by info/scripts/run_property_redundancy_and_runtime_audit.py, the P-channel counterfactual audit by info/scripts/run_p_channel_counterfactual_audit.py, the CAMI II marine lightweight probe by info/scripts/run_cami2_marine_lightweight_probe.py, and its supplementary figure by info/scripts/generate_supp_fig_s10_cami2_marine_probe.py. The manuscript should not be read as using restricted hospital reads, as claiming clinical validation, or as proposing a replacement for exact matching systems. Its supported scope is narrower: compact biochemical and position-aware summaries can serve as auxiliary diagnostic channels for representation-level robustness auditing in controlled short-read settings.</w:t>
+        <w:t>All generated results used local scripts and result tables stored under the project workspace. Main figure assets are in info/paper/figures, table assets are in info/paper/tables, the baseline supplementary figures are generated by info/scripts/generate_paper_supplementary_figures.py, the kNN MI robustness audit by info/scripts/run_knn_mi_robustness_audit.py, the high-k compressed baseline audit by info/scripts/run_high_k_compressed_baselines.py, the P/MSP contribution audit by info/scripts/run_p_msp_contribution_audit.py, the P/MSP redundancy and runtime audit by info/scripts/run_property_redundancy_and_runtime_audit.py, the P-channel counterfactual audit by info/scripts/run_p_channel_counterfactual_audit.py, the CAMI II marine lightweight probe by info/scripts/run_cami2_marine_lightweight_probe.py, and its supplementary figure by info/scripts/generate_supp_fig_s10_cami2_marine_probe.py. The supported scope is compact and controlled: biochemical and position-aware summaries are evaluated as block-decomposable representation-level audit coordinates in short-read settings.</w:t>
       </w:r>
     </w:p>
     <w:p>
@@ -2356,17 +2356,17 @@
         <w:pStyle w:val="Heading3"/>
       </w:pPr>
       <w:r>
-        <w:t>Mixed-feature information gain under local perturbation</w:t>
+        <w:t>Empirical mixed-feature information audit under local perturbation</w:t>
       </w:r>
     </w:p>
     <w:p>
       <w:r>
-        <w:t>We first tested whether the added biochemical channel carried perturbation-relevant information rather than simply changing the scale of a mixed feature space. In the local-mutation audit, the equal-frequency MI proxy gave a higher pooled value for joint CK4+P/MSP distances than for CK4 distance alone, and the conditional proxy remained positive after conditioning on CK4 distance. Because discretized MI estimates are estimator-dependent, we treated this result as a descriptive screen and repeated the analysis with a k-nearest-neighbor MI robustness audit on low-dimensional distance summaries. Across the 12 local-mutation cells, the kNN audit estimated higher MI for the joint d_K+d_P+d_M summaries than for d_K alone, with a mean incremental estimate of approximately 0.138 bits beyond d_K and permutation support across the tested cells. This result is reported as estimator-dependent empirical evidence: on the tested perturbation grid and estimators, P/MSP distances carried perturbation information beyond a pure identity-only distance.</w:t>
+        <w:t>We first tested whether the added biochemical channel showed perturbation-associated signal rather than simply changing the scale of a mixed feature space. In the local-mutation audit, the equal-frequency MI proxy gave a higher pooled value for joint CK4+P/MSP distances than for CK4 distance alone, and the conditional proxy remained positive after conditioning on CK4 distance. Because discretized MI estimates are estimator-dependent, we treated this result as a descriptive screen and repeated the analysis with a k-nearest-neighbor MI robustness audit on low-dimensional distance summaries. Across the 12 local-mutation cells, the kNN audit estimated higher MI for the joint d_K+d_P+d_M summaries than for d_K alone, with a mean incremental estimate of approximately 0.138 bits beyond d_K and permutation support across the tested cells. This result is reported as estimator-dependent empirical evidence: on the tested perturbation grid and estimators, P/MSP distances showed perturbation-associated signal beyond a pure identity-only distance.</w:t>
       </w:r>
     </w:p>
     <w:p>
       <w:r>
-        <w:t>This audit is important for the interpretation of CK4P-MSP. A lower standardized drift could otherwise be attributed to dimensional dilution by low-variance auxiliary features. The MI robustness checks support a more specific conclusion: the property and MSP channels contributed perturbation-relevant empirical information under the tested local-change regime, while the block-weight audit separately checked that the conclusion was not tied to one arbitrary block scaling. The claim is therefore geometric and empirical, not a statement that heterogeneous L2 coordinates have identical physical units.</w:t>
+        <w:t>This audit is important for the interpretation of CK4P-MSP. A lower standardized drift could otherwise be attributed to dimensional dilution by low-variance auxiliary features. The MI robustness checks support a more specific conclusion: the property and MSP channels contributed estimator-dependent perturbation-associated signal under the tested local-change regime, while the block-weight audit separately checked that the conclusion was not tied to one arbitrary block scaling. The claim is therefore metric-based and empirical, not a statement that heterogeneous L2 coordinates have identical physical units.</w:t>
       </w:r>
     </w:p>
     <w:p>
@@ -2543,12 +2543,12 @@
     </w:p>
     <w:p>
       <w:r>
-        <w:t>The local delta-readout pattern was more specific. CK4 and CK4+P achieved mean macro-F1 values of 0.888 and 0.894 for distinguishing structured local change from matched nuisance perturbation, whereas CK4+MSP reached 0.976 and CK4P-MSP reached 0.977. This indicates that the positionalized property layer, rather than the global P block alone, carried most of the coarse positional readout gain. This supports the intended design: P provides a global biochemical stability summary, whereas MSP uses the same property family to return low-dimensional positional information to a compact identity-frequency backbone.</w:t>
+        <w:t>The local delta-readout pattern was more specific. CK4 and CK4+P achieved mean macro-F1 values of 0.888 and 0.894 for distinguishing structured local change from matched nuisance perturbation, whereas CK4+MSP reached 0.976 and CK4P-MSP reached 0.977. This indicates that the positionalized property layer, rather than the global P block alone, carried most of the coarse positional readout gain. This supports the intended design: P provides a global biochemical stability summary, whereas MSP uses the same property family to add low-dimensional positional property summaries to a compact identity-frequency backbone.</w:t>
       </w:r>
     </w:p>
     <w:p>
       <w:r>
-        <w:t>The redundancy audit also cautions against overinterpreting P and MSP as independent axes. Across the tested lengths, the first canonical correlation between P and MSP was near one and their first principal components were strongly aligned, as expected because both blocks are derived from the same biochemical property family. However, MSP had higher numerical rank than P, and row-wise P/MSP alignment after compression was incomplete. We therefore interpret the blocks as related layers at different scales, not as interchangeable evidence sources or as independent physical axes.</w:t>
+        <w:t>The redundancy audit also cautions against overinterpreting P and MSP as separable sources. Across the tested lengths, the first canonical correlation between P and MSP was near one and their first principal components were strongly aligned, as expected because both blocks are derived from the same biochemical property family. However, MSP had higher numerical rank than P, and row-wise P/MSP alignment after compression was incomplete. We therefore interpret the blocks as related layers at different scales, not as interchangeable evidence sources or as measurements of unrelated physical quantities.</w:t>
       </w:r>
     </w:p>
     <w:p>
@@ -2667,12 +2667,12 @@
     </w:p>
     <w:p>
       <w:r>
-        <w:t>We next tested whether MSP becomes noise-dominated when ultra-short reads are divided into finer relative-position bins. The short-bin audit did not show a catastrophic collapse at 69 or 75 bp. In the stability screen, moving from a 2-bin MSP to the full 2+3+4+6-bin MSP changed paired cosine and L2 drift only slightly at the default γ=1 setting: at 69 bp, paired cosine remained approximately 0.986 and L2 drift remained near 0.147; at 75 bp, paired cosine remained approximately 0.987 and L2 drift remained near 0.141. Retrieval also remained effectively saturated.</w:t>
+        <w:t>We next tested whether MSP becomes noise-dominated when ultra-short reads are divided into finer relative-position bins. The short-bin audit did not show an immediate loss of reliability at 69 or 75 bp. In the stability screen, moving from a 2-bin MSP to the full 2+3+4+6-bin MSP changed paired cosine and L2 drift only slightly at the default γ=1 setting: at 69 bp, paired cosine remained approximately 0.986 and L2 drift remained near 0.147; at 75 bp, paired cosine remained approximately 0.987 and L2 drift remained near 0.141. Retrieval also remained effectively saturated.</w:t>
       </w:r>
     </w:p>
     <w:p>
       <w:r>
-        <w:t>The local delta-readout audit showed the opposite of an immediate short-bin failure. Finer multi-scale pooling improved mutation readout at fixed gamma. At 69 bp and γ=1, mean macro-F1 increased from approximately 0.865 with 2 bins to approximately 0.899 with 2+3 bins, 0.946 with 2+3+4 bins and 0.953 with 2+3+4+6 bins. The same monotonic pattern persisted at 100 and 150 bp. Bootstrap widths for pooled property features remained small, whereas worst-case binomial sampling error increased as expected when bins narrowed. The combined interpretation is therefore restrained but favorable: static MSP is not catastrophically noise-dominated in the tested ultra-short-read regime, yet it should still be interpreted as a coarse positional summary rather than as an optimized variance-aware weighting model.</w:t>
+        <w:t>The local delta-readout audit did not show an immediate short-bin failure. Finer multi-scale pooling increased mutation readout at fixed gamma. At 69 bp and γ=1, mean macro-F1 increased from approximately 0.865 with 2 bins to approximately 0.899 with 2+3 bins, 0.946 with 2+3+4 bins and 0.953 with 2+3+4+6 bins. The same monotonic pattern persisted at 100 and 150 bp. Bootstrap widths for pooled property features remained small, whereas worst-case binomial sampling error increased as expected when bins narrowed. The combined interpretation is therefore restrained but favorable: static MSP did not become noise-dominated in the tested ultra-short-read regime, yet it should still be interpreted as a coarse positional summary rather than as an optimized variance-aware weighting model.</w:t>
       </w:r>
     </w:p>
     <w:p>
@@ -2804,7 +2804,7 @@
         <w:pStyle w:val="Heading3"/>
       </w:pPr>
       <w:r>
-        <w:t>Compact biochemical summaries improve perturbation stability</w:t>
+        <w:t>Compact biochemical summaries reduce perturbation drift</w:t>
       </w:r>
     </w:p>
     <w:p>
@@ -2814,7 +2814,7 @@
     </w:p>
     <w:p>
       <w:r>
-        <w:t>The same conclusion survived several fairness checks. Same-dimension PCA/SVD controls showed that the mixed compact result was not simply a consequence of using more features. Dimension-matched high-k compression controls further addressed whether a conventional high-specificity k-mer representation could recover the same behavior under the CK4P-MSP feature budget. In that audit, CK4P-MSP retained higher paired cosine and lower L2 drift than k=15 random projection, MinHash and hashed baselines at approximately 222 features (paired cosine 0.996 and L2 drift 0.078 for CK4P-MSP, compared with paired cosine 0.848, 0.841 and 0.794 and L2 drift 0.484, 0.506 and 0.572 for the three compressed high-k controls). Shallow readout differences were modest (logistic macro-F1 0.401 for CK4P-MSP versus 0.396 for the hashed k=15 control), so this result supports a compact perturbation-stability advantage rather than an end-to-end classifier claim. Paired Wilcoxon tests over matched analysis cells supported the stability differences for key comparisons after multiple-testing correction. Block-weight audits showed that stability and readout conclusions did not depend on one fixed identity/property weighting. P/MSP counterfactual controls further separated dimensionality from sequence-linked biochemical information: CK4 plus permuted P/MSP approached the stability of CK4P-MSP but did not reproduce its local delta-readout (macro-F1 0.875 versus 0.977), while CK4 plus Gaussian P/MSP collapsed both stability and readout. The P/MSP contribution audit further showed that CK4+P and CK4+MSP both reduced drift relative to CK4, while MSP accounted for most of the positional delta-readout gain. Together, these controls show that the stability trend is not explained by feature count, a single weighting choice or random auxiliary columns.</w:t>
+        <w:t>The same conclusion survived several fairness checks. Same-dimension PCA/SVD controls showed that the mixed compact result was not simply a consequence of using more features. Dimension-matched high-k compression controls further addressed whether a conventional high-specificity k-mer representation could show the same behavior under the CK4P-MSP feature budget. In that audit, CK4P-MSP retained higher paired cosine and lower L2 drift than k=15 random projection, MinHash and hashed baselines at approximately 222 features (paired cosine 0.996 and L2 drift 0.078 for CK4P-MSP, compared with paired cosine 0.848, 0.841 and 0.794 and L2 drift 0.484, 0.506 and 0.572 for the three compressed high-k controls). Shallow readout differences were modest (logistic macro-F1 0.401 for CK4P-MSP versus 0.396 for the hashed k=15 control), so this result supports a compact perturbation-stability and auditability advantage rather than a predictive-performance claim. Paired Wilcoxon tests over matched analysis cells supported the stability differences for key comparisons after multiple-testing correction. Block-weight audits showed that stability and readout conclusions did not depend on one fixed identity/property weighting. P/MSP counterfactual controls further separated dimensionality from sequence-linked biochemical information: CK4 plus permuted P/MSP approached the stability of CK4P-MSP but did not reproduce its local delta-readout (macro-F1 0.875 versus 0.977), while CK4 plus Gaussian P/MSP collapsed both stability and readout. The P/MSP contribution audit further showed that CK4+P and CK4+MSP both reduced drift relative to CK4, while MSP accounted for most of the positional delta-readout gain. Together, these controls show that the stability trend is not explained by feature count, a single weighting choice or random auxiliary columns.</w:t>
       </w:r>
     </w:p>
     <w:p>
@@ -2933,17 +2933,17 @@
         <w:pStyle w:val="Heading3"/>
       </w:pPr>
       <w:r>
-        <w:t>CK4P-MSP balances compactness, stability and shallow readout</w:t>
+        <w:t>CK4P-MSP balances compactness, stability and representation readability</w:t>
       </w:r>
     </w:p>
     <w:p>
       <w:r>
-        <w:t>We then evaluated CK4P-MSP as a nested ablation rather than as a standalone classifier. CK4 tested compact identity alone. CK4+P tested whether global biochemical summaries were sufficient. CK4+MSP tested whether positionalized property pooling carried information beyond identity without the global P block. CK4P-MSP tested whether the global and positional property layers together improved the trade-off between stability, dimensionality and shallow readout. This hierarchy is central to the method: the representation is intended to preserve exact identity evidence while adding interpretable biochemical and positional auxiliary channels.</w:t>
+        <w:t>We then evaluated CK4P-MSP as a nested ablation rather than as a predictive model. CK4 tested compact identity alone. CK4+P tested whether global biochemical summaries were sufficient. CK4+MSP tested whether positionalized property pooling carried information beyond identity without the global P block. CK4P-MSP tested the combined trade-off between stability, dimensionality and shallow readout when global and positional property layers were added together. This hierarchy is central to the method: the representation is intended to preserve exact identity evidence while adding interpretable biochemical and coarse positional audit channels.</w:t>
       </w:r>
     </w:p>
     <w:p>
       <w:r>
-        <w:t>The resulting trade-off supported the intended role. CK4P-MSP remained compact, reduced perturbation drift relative to CK4 and CK5 identity baselines, and retained competitive macro-F1 in shallow readout. It was not designed as a standalone readout model, and the manuscript should not describe it as one. Its value is that it occupies a stable and interpretable middle ground between identity-only compact features and high-dimensional full-position matrices.</w:t>
+        <w:t>The resulting trade-off supported the intended role. CK4P-MSP remained compact, reduced perturbation drift relative to CK4 and CK5 identity baselines, and retained accessible signal in shallow readout. Its role is to provide a block-decomposable audit coordinate system between identity-only compact features and high-dimensional full-position matrices, rather than to maximize predictive accuracy against learned embeddings.</w:t>
       </w:r>
     </w:p>
     <w:p>
@@ -3653,12 +3653,12 @@
     </w:p>
     <w:p>
       <w:r>
-        <w:t>ART and CAMI were used to test whether the representation trend survived outside the handcrafted perturbation grid, while keeping stability and readout as separate questions. ART provided simulator-derived sequencing-error evidence: in the paired-cosine summary, property-aware and spaced-property representations retained higher clean-versus-perturbed similarity than the identity-only k-mer comparators (Figure 4A). CAMI_TOY_low provided an external metagenomic readout probe with two different granularities. A coarse target-versus-background task remained readable across compact representations (Figure 4B), whereas the 30-label fine probe was substantially lower in absolute macro-F1 (Figure 4C). Thus, the external CAMI result supports representation-level readability at a coarse task level, but it also shows that fine-grained label readout remains task-limited and should not be interpreted as production-grade taxonomic classification.</w:t>
+        <w:t>ART and CAMI were used to test whether the representation trend survived outside the handcrafted perturbation grid, while keeping stability and readout as separate questions. ART provided simulator-derived sequencing-error evidence: in the paired-cosine summary, property-aware and spaced-property representations retained higher clean-versus-perturbed similarity than the identity-only k-mer comparators (Figure 4A). CAMI_TOY_low provided a lightweight external metagenomic readout probe with two different granularities. A coarse target-versus-background task remained readable across compact representations (Figure 4B), whereas the 30-label fine probe was substantially lower in absolute macro-F1 (Figure 4C). Thus, the external CAMI result supports representation-level readability at a coarse task level, but it also shows that fine-grained label readout remains task-limited and should not be interpreted as production-grade taxonomic classification.</w:t>
       </w:r>
     </w:p>
     <w:p>
       <w:r>
-        <w:t>The quality-stratified ART audit complements this result by showing that simulator consistency persisted across read-quality bins. To test whether the compact-stability trend was restricted to CAMI_TOY_low, we added the CAMI II marine anonymous-read subset probe (Supplementary Figure S10). Across all nine combinations of length (69, 75 and 100 bp) and perturbation (N_3pct, substitution_1pct and substitution_1pct_N_3pct), CK4P-MSP had the lowest mean L2 drift among the tested compact representations and retained nearest-clean retrieval. Mean paired cosine for CK4P-MSP was approximately 0.995 under N masking, 0.998 under substitution and 0.992-0.993 under the combined perturbation, with mean L2 drift ranges of 0.095-0.102, 0.047-0.048 and 0.114-0.121, respectively. This result supports the external stability pattern in a more complex CAMI II metagenomic read source, while remaining a stability probe without read-level taxonomic labels in this lightweight analysis rather than a taxonomic validation.</w:t>
+        <w:t>The quality-stratified ART audit complements this result by showing that simulator consistency persisted across read-quality bins. To test whether the compact-stability trend was restricted to CAMI_TOY_low, we added the CAMI II marine anonymous-read subset probe (Supplementary Figure S10). Across all nine combinations of length (69, 75 and 100 bp) and perturbation (N_3pct, substitution_1pct and substitution_1pct_N_3pct), CK4P-MSP had the lowest mean L2 drift among the tested compact representations and retained nearest-clean retrieval. Mean paired cosine for CK4P-MSP was approximately 0.995 under N masking, 0.998 under substitution and 0.992-0.993 under the combined perturbation, with mean L2 drift ranges of 0.095-0.102, 0.047-0.048 and 0.114-0.121, respectively. Marine metagenomes may differ from clinical or pathogen-rich contexts in sequence composition, so this result should be interpreted as an external sequence-source stability probe. It supports the external stability pattern in a more complex CAMI II metagenomic read source, while remaining a stability probe without read-level taxonomic labels in this lightweight analysis rather than a taxonomic validation.</w:t>
       </w:r>
     </w:p>
     <w:p>
@@ -3787,7 +3787,7 @@
     </w:p>
     <w:p>
       <w:r>
-        <w:t>The result is best interpreted as an upper-bound diagnostic. Full-position matrices clarify the value of positional information, but their high dimensionality and task specificity make them unsuitable as the default representation for compact short-read auditing. CK4P-MSP therefore occupies a different role: it does not match the full positional upper bound, but it recovers part of the positional information at a much smaller feature cost.</w:t>
+        <w:t>The result is best interpreted as an upper-bound diagnostic. Full-position matrices clarify the value of positional information, but their high dimensionality and task specificity make them unsuitable as the default representation for compact short-read auditing. CK4P-MSP therefore occupies a different role: it does not match the full positional upper bound, but it retains a coarse positional property summary at a much smaller feature cost.</w:t>
       </w:r>
     </w:p>
     <w:p>
@@ -3853,12 +3853,12 @@
     </w:p>
     <w:p>
       <w:r>
-        <w:t>A robust representation should not be insensitive to all changes. We therefore tested whether local biochemical change remained distinguishable from matched nuisance perturbation. Property-aware and full-position channels showed larger response to structured local mutation than to matched noise in the relevant comparisons, while CK4P-MSP preserved delta-readout at compact dimensionality. The P/MSP counterfactual audit sharpened this result by showing that the real biochemical mapping, not only extra columns, was needed to obtain the strongest local-change readout.</w:t>
+        <w:t>A stable audit representation should remain responsive to structured changes. We therefore tested whether local biochemical change remained distinguishable from matched nuisance perturbation. Property-aware and full-position channels showed larger response to structured local mutation than to matched noise in the relevant comparisons, while CK4P-MSP preserved delta-readout at compact dimensionality. The P/MSP counterfactual audit sharpened this result by showing that the real biochemical mapping, not only extra columns, was needed to obtain the strongest local-change readout.</w:t>
       </w:r>
     </w:p>
     <w:p>
       <w:r>
-        <w:t>This result supports a division of labor. Paired cosine and L2 drift quantify nuisance stability, whereas selective-sensitivity ratios and delta-readout quantify whether structured local changes remain readable. CK4P-MSP is therefore not merely a smoothed representation. It can remain stable under nuisance perturbation while preserving enough auxiliary information for local-change readout.</w:t>
+        <w:t>This result supports a division of labor. Paired cosine and L2 drift quantify nuisance stability, whereas selective-sensitivity ratios and delta-readout quantify whether structured local changes remain readable. CK4P-MSP is therefore not merely a smoothed representation. It can remain stable under nuisance perturbation while preserving decomposable information for local-change readout.</w:t>
       </w:r>
     </w:p>
     <w:p>
@@ -5550,7 +5550,7 @@
     </w:p>
     <w:p>
       <w:r>
-        <w:t>These negative and boundary results are part of the manuscript's logic. They keep the claim focused on representation diagnostics and auxiliary robustness auditing, rather than allowing the compact feature space to be misread as a full biological interpretation system.</w:t>
+        <w:t>These negative and boundary results are part of the manuscript's logic. They keep the claim focused on representation diagnostics and representation-level perturbation auditing, rather than allowing the compact feature space to be misread as a full biological interpretation system.</w:t>
       </w:r>
     </w:p>
     <w:p>
@@ -5889,27 +5889,32 @@
     </w:p>
     <w:p>
       <w:r>
-        <w:t>This study treats short-read sequence representation as a diagnostic object rather than as a black-box prelude to classification. Across controlled short-read settings, exact identity evidence remained essential, but auxiliary biochemical and coarse positional summaries changed what could be measured under perturbation. CK4P-MSP was most informative in this role: it preserved a reverse-complement canonical 4-mer identity backbone while adding biochemical and multi-scale property pooling channels that improved perturbation stability and retained shallow readout at compact dimensionality.</w:t>
+        <w:t>This study treats short-read sequence representation as an inspectable object rather than only as a black-box prelude to classification. Across controlled short-read settings, exact identity evidence remained essential, but biochemical and coarse positional summaries changed what could be measured under perturbation. CK4P-MSP provided the clearest compact trade-off in this role: it preserved a reverse-complement canonical 4-mer identity backbone while adding biochemical and multi-scale property pooling channels that reduced perturbation drift and retained representation-level readability at compact dimensionality.</w:t>
       </w:r>
     </w:p>
     <w:p>
       <w:r>
-        <w:t>The results support a division of labor between representation families. Exact k-mer features provide the identity backbone needed for database-linked interpretation. Global biochemical summaries provide an auxiliary stability channel that can remain informative when individual exact matches are weakened by trimming, ambiguity or local perturbation. Multi-scale positional property pooling uses the same biochemical property family to return coarse layout information to an otherwise order-poor k-mer frequency vector; it is not a larger k-mer vocabulary or a learned token mapping. Full-position matrices, by contrast, define what can be gained when positional information is preserved almost explicitly; they are useful diagnostic upper bounds but are not the preferred compact representation.</w:t>
+        <w:t>The results support a division of labor between representation families. Exact k-mer features provide the identity backbone needed for database-linked interpretation. Global biochemical summaries provide a stability channel that can remain informative when individual exact matches are weakened by trimming, ambiguity or local perturbation. Multi-scale positional property pooling uses the same biochemical property family to add coarse layout summaries to an otherwise order-poor k-mer frequency vector. It is not a larger k-mer vocabulary, a learned token mapping or a reconstruction of full positional structure. Full-position matrices, by contrast, define what can be gained when positional information is preserved almost explicitly. They are useful diagnostic upper bounds but are not the preferred compact representation.</w:t>
       </w:r>
     </w:p>
     <w:p>
       <w:r>
-        <w:t>The additional analyses sharpen this interpretation. Same-dimension PCA/SVD controls show that the compact mixed representation is not simply benefiting from a larger feature budget. Dimension-matched high-k compressed baselines show that the stability result is not limited to comparisons with short contiguous k-mer counts: CK4P-MSP remained more stable than k=15 MinHash, hashed and random-projection controls at a comparable feature budget, although shallow readout differences were modest. Block-weight audits show that the conclusion is not tied to one arbitrary identity/property scaling. Paired Wilcoxon tests verify that the main stability contrasts are reproducible across matched analysis cells. The empirical MI and k-nearest-neighbor MI audits indicate that P/MSP distance summaries retain perturbation-relevant information beyond CK4 distance in the tested local-mutation regime. The direct P/MSP contribution audit showed that both CK4+P and CK4+MSP reduced drift relative to CK4, whereas MSP carried most of the local delta-readout gain. The redundancy audit further showed that P and MSP share a strong global property component but are not interchangeable: MSP has higher numerical rank and incomplete row-wise alignment with P. The P/MSP counterfactual audit separates sequence-linked biochemical information from feature-space expansion: permuted P/MSP blocks approach some stability behavior but do not reproduce the strongest delta-readout, whereas Gaussian auxiliary blocks fail both stability and readout. These analyses do not provide a general mathematical guarantee, but they reduce the likelihood that the geometric pattern is explained only by mixed-space dilution, feature count, redundancy or a single weighting choice.</w:t>
+        <w:t>The additional analyses sharpen this interpretation. Same-dimension PCA/SVD controls show that the compact mixed representation is not simply benefiting from a larger feature budget. Dimension-matched high-k compressed baselines show that the stability result is not limited to comparisons with short contiguous k-mer counts: CK4P-MSP remained more stable than k=15 MinHash, hashed and random-projection controls at a comparable feature budget, although shallow readout differences were modest. Block-weight audits show that the conclusion is not tied to one arbitrary identity/property scaling. Paired Wilcoxon tests verify that the main stability contrasts are reproducible across matched analysis cells. The empirical MI and k-nearest-neighbor MI audits indicate that P/MSP distance summaries showed perturbation-associated signal beyond CK4 distance in the tested local-mutation regime.</w:t>
       </w:r>
     </w:p>
     <w:p>
       <w:r>
-        <w:t>The perturbation analyses also clarify the scope of the evidence. Uniform substitutions and local mutation sweeps provide controlled tests of representation behavior. ART adds a simulator-derived Illumina-like layer, and the quality-stratified ART audit shows that the main pattern persists across read-quality strata. CAMI_TOY_low provides a labelled external metagenomic readout probe, whereas the CAMI II marine subset provides a more complex anonymous-read external stability probe without read-level taxonomic labels in this lightweight analysis. Together, these data form a consistent body of evidence for representation-level robustness and readability. The manuscript reports the scale of each data layer so that controlled grids, simulator checks, labelled lightweight readout probes and anonymous-read stability probes are not conflated. These data do not constitute clinical validation, and they should not be described as such.</w:t>
+        <w:t>The direct P/MSP contribution audit showed that both CK4+P and CK4+MSP reduced drift relative to CK4, whereas MSP carried most of the local delta-readout gain. The redundancy audit further showed that P and MSP share a strong global property component but are not interchangeable: MSP has higher numerical rank and incomplete row-wise alignment with P. The P/MSP counterfactual audit separates sequence-linked biochemical information from feature-space expansion. Permuted P/MSP blocks approach some stability behavior but do not reproduce the strongest delta-readout, whereas Gaussian auxiliary blocks fail both stability and readout. These analyses do not provide a general mathematical guarantee, but they make the interpretation less dependent on mixed-space dilution, feature count, redundancy or a single weighting choice.</w:t>
       </w:r>
     </w:p>
     <w:p>
       <w:r>
-        <w:t>A useful outcome of the boundary analyses is that they prevent overgeneralization. CSP and spaced-seed controls help interpret which matching-oriented priors transfer into dense read-level representations, but they do not become universal replacements for compact identity-property features. Context and ARG/SNP probes show that compact stability is not the same as allele-level or functional interpretation. Those tasks require database identity, annotation, sufficient context and downstream biological evidence.</w:t>
+        <w:t>The perturbation analyses also clarify the scope of the evidence. Uniform substitutions and local mutation sweeps provide controlled tests of representation behavior. ART adds a simulator-derived Illumina-like layer, and the quality-stratified ART audit shows that the main pattern persists across read-quality strata. CAMI_TOY_low provides a labelled external metagenomic readout probe, whereas the CAMI II marine subset provides a more complex anonymous-read external stability probe without read-level taxonomic labels in this lightweight analysis. Together, these data form a consistent set of evidence for representation-level stability and readability under the tested conditions. The manuscript reports the scale of each data layer so that controlled grids, simulator checks, labelled lightweight readout probes and anonymous-read stability probes are not conflated.</w:t>
+      </w:r>
+    </w:p>
+    <w:p>
+      <w:r>
+        <w:t>A useful outcome of the boundary analyses is that they prevent overgeneralization. CSP and spaced-seed controls help interpret which matching-oriented priors transfer into dense read-level representations, but they do not become general substitutes for compact identity-property features. Context and ARG/SNP probes show that compact stability is not the same as allele-level or functional interpretation. Those tasks require database identity, annotation, sufficient context and downstream biological evidence.</w:t>
       </w:r>
     </w:p>
     <w:p>
@@ -5922,7 +5927,7 @@
     </w:p>
     <w:p>
       <w:r>
-        <w:t>The first limitation is that the study evaluates representation diagnostics, not an operational mNGS classifier. Kraken 2, Centrifuge, CLARK, Kaiju and related systems remain the appropriate reference frame for database-linked taxonomic assignment. The present work asks a different question: what information remains visible before or alongside such assignment systems. Direct integration with production classifiers, including downstream false-hit reduction or classifier-output auditing, remains future work and is not evaluated here.</w:t>
+        <w:t>The first limitation is task scope. The study evaluates representation diagnostics, whereas Kraken 2, Centrifuge, CLARK, Kaiju and related systems remain the appropriate reference frame for database-linked taxonomic assignment. The present work asks what information remains visible before or alongside such assignment systems. Direct integration with production classifiers, including downstream false-hit reduction or classifier-output auditing, remains future work and is not evaluated here.</w:t>
       </w:r>
     </w:p>
     <w:p>
@@ -5932,27 +5937,27 @@
     </w:p>
     <w:p>
       <w:r>
-        <w:t>The third limitation concerns data provenance. The 69 and 75 bp settings were selected as ultra-short read lengths that fall within a commonly reported post-QC mNGS range, and the restricted clinical reads themselves were not used in this study or publicly shared. This is compliant with the manuscript's current claim because the experiments use only the length conditions, not patient-level reads or patient-derived labels. Before submission, the authors should still confirm the institutional wording for describing the data-governance boundary.</w:t>
+        <w:t>The third limitation concerns data provenance. The 69 and 75 bp settings were selected as lower-read-length conditions that fall within a commonly reported post-QC mNGS range, and local restricted sequencing records were not used as study inputs or publicly shared. The experiments therefore use length conditions, not patient-level reads or patient-derived labels. The final submission will include institutionally approved wording for this data-governance boundary.</w:t>
       </w:r>
     </w:p>
     <w:p>
       <w:r>
-        <w:t>The fourth limitation is that the MI and conditional-MI analyses are empirical. They support additional perturbation information in the tested feature channels, especially after the k-nearest-neighbor robustness audit, but they are not a general proof that a property-augmented representation always has higher mutual information than an identity-only representation. Likewise, the mixed L2 distance should be read as a standardized diagnostic drift after block construction and normalization, not as a natural metric that equates biochemical properties and k-mer counts as identical physical units. The correct claim is therefore conditional: under the tested local-perturbation grid and estimators, property-aware distance summaries carried additional mutation-relevant information relative to identity-only and permutation controls.</w:t>
+        <w:t>The fourth limitation is that the MI and conditional-MI analyses are empirical. They support perturbation-associated signal in the tested feature channels, especially after the k-nearest-neighbor robustness audit, but they are not general evidence that a property-augmented representation always has higher mutual information than an identity-only representation. Likewise, the mixed L2 distance should be read as a standardized diagnostic drift after block construction and normalization, not as a natural metric that equates biochemical properties and k-mer counts as identical physical units. The correct claim is therefore conditional: under the tested local-perturbation grid and estimators, property-aware distance summaries showed additional mutation-relevant signal relative to identity-only and permutation controls.</w:t>
       </w:r>
     </w:p>
     <w:p>
       <w:r>
-        <w:t>The fifth limitation concerns MSP weighting and scale. The short-bin audit did not show catastrophic collapse at 69-75 bp, and finer multi-scale pooling improved delta-readout rather than immediately degrading it. Even so, the current MSP channel remains a static coarse summary. It is not an optimized variance-aware estimator, and the manuscript does not claim that its present binset or gamma weighting is universally optimal across read lengths, perturbation types or sequencing platforms.</w:t>
+        <w:t>The fifth limitation concerns MSP weighting and scale. The short-bin audit did not show an immediate loss of reliability at 69-75 bp, and finer multi-scale pooling increased delta-readout rather than immediately degrading it. Even so, the current MSP channel remains a static coarse summary. It is not an optimized variance-aware estimator, and the manuscript does not claim that its present binset or gamma weighting is universally optimal across read lengths, perturbation types or sequencing platforms.</w:t>
       </w:r>
     </w:p>
     <w:p>
       <w:r>
-        <w:t>The sixth limitation is computational scope. CK4P-MSP remained lightweight in absolute terms in the local implementation, but it was slower to extract than CK4 and simple high-k hashed or MinHash summaries. The method should therefore not be described as an engineering speed-up. Its value in this manuscript is interpretability and perturbation diagnostics under compact dimensionality; large-scale deployment would require optimized implementation and pipeline-level cost-benefit testing.</w:t>
+        <w:t>The sixth limitation is computational scope. CK4P-MSP remained lightweight in absolute terms in the local implementation, but it was slower to extract than CK4 and simple high-k hashed or MinHash summaries. Its value in this manuscript is interpretability and perturbation diagnostics under compact dimensionality rather than engineering speed-up. Large-scale deployment would require optimized implementation and pipeline-level cost-benefit testing.</w:t>
       </w:r>
     </w:p>
     <w:p>
       <w:r>
-        <w:t>The seventh limitation is model scope. Large DNA language models and learned metagenomic classifiers provide powerful sequence representations, but they were not used as direct comparators here. This choice follows from the study's diagnostic goal. The paper evaluates decomposable identity, biochemical and positional channels under controlled short-read perturbation, whereas foundation-model embeddings are high-dimensional learned representations optimized for different transfer or prediction objectives. A direct comparison with such models would require a separate benchmark design.</w:t>
+        <w:t>The seventh limitation is model scope. Large DNA language models and learned metagenomic classifiers provide powerful sequence representations. They may outperform CK4P-MSP in predictive probes, especially when sufficient training data, pretraining and compute are available. This does not contradict the present claim because the study's goal is different. CK4P-MSP is intended as a low-dimensional, training-free and block-decomposable coordinate system for auditing identity, biochemical and coarse positional information under controlled short-read perturbation. Direct comparison with learned embeddings would require a separate benchmark design that reports both predictive accuracy and auditability.</w:t>
       </w:r>
     </w:p>
     <w:p>
@@ -5965,7 +5970,7 @@
     </w:p>
     <w:p>
       <w:r>
-        <w:t>Future work should test whether CK4P-MSP or related compact summaries improve failure-mode detection when placed alongside database-centered pipelines. Pipeline-facing false-hit reduction or classifier-output auditing would require downstream classifier outputs and explicit operating-point analysis. The most useful next step is not to replace exact matching, but to add representation-level diagnostics that report when identity evidence is fragile, when biochemical stability remains high, and when local-change sensitivity is preserved.</w:t>
+        <w:t>Future work should test whether CK4P-MSP or related compact summaries improve failure-mode detection when placed alongside database-centered pipelines. Pipeline-facing false-hit reduction or classifier-output auditing would require downstream classifier outputs and explicit operating-point analysis. The most useful next step is to add representation-level diagnostics that report when identity evidence is fragile, when biochemical stability remains high and when local-change sensitivity is preserved.</w:t>
       </w:r>
     </w:p>
     <w:p>
@@ -5980,7 +5985,7 @@
     </w:p>
     <w:p>
       <w:r>
-        <w:t>A fourth direction is to connect compact diagnostics with learned models. Full-position matrices and DNA foundation-model embeddings are natural candidates for follow-up studies because they may recover richer context than compact summaries. The present work suggests where such models should be audited: not only by final classification accuracy, but also by identity retention, perturbation stability, positional readability and local-change sensitivity.</w:t>
+        <w:t>A fourth direction is to connect compact diagnostics with learned models. Full-position matrices and DNA foundation-model embeddings are natural candidates for follow-up studies because they may recover richer context and stronger predictive signal than compact summaries. The present work suggests where such models should be audited: not only by final classification accuracy, but also by identity retention, perturbation stability, positional readability and local-change sensitivity.</w:t>
       </w:r>
     </w:p>
     <w:p>
@@ -5993,7 +5998,7 @@
     </w:p>
     <w:p>
       <w:r>
-        <w:t>This study shows that compact short-read representations can be evaluated as interpretable diagnostic objects. In controlled short-read settings, CK4P-MSP retained an exact identity backbone while adding global biochemical and positionalized biochemical channels that improved perturbation stability and preserved local-change readability. The evidence supports a bounded practical implication: biochemical and position-aware summaries may serve as auxiliary channels for representation-level robustness auditing alongside, rather than instead of, exact matching and curated database methods.</w:t>
+        <w:t>This study shows that compact short-read representations can be evaluated as interpretable audit objects. In controlled short-read settings, CK4P-MSP retained an exact identity backbone while adding global biochemical and positionalized biochemical channels that reduced perturbation drift and preserved local-change readability. The evidence supports a bounded implication: compact biochemical and coarse position-aware summaries can provide block-decomposable coordinates for representation-level perturbation auditing alongside exact matching and curated database methods.</w:t>
       </w:r>
     </w:p>
     <w:p>
@@ -6006,12 +6011,12 @@
     </w:p>
     <w:p>
       <w:r>
-        <w:t>All processed data tables, figure source summaries and analysis outputs generated for this study are available in the project result folders and will be deposited in a public repository before submission. The current local source locations are info/results, info/paper/figures, info/paper/tables and info/scripts. The final public repository name, DOI/accession and licence are to be inserted before journal submission.</w:t>
+        <w:t>All processed data tables, figure source summaries and analysis outputs generated for this study are maintained in a private GitHub repository for journal review (https://github.com/FairYJmrx/ultrashort-dna-representation-diagnostics, release branch). Reviewer access will be provided through the submission system or by adding a journal-supplied account as a read-only collaborator. A public archival DOI will be minted from the frozen release when the authors make the repository public.</w:t>
       </w:r>
     </w:p>
     <w:p>
       <w:r>
-        <w:t>Publicly reused resources include simulator- and benchmark-derived materials used for ART, CAMI_TOY_low and CAMI II marine analyses, which should be cited through the corresponding primary publications and public resource records in the final reference list. The CAMI II marine lightweight probe used the public short-read sample 0 archive (https://frl.publisso.de/data/frl:6425521/marine/short_read/marmgCAMI2_sample_0_reads.tar.gz) and setup archive (https://frl.publisso.de/data/frl:6425521/marine/short_read/marmgCAMI2_setup.tar.gz). Only a streamed prefix was parsed for the lightweight stability probe, and read-level taxonomic labels were not reconstructed from the separate truth resources for this analysis; the generated subset tables, stability summaries and source figure table should be released with the processed data package. The restricted clinical sequencing provenance was used only to motivate the 69 and 75 bp read-length conditions, and the underlying clinical sequencing reads were not used as experimental input, are not part of the study data package, and cannot be publicly shared because they derive from a restricted clinical sequencing context.</w:t>
+        <w:t>Publicly reused resources include simulator- and benchmark-derived materials used for ART, CAMI_TOY_low and CAMI II marine analyses, which will be cited through the corresponding primary publications and public resource records in the final reference list. The CAMI II marine lightweight probe used the public short-read sample 0 archive (https://frl.publisso.de/data/frl:6425521/marine/short_read/marmgCAMI2_sample_0_reads.tar.gz) and setup archive (https://frl.publisso.de/data/frl:6425521/marine/short_read/marmgCAMI2_setup.tar.gz). Only a streamed prefix was parsed for the lightweight stability probe, and read-level taxonomic labels were not reconstructed from the separate truth resources for this analysis. The generated subset tables, stability summaries and source figure table are included in the review-access repository and will be included in the public release. Local restricted sequencing records were used only as read-length provenance for the 69 and 75 bp conditions. The underlying clinical sequencing reads were not used as experimental input, are not part of the study data package, and cannot be publicly shared.</w:t>
       </w:r>
     </w:p>
     <w:p>
@@ -6024,7 +6029,7 @@
     </w:p>
     <w:p>
       <w:r>
-        <w:t>The analysis scripts used to generate tables, figures and reviewer-response audits are maintained under info/scripts and will be released with the processed data package before submission. Key audit scripts include run_knn_mi_robustness_audit.py, run_high_k_compressed_baselines.py, run_p_msp_contribution_audit.py, run_property_redundancy_and_runtime_audit.py, generate_supp_fig_s8_redundancy_runtime_audit.py, run_p_channel_counterfactual_audit.py, run_msp_bin_gamma_sensitivity_audit.py, run_cami2_marine_lightweight_probe.py and generate_supp_fig_s10_cami2_marine_probe.py. The final repository URL, software licence and archived release identifier are to be inserted before journal submission.</w:t>
+        <w:t>The analysis scripts used to generate tables, figures and reviewer-response audits are maintained in the private review-access repository (https://github.com/FairYJmrx/ultrashort-dna-representation-diagnostics, release branch) under an MIT licence. Key audit scripts include run_knn_mi_robustness_audit.py, run_high_k_compressed_baselines.py, run_p_msp_contribution_audit.py, run_property_redundancy_and_runtime_audit.py, generate_supp_fig_s8_redundancy_runtime_audit.py, run_p_channel_counterfactual_audit.py, run_msp_bin_gamma_sensitivity_audit.py, run_cami2_marine_lightweight_probe.py and generate_supp_fig_s10_cami2_marine_probe.py. Reviewer access will be provided during submission, and a public archived release identifier will be added after public release.</w:t>
       </w:r>
     </w:p>
     <w:p>
@@ -6037,7 +6042,7 @@
     </w:p>
     <w:p>
       <w:r>
-        <w:t>No patient-level clinical sequencing reads, patient identifiers or patient-derived labels were analyzed in this study. The authors should confirm the institutional wording for this boundary statement before submission.</w:t>
+        <w:t>No patient-level clinical sequencing reads, patient identifiers or patient-derived labels were analyzed in this study. Institutional wording for this boundary statement must be finalized before submission.</w:t>
       </w:r>
     </w:p>
     <w:p>
@@ -6089,7 +6094,7 @@
     </w:p>
     <w:p>
       <w:r>
-        <w:t>The authors should confirm the final statement before submission. If accurate, use: The authors declare no competing interests.</w:t>
+        <w:t>The final competing-interest statement must be confirmed before submission. If accurate, use: The authors declare no competing interests.</w:t>
       </w:r>
     </w:p>
     <w:p>

</xml_diff>

<commit_message>
Update submission metadata and manuscript package
</commit_message>
<xml_diff>
--- a/paper/paper_manuscript.docx
+++ b/paper/paper_manuscript.docx
@@ -20,7 +20,7 @@
         <w:jc w:val="center"/>
       </w:pPr>
       <w:r>
-        <w:t>Authors: TBD</w:t>
+        <w:t>Ruixiang Mei^1 and Jianhua Huang^1,*</w:t>
       </w:r>
     </w:p>
     <w:p>
@@ -28,7 +28,23 @@
         <w:jc w:val="center"/>
       </w:pPr>
       <w:r>
-        <w:t>Affiliations: TBD</w:t>
+        <w:t>^1 The Chinese University of Hong Kong, Shenzhen, Shenzhen, Guangdong, China</w:t>
+      </w:r>
+    </w:p>
+    <w:p>
+      <w:pPr>
+        <w:jc w:val="center"/>
+      </w:pPr>
+      <w:r>
+        <w:t>*Correspondence: Jianhua Huang, jhuang@cuhk.edu.cn</w:t>
+      </w:r>
+    </w:p>
+    <w:p>
+      <w:pPr>
+        <w:jc w:val="center"/>
+      </w:pPr>
+      <w:r>
+        <w:t>ORCID: Ruixiang Mei, https://orcid.org/0009-0003-2128-0726</w:t>
       </w:r>
     </w:p>
     <w:p>
@@ -6055,7 +6071,7 @@
     </w:p>
     <w:p>
       <w:r>
-        <w:t>TBD before submission. Suggested CRediT-style roles to confirm: conceptualization; methodology; software; formal analysis; investigation; data curation; writing - original draft; writing - review and editing; visualization; supervision; funding acquisition.</w:t>
+        <w:t>Ruixiang Mei: Conceptualization, methodology, software, formal analysis, investigation, data curation, visualization, writing - original draft, and writing - review and editing. Jianhua Huang: Supervision and writing - review and editing. Final CRediT roles should be confirmed before submission.</w:t>
       </w:r>
     </w:p>
     <w:p>
@@ -6068,7 +6084,7 @@
     </w:p>
     <w:p>
       <w:r>
-        <w:t>TBD before submission. Insert grant numbers and funder names exactly as required by NAR/OUP.</w:t>
+        <w:t>Funding information remains to be confirmed before submission. If no specific funding supported the work, use: This research received no specific grant from any funding agency in the public, commercial or not-for-profit sectors. If a grant is included, insert the funder name and grant number exactly as required by NAR/OUP.</w:t>
       </w:r>
     </w:p>
     <w:p>
@@ -6081,7 +6097,7 @@
     </w:p>
     <w:p>
       <w:r>
-        <w:t>TBD before submission. Include only contributors who meet acknowledgement criteria and do not meet authorship criteria.</w:t>
+        <w:t>Acknowledgements, if any, will be finalized before submission. Include only contributors who meet acknowledgement criteria and do not meet authorship criteria.</w:t>
       </w:r>
     </w:p>
     <w:p>
@@ -6094,7 +6110,7 @@
     </w:p>
     <w:p>
       <w:r>
-        <w:t>The final competing-interest statement must be confirmed before submission. If accurate, use: The authors declare no competing interests.</w:t>
+        <w:t>The authors declare no competing interests.</w:t>
       </w:r>
     </w:p>
     <w:p>
@@ -6238,7 +6254,7 @@
         <w:ind w:hanging="360" w:left="360"/>
       </w:pPr>
       <w:r>
-        <w:t>17. Fuhl, Wolfgang; Zabel, Susanne; Nieselt, Kay Resource Saving Taxonomy Classification with k-mer Distributions and Machine Learning.  2023.</w:t>
+        <w:t>17. Fuhl, Wolfgang; Zabel, Susanne; Nieselt, Kay Resource Saving Taxonomy Classification with k-mer Distributions and Machine Learning. arXiv 2023. doi:10.48550/arXiv.2303.06154</w:t>
       </w:r>
     </w:p>
     <w:p>
@@ -6350,7 +6366,7 @@
         <w:ind w:hanging="360" w:left="360"/>
       </w:pPr>
       <w:r>
-        <w:t>31. Zhou, Zhihan; Ji, Yanrong; Li, Weijian; Dutta, Pratik; Davuluri, Ramana V.; Liu, Han DNABERT-2: Efficient Foundation Model and Benchmark for Multi-Species Genome.  2024. doi:10.48550/arXiv.2306.15006</w:t>
+        <w:t>31. Zhou, Zhihan; Ji, Yanrong; Li, Weijian; Dutta, Pratik; Davuluri, Ramana V.; Liu, Han DNABERT-2: Efficient Foundation Model and Benchmark for Multi-Species Genome. arXiv 2024. doi:10.48550/arXiv.2306.15006</w:t>
       </w:r>
     </w:p>
     <w:p>
@@ -6366,7 +6382,7 @@
         <w:ind w:hanging="360" w:left="360"/>
       </w:pPr>
       <w:r>
-        <w:t>33. Nguyen, Eric; Poli, Michael; Faizi, Marjan; Thomas, Armin W.; Birch-Sykes, Camden; Wornow, Michael; Patel, Aman; Rabideau, Charles; Massaroli, Stefano; Bengio, Yoshua; Ermon, Stefano; Baccus, Stephen A.; Re, Christopher HyenaDNA: Long-Range Genomic Sequence Modeling at Single Nucleotide Resolution.  2023.</w:t>
+        <w:t>33. Nguyen, Eric; Poli, Michael; Faizi, Marjan; Thomas, Armin W.; Birch-Sykes, Camden; Wornow, Michael; Patel, Aman; Rabideau, Charles; Massaroli, Stefano; Bengio, Yoshua; Ermon, Stefano; Baccus, Stephen A.; Re, Christopher HyenaDNA: Long-Range Genomic Sequence Modeling at Single Nucleotide Resolution. arXiv 2023. doi:10.48550/arXiv.2306.15794</w:t>
       </w:r>
     </w:p>
     <w:p>
@@ -6390,7 +6406,7 @@
         <w:ind w:hanging="360" w:left="360"/>
       </w:pPr>
       <w:r>
-        <w:t>36. Rojas-Carulla, Mateo; Tolstikhin, Ilya; Luque, Guillermo; Youngblut, Nicholas; Ley, Ruth; Sch{\"o}lkopf, Bernhard GeNet: Deep Representations for Metagenomics.  2019.</w:t>
+        <w:t>36. Rojas-Carulla, Mateo; Tolstikhin, Ilya; Luque, Guillermo; Youngblut, Nicholas; Ley, Ruth; Sch{\"o}lkopf, Bernhard GeNet: Deep Representations for Metagenomics. arXiv 2019. doi:10.48550/arXiv.1901.11015</w:t>
       </w:r>
     </w:p>
     <w:p>
@@ -6422,7 +6438,7 @@
         <w:ind w:hanging="360" w:left="360"/>
       </w:pPr>
       <w:r>
-        <w:t>40. Moore, Matthew P.; Laager, Mirjam; Ribeca, Paolo; Didelot, Xavier KmerAperture: Retaining k-mer Synteny for Alignment-free Estimation of Within-lineage Core and Accessory Differences.  2022. doi:10.1101/2022.10.12.511870</w:t>
+        <w:t>40. Moore, Matthew P.; Laager, Mirjam; Ribeca, Paolo; Didelot, Xavier KmerAperture: Retaining k-mer Synteny for Alignment-free Estimation of Within-lineage Core and Accessory Differences. bioRxiv 2022. doi:10.1101/2022.10.12.511870</w:t>
       </w:r>
     </w:p>
     <w:p>

</xml_diff>

<commit_message>
Add short-read continuity audit and finalize manuscript
</commit_message>
<xml_diff>
--- a/paper/paper_manuscript.docx
+++ b/paper/paper_manuscript.docx
@@ -12,7 +12,7 @@
           <w:b/>
           <w:sz w:val="32"/>
         </w:rPr>
-        <w:t>Layered representation diagnostics for ultra-short metagenomic reads</w:t>
+        <w:t>Layered representation diagnostics for short metagenomic reads</w:t>
       </w:r>
     </w:p>
     <w:p>
@@ -20,7 +20,7 @@
         <w:jc w:val="center"/>
       </w:pPr>
       <w:r>
-        <w:t>Authors: TBD</w:t>
+        <w:t>Ruixiang Mei; Jianhua Huang*</w:t>
       </w:r>
     </w:p>
     <w:p>
@@ -28,7 +28,15 @@
         <w:jc w:val="center"/>
       </w:pPr>
       <w:r>
-        <w:t>Affiliations: TBD</w:t>
+        <w:t>School of Data Science, The Chinese University of Hong Kong, Shenzhen, Shenzhen 518172, Guangdong, China</w:t>
+      </w:r>
+    </w:p>
+    <w:p>
+      <w:pPr>
+        <w:jc w:val="center"/>
+      </w:pPr>
+      <w:r>
+        <w:t>*Correspondence: jhuang@cuhk.edu.cn; Ruixiang Mei ORCID: 0009-0003-2128-0726</w:t>
       </w:r>
     </w:p>
     <w:p>
@@ -41,7 +49,7 @@
     </w:p>
     <w:p>
       <w:r>
-        <w:t>Short-read metagenomic next-generation sequencing (mNGS) pipelines typically process trimmed, ambiguous, or locally perturbed reads, whose useful information may degrade before classifiers or database lookups are applied. In this context, accuracy-led evaluation is incomplete because downstream performance cannot distinguish whether losses of identity, biochemical, or positional information arise in the representation layer or only later in the classifier. Here we introduce a representation-diagnostics framework for controlled short-read (69-150 bp) mNGS settings that dissects short-read representations into four quantifiable dimensions: exact identity retention, biochemical perturbation stability, positional readability, and local mutation sensitivity. Our core compact representation, CK4P-MSP, integrates reverse-complement canonical 4-mer identity with biochemical summaries and multi-scale property pooling; it is evaluated against full-position matrices as a diagnostic upper bound and a canonical spaced-property (CSP) control as a boundary comparator. Across controlled WGS-derived perturbations, ART simulations, CAMI_TOY_low readout probes, a CAMI II marine anonymous-read stability probe, and local mutation sensitivity tasks, consistent evidence shows that compact property-aware representations can improve stability while preserving low-dimensional diagnostic readability. Full-position matrices further reveal that fine-grained positional information can add readout value, but at substantially higher dimensional cost, whereas spaced-seed priors transfer to dense read-level descriptors only in scenario-specific contexts, such as particular read lengths or perturbation conditions. These results support a bounded architectural implication: short-read mNGS pipelines should retain exact k-mer, alignment, or curated database evidence as the identity backbone, while compact biochemical and position-aware summaries may serve as auxiliary channels for representation-level robustness auditing rather than as standalone deployment models.</w:t>
+        <w:t>Short-read metagenomic next-generation sequencing (mNGS) pipelines often process trimmed, ambiguous or locally perturbed reads. Useful evidence can be compressed before a classifier or database lookup is applied, so downstream accuracy alone does not reveal which sequence attributes were retained in the representation layer. Here, we present a representation-diagnostics framework with a dense lower-bound audit from 50 to 75 bp and broader anchors at 100, 125 and 150 bp. The framework separates canonical local k-mer composition, global biochemical summaries and coarse positional property pooling, and evaluates their stability, compactness and local-change readability under paired perturbations. CK4P-MSP combines a reverse-complement canonical 4-mer block (K), a global property block (P) and multi-scale property pooling (MSP) in a 222-dimensional block-normalized representation. A seven-group matched ablation revealed metric-specific roles. Property-only summaries had the lowest numerical drift but weakened nearest-clean retrieval; conditional contrasts assigned P primarily to global stability, MSP to grouped local-change readability and K to composition-linked retrieval. In the prespecified 69-150 bp primary grid, CK4P-MSP had mean paired cosine 0.989, mean drift 0.129 and grouped local-versus-noise macro-F1 of 0.979. A separate shared-template sweep over every integer length from 50 to 75 bp retained the same operating profile: at 50 bp, CK4P-MSP drift was 0.174 versus 0.294 for CK4, and grouped local-change macro-F1 was 0.988 versus 0.942. Representative historical descriptors defined a complementary boundary: PseKNC achieved lower mean drift, whereas CK4P-MSP retained stronger grouped local-change readability. Full-position encodings remained higher-dimensional upper bounds for fine positional information, and compressed high-k vector controls were less stable at the same feature budget. CK4P-MSP therefore occupies an attributable stability-readability trade-off rather than minimizing drift alone. Compact biochemical and coarse positional summaries can provide interpretable representation-level audit coordinates alongside database-linked exact matching and alignment.</w:t>
       </w:r>
     </w:p>
     <w:p>
@@ -54,12 +62,12 @@
     </w:p>
     <w:p>
       <w:r>
-        <w:t>Metagenomic next-generation sequencing can interrogate complex or unexpected microbial mixtures without a fixed target panel, and it has become an important route for infectious-disease investigation when targeted assays are insufficient [1,2,3]. Yet the reads entering downstream analysis are often short, trimmed, ambiguous, and locally corrupted; adapter removal, quality trimming, and low-biomass contamination can all change the effective sequence evidence available to a pipeline before classification begins [4,5,6]. In controlled short-read (69-150 bp) mNGS settings, these physical constraints can cause information loss before any classifier is applied. A read representation may already have discarded local identity, biochemical regularity, or positional information long before a benchmark reports success or failure. For this reason, short-read representation is not merely a preprocessing step. It defines which categories of information remain available to any later classifier, alignment routine, or database query. In this manuscript, the 69 and 75 bp settings are used only as length conditions; the underlying clinical data are not publicly available and are not used as experimental input.</w:t>
+        <w:t>Metagenomic next-generation sequencing can interrogate complex or unexpected microbial mixtures without a fixed target panel, and it has become an important route for infectious-disease investigation when targeted assays are insufficient [1,2,3]. Yet the reads entering downstream analysis are often short, trimmed, ambiguous and locally corrupted. Adapter removal, quality trimming and low-biomass contamination can all change the effective sequence evidence available to a pipeline before classification begins [4,5,6]. Read length can affect homolog recovery and taxonomic assignment, although the magnitude and direction of the effect depend on the classifier, database, taxonomic group and error profile [7,8,9,10]. These constraints do not make short reads intrinsically unusable. Rather, reduced context can narrow the redundancy of local sequence evidence and make it harder to determine which information categories remain available. A read representation may already have compressed local composition, biochemical regularity or positional information before a downstream benchmark reports success or failure. Short-read representation is therefore not merely a preprocessing step: it defines which categories of evidence remain available to a later classifier, alignment routine or database query.</w:t>
       </w:r>
     </w:p>
     <w:p>
       <w:r>
-        <w:t xml:space="preserve">Current metagenomic workflows are strongest when they preserve exact or near-exact identity evidence. Canonical k-mer, minimizer, alignment, and database-backed systems such as </w:t>
+        <w:t xml:space="preserve">Current metagenomic workflows are strongest when they preserve exact or near-exact matching evidence. Minimizer, alignment and database-backed systems such as </w:t>
       </w:r>
       <w:r>
         <w:rPr>
@@ -95,37 +103,37 @@
         <w:t>Kaiju</w:t>
       </w:r>
       <w:r>
-        <w:t>, and related indexing frameworks have established the practical value of explicit sequence matching for taxonomic assignment and downstream biological interpretation [7,8,9,10,11]. Community benchmarks further show that performance depends on database coverage, sample composition, novelty, and evaluation context, not only on the classifier name [12,13]. These methods should therefore be acknowledged rather than displaced: exact identity evidence remains the backbone for tasks such as species discrimination, allele-sensitive interpretation, and resistance-gene calling. Spaced-seed indexing further extends this line by tuning match patterns for sensitivity under mutation, but its goal is still matching accuracy rather than layered diagnostic analysis [14]. That limitation is amplified in 69-75 bp ultra-short reads, where the number of uniquely matching k-mers drops sharply. At the same time, these systems are designed to answer a different question from the one asked here. They determine what a read matches, but they do not directly diagnose which kinds of information remain visible in the representation itself when reads are short, noisy, or partially degraded.</w:t>
+        <w:t xml:space="preserve"> and related indexing frameworks have established the practical value of explicit sequence matching for taxonomic assignment and downstream biological interpretation [9,11,12,13,10]. Community benchmarks further show that performance depends on database coverage, sample composition, novelty and evaluation context, not only on the classifier name [14,15]. These methods should therefore be acknowledged rather than displaced: database-linked exact matching remains central to species discrimination, allele-sensitive interpretation and resistance-gene calling. Spaced-seed indexing further extends this line by tuning match patterns for sensitivity under mutation, but its goal is still matching accuracy rather than layered diagnostic analysis [16]. The value of additional audit coordinates can become more visible toward the lower end of the 50-75 bp range, where a compact local k-mer composition vector has less redundant sequence context than at 150 bp. At the same time, matching systems answer a different question from the one asked here. They determine what a read matches; this study examines which properties remain visible in a compact representation when reads are short, noisy or partially degraded.</w:t>
       </w:r>
     </w:p>
     <w:p>
       <w:r>
-        <w:t>Vectorized k-mer representations provide the first broad alternative to explicit matching. Here the central operation is to collapse each read or fragment into a composition profile, such as count, frequency, relative-frequency, TF-IDF, or background-adjusted features. PlasFlow and the BMC Bioinformatics 2018 bacteria classifier show that this compact route can be highly competitive when the task is composition-driven rather than order-driven [15,16]. Resource-saving k-mer classification extends the same logic by showing that low-dimensional k-mer distributions plus classical machine learning can remain strong even when deep models are not the only option [17]. However, these vectorized k-mer methods rely solely on composition statistics and do not explicitly layer biochemical stability or positional information alongside identity evidence. That distinction becomes more consequential in 69-75 bp reads, where local composition survives only in compressed form. These methods are not weak baselines; they are a distinct representation family whose success depends on how much local composition survives the short-read regime.</w:t>
+        <w:t>Vectorized k-mer representations provide the first broad alternative to explicit matching. Here the central operation is to collapse each read or fragment into a composition profile, such as count, frequency, relative-frequency, TF-IDF, or background-adjusted features. PlasFlow and the BMC Bioinformatics 2018 bacteria classifier show that this compact route can be highly competitive when the task is composition-driven rather than order-driven [17,18]. Resource-saving k-mer classification extends the same logic by showing that low-dimensional k-mer distributions plus classical machine learning can remain competitive even when deep models are not the only option [19]. However, these vectorized k-mer methods rely solely on composition statistics and do not explicitly layer biochemical stability or positional information alongside identity evidence. That distinction becomes more consequential as reads shorten and local composition survives only in compressed form. These methods are not weak baselines; they are a distinct representation family whose success depends on how much local composition survives the short-read regime.</w:t>
       </w:r>
     </w:p>
     <w:p>
       <w:r>
-        <w:t>Hashing and sketching form a separate compression family rather than a lower-rank version of SVD. MinHash, LSH, histosketch, and related sketching strategies map k-mer sets or profiles into fixed-length signatures for rapid similarity search, large-scale database indexing, or ultra-lightweight compression [18,19]. In the local literature map, Kssd and the HULK/histosketch line fill this role most clearly: they compress the representation in service of indexing or neighborhood search, not in service of preserving linear variance structure. That distinction matters here because our vector route is not asking for the cheapest signature possible; it is asking whether a sparse composition vector still contains recoverable class signal once the short-read regime and the downstream classifier are fixed. Sketching papers therefore belong in the related work, but as a neighboring compression paradigm, not as a substitute for vectorized k-mer analysis.</w:t>
+        <w:t>Hashing and sketching form a separate compression family rather than a lower-rank version of SVD. MinHash, LSH, histosketch, and related sketching strategies map k-mer sets or profiles into fixed-length signatures for rapid similarity search, large-scale database indexing, or ultra-lightweight compression [20,21]. In the local literature map, Kssd and the HULK/histosketch line fill this role most clearly: they compress the representation in service of indexing or neighborhood search, not in service of preserving linear variance structure. That distinction matters here because our vector route is not asking for the cheapest signature possible; it is asking whether a sparse composition vector retains linearly accessible signal once the short-read regime and the downstream probe are fixed. Sketching papers therefore belong in the related work, but as a neighboring compression paradigm, not as a substitute for vectorized k-mer analysis.</w:t>
       </w:r>
     </w:p>
     <w:p>
       <w:r>
-        <w:t>Biochemical and signal-based encodings add a second alternative representation family. Chaos-game and genomic-signal formulations, together with numerical mappings such as Voss, tetrahedron, and EIIP-style encodings, expose structure that is not reducible to literal token identity alone [20,21,22,23,24,25,26]. These encodings matter because they keep the question on the representation itself: what survives after a read is translated into a signal, not only what survives after it is matched. In 69-75 bp ultra-short reads, such encodings are especially relevant because they can expose stability patterns even when exact matches thin out. However, existing biochemical encodings are usually used as standalone features rather than layered alongside exact identity evidence, and their perturbation-stabilizing value under controlled ultra-short-read conditions remains largely unquantified.</w:t>
+        <w:t>Biochemical and signal-based encodings add a second alternative representation family. Chaos-game and genomic-signal formulations, together with numerical mappings such as Voss, tetrahedron, and electron-ion interaction potential (EIIP)-style encodings, expose structure that is not reducible to literal token identity alone [22,23,24,25,26,27,28]. These encodings matter because they keep the question on the representation itself: what survives after a read is translated into a signal, not only what survives after it is matched. In lower-read-length settings, such encodings are especially relevant because they can expose stability patterns when a compact k-mer composition vector has a smaller context margin. However, existing biochemical encodings are usually used as standalone features rather than layered alongside a compact k-mer composition block, and their perturbation-stabilizing value under controlled short-read conditions remains largely unquantified.</w:t>
       </w:r>
     </w:p>
     <w:p>
       <w:r>
-        <w:t>Sequence-token deep learning classifiers make the neighboring problem space especially relevant. DeepMicrobes introduced deep learning for metagenomic taxonomic classification, using canonical k-mer tokenization, embedding, BiLSTM, and attention for read-level assignment [27]. MetaTransformer extended the same general family with self-attention and alternative tokenization or embedding schemes, including character-level, BPE, k-mer, and hash/LSH variants [28]. BERTax showed that a small-k Transformer can support hierarchical taxonomy if the pretraining and output heads are aligned to the task [29]. BarcodeBERT then demonstrated that barcode-scale biodiversity tasks can benefit from domain-specific pretraining and masking choices, but its setting is still a barcode-specific classification problem rather than shotgun short-read mNGS [30]. Large pre-trained DNA language models further extend this representation family as general-purpose encoders, but they matter here as background representation paradigms rather than as direct 69-75 bp comparators [31,32,33,34,35]. Their black-box optimization, reliance on long-range genomic context, and higher computational overhead make them poorly suited for front-end diagnostic auditing of ultra-short reads; moreover, their embeddings are not naturally decomposed into interpretable identity, biochemical, and positional channels. These studies motivate learned representations as powerful downstream classifiers or reusable sequence encoders, but their primary objective is predictive performance or representation transfer, not controlled decomposition of short-read evidence into identity, biochemical stability, and positional readability.</w:t>
+        <w:t>Sequence-token deep learning classifiers make the neighboring problem space especially relevant. DeepMicrobes introduced deep learning for metagenomic taxonomic classification, using canonical k-mer tokenization, embedding, BiLSTM and attention for read-level assignment [29]. MetaTransformer extended the same general family with self-attention and alternative tokenization or embedding schemes, including character-level, BPE, k-mer and hash/LSH variants [30]. BERTax showed that a small-k Transformer can support hierarchical taxonomy if the pretraining and output heads are aligned to the task [31]. BarcodeBERT then demonstrated that barcode-scale biodiversity tasks can benefit from domain-specific pretraining and masking choices, but its setting is still a barcode-specific classification problem rather than shotgun short-read mNGS [32]. Large pre-trained DNA language models further extend this representation family as general-purpose encoders [33,34,35,36,37]. These learned embeddings can be strong, and in some downstream probes they may outperform compact hand-defined representations. The question asked here is different. We do not test whether CK4P-MSP is a stronger predictive encoder than a Transformer. We ask whether a low-dimensional, training-free and block-decomposable representation can make identity, biochemical and coarse positional evidence separately inspectable under controlled short-read perturbation.</w:t>
       </w:r>
     </w:p>
     <w:p>
       <w:r>
-        <w:t>Raw-sequence and position-aware models complete the picture. GeNet learns representations directly from raw DNA while exploiting the hierarchical label structure of metagenomic classification, and it shows that deep learning can reduce memory use without eliminating the need to compare against established mappers [36]. DeepVirFinder, Virtifier, and DETIRE demonstrate that CNN or hybrid architectures can extract useful motif- and composition-level signal from viral fragments, but their target is viral detection rather than multi-class short-read taxonomy [37,38,39]. KmerAperture adds an important boundary case by showing that ordinary k-mer set comparisons can lose synteny, whereas matching k-mers back to their original lists can recover positional information about core and accessory differences [40]. Collectively, these advances matured each representation family in isolation, but they still do not provide a unified diagnostic framework that decomposes ultra-short-read representations along identity, biochemical, and positional axes under controlled perturbation.</w:t>
+        <w:t>Raw-sequence and position-aware models complete the picture. DeepVirFinder, Virtifier, and DETIRE demonstrate that CNN or hybrid architectures can extract useful motif- and composition-level signal from viral fragments, but their target is viral detection rather than multi-class short-read taxonomy [38,39,40]. KmerAperture adds an important boundary case by showing that ordinary k-mer set comparisons can lose synteny, whereas matching k-mers back to their original lists can retain positional information about core and accessory differences [41]. Collectively, these advances matured each representation family in isolation, but they still do not provide a unified diagnostic framework that decomposes short-read representations into local composition, biochemical and positional channels under controlled perturbation.</w:t>
       </w:r>
     </w:p>
     <w:p>
       <w:r>
-        <w:t>Against this background, we study short-read representation as a diagnostics problem rather than as a single-model accuracy competition. We ask how exact identity retention, biochemical perturbation stability, positional readability, and compactness trade off across controlled short-read settings. Our compact main method, CK4P-MSP, combines reverse-complement canonical 4-mer identity with biochemical summaries and multi-scale property pooling to produce a low-dimensional auxiliary descriptor. Full-position matrices serve as diagnostic upper bounds that reveal what fine-grained positional resolution can add, whereas the canonical spaced-property (CSP) control is retained as a mechanistic boundary comparator for testing whether matching-oriented spaced-seed priors transfer to dense read-level representations. The study also incorporates same-dimension reduction controls, paired non-parametric significance tests, block-weight audits of mixed feature spaces, k-nearest-neighbor mutual-information robustness checks, dimension-matched high-k compressed k-mer baselines, and local mutation fraction sweeps. The aim is therefore not to replace exact matching systems, but to clarify what each representation family preserves, what it obscures, and where its useful operating boundary lies.</w:t>
+        <w:t>Against this background, we study short-read representation as a representation-audit problem rather than as a single-model accuracy competition. We ask how canonical local k-mer composition, biochemical perturbation stability, positional readability and compactness trade off across controlled short-read settings. Our compact main method, CK4P-MSP, combines reverse-complement canonical 4-mer composition with biochemical summaries and multi-scale property pooling to produce a low-dimensional, block-decomposable audit coordinate system. Full-position matrices serve as positional upper bounds that reveal what fine-grained positional resolution can add, whereas the canonical spaced-property (CSP) control is retained as a mechanistic boundary comparator for testing whether matching-oriented spaced-seed priors transfer to dense read-level representations. The study incorporates all seven non-empty K/P/MSP combinations, prespecified conditional contrasts, paired non-parametric tests, a KSG-style empirical separability audit, dimension-matched high-k vector controls, MSP weight sensitivity analysis and a shared-template sweep at every integer length from 50 to 75 bp. Broader 100, 125 and 150 bp anchors test whether lower-range behavior persists without claiming a dense sweep across the full 50-150 bp interval. The aim is to identify the metric-specific contribution and operating boundary of each block without assuming statistical independence or universal necessity.</w:t>
       </w:r>
     </w:p>
     <w:p>
@@ -146,26 +154,17 @@
     </w:p>
     <w:p>
       <w:r>
-        <w:t>We designed the study as a representation-diagnostic analysis rather than an end-to-end clinical classification benchmark. The central question was what information remains available in short-read sequence representations after controlled perturbation, and whether biochemical and coarse positional summaries add usable evidence beyond an exact identity backbone. CK4 and CK5 were used as reverse-complement canonical k-mer identity baselines, P denoted global biochemical-property summaries, MSP denoted multi-scale positional property pooling, CK4+P, CK4+MSP and CK4P-MSP tested compact mixed representations, full-position matrices were treated as diagnostic upper bounds, and the canonical spaced-property (CSP) control served as a spaced-seed mechanism comparator.</w:t>
+        <w:t>We designed the study as a representation-diagnostic analysis of controlled short-read perturbation settings. Here, representation diagnostics denotes a prespecified set of representation-level measurements rather than a clinical decision rule: paired stability, nearest-clean retrieval, grouped local-change readout, feature dimension and blockwise decomposition. The central question was whether biochemical and coarse positional summaries add auditable evidence to a canonical local k-mer-composition backbone. CK4 and CK5 were reverse-complement canonical k-mer-composition baselines; P denoted global biochemical-property summaries; MSP denoted multi-scale positional property pooling. The seven non-empty K/P/MSP combinations were evaluated, full-position matrices were treated as positional upper bounds, and the canonical spaced-property (CSP) control served as a spaced-seed mechanism comparator.</w:t>
       </w:r>
     </w:p>
     <w:p>
       <w:r>
-        <w:t>This design makes two claims testable. First, a compact mixed representation should remain close to its clean counterpart under nuisance perturbation while retaining enough information for shallow readout. Second, any benefit of the P or MSP channels should not be reducible to dimensionality, normalization, or dilution in a mixed L2 space. We therefore evaluated compact stability, same-dimension PCA/SVD controls, dimension-matched high-k compressed k-mer baselines, block-weight sensitivity, paired non-parametric tests, k-nearest-neighbor mutual-information robustness checks, P/MSP contribution and counterfactual controls, P/MSP redundancy, feature-extraction runtime and error-aware ART strata as parts of one evidence chain. Throughout, L2 in a mixed representation is interpreted as a standardized diagnostic drift after block construction and normalization, not as a natural biophysical distance between commensurate physical units.</w:t>
+        <w:t>This design makes two questions testable. First, whether a compact mixed representation remains close to its clean counterpart under nuisance perturbation while retaining representation-level readability. Second, whether the observed behavior can be assigned to metric-specific K, P or MSP contributions rather than to dimensionality, normalization or dilution in a mixed L2 space. We therefore combined a seven-group ablation with a 2-by-2 spatial-localization-by-substitution-chemistry audit, representative historical handcrafted descriptors, same-dimension PCA/SVD controls, dimension-matched high-k compressed k-mer baselines, block-weight and property-scaling sensitivity, paired non-parametric tests, k-nearest-neighbour mutual-information robustness checks, P/MSP relation analysis, feature-extraction runtime and error-aware ART simulator strata. Shallow readout probes tested whether signal remained accessible to a fixed low-capacity model; they were not treated as production classifier performance. Throughout, mixed-space L2 is interpreted as standardized representation drift after block construction and normalization, not as a natural biophysical distance between commensurate physical units.</w:t>
       </w:r>
     </w:p>
     <w:p>
       <w:r>
-        <w:t xml:space="preserve">The 69 and 75 bp settings were chosen because they fall within the commonly reported 50-75 bp post-QC mNGS read-length regime described in the interpretation literature (Yang, </w:t>
-      </w:r>
-      <w:r>
-        <w:rPr>
-          <w:i/>
-        </w:rPr>
-        <w:t>Practice and Progress of mNGS Report Interpretation</w:t>
-      </w:r>
-      <w:r>
-        <w:t>, p. 99). The underlying clinical reads were not used as experimental inputs and are not publicly available; only this length choice informed the experimental design. The remaining lengths were selected for sensitivity analysis: 100, 125 and 150 bp test whether the trends persist as reads become less extreme, and 300 bp is used only as an extended-read reference in selected boundary analyses.</w:t>
+        <w:t>The lower-range design was anchored to a commonly reported 50-75 bp mNGS read-length regime [42]. A shared-template continuity audit evaluated every integer length from 50 to 75 bp by prefix-truncating the same 420 independently sampled 150-bp source windows, thereby changing read length without changing source identity. The 69 and 75 bp points additionally correspond to aggregate pre- and post-quality-control mean-length conditions observed in a restricted local sequencing context. Only these aggregate conditions informed the design; no patient-level reads, labels, identifiers or sequence content were analysed. Broader 100, 125 and 150 bp anchors tested whether lower-range behavior persisted as more sequence context became available, and 300 bp was retained only as an extended-read reference in selected boundary analyses. This sampling plan is a dense lower-bound sweep plus broader anchors, not a continuous 50-150 bp scan and not a claim that short reads are unusable.</w:t>
       </w:r>
     </w:p>
     <w:p>
@@ -231,12 +230,12 @@
     </w:p>
     <w:p>
       <w:r>
-        <w:t>The representation families were defined to separate identity, global biochemical summaries and coarse positional information. CK4 and CK5 count reverse-complement canonical contiguous k-mers. P summarizes hydrogen-bond class, GC content, purine content, EIIP-like values, N fraction, entropy and length-related properties at the read level. MSP applies the same property family over relative-position bins; its purpose is not to create a larger sequence vocabulary, but to return low-dimensional positional information to an otherwise order-poor k-mer frequency vector. CK4+P concatenates canonical 4-mer identity with global property summaries, CK4+MSP tests positionalized property pooling without the global P block, and CK4P-MSP combines all three blocks. Full-position identity or property matrices retain per-position information and were used only to estimate an upper bound on positional readability. CSP combines spaced-seed counts with property summaries and was used to test whether matching-oriented spaced-seed priors transfer into dense representation diagnostics.</w:t>
+        <w:t>The representation families were defined to separate local k-mer composition, global biochemical summaries and coarse positional information. CK4 and CK5 count reverse-complement canonical contiguous k-mers. P contains the read-level mean and population standard deviation of hydrogen-bond, GC, purine and electron-ion interaction potential (EIIP) maps, together with N fraction, length divided by 200 and Shannon entropy over A/C/G/T/N divided by log2(5). MSP mean-pools five per-base maps (hydrogen bond, GC, purine, EIIP and N indicator) over relative-position binsets with 2, 3, 4 and 6 bins. MSP does not create a larger sequence vocabulary or reconstruct full position; it adds a coarse positional property summary to an otherwise order-poor k-mer-frequency vector. The default 2+3+4+6 binset was prespecified as a coarse-to-fine relative-position summary whose finest scale remains above single-position resolution across the 50-150 bp study range. The seven-group ablation comprised K (136 dimensions), P (11), MSP (75), K+P (147), K+MSP (211), P+MSP (86) and K+P+MSP (222). Full-position composition or property matrices retained per-position information and were used only to estimate an upper bound on positional readability. CSP combines spaced-seed counts with property summaries and was used to test whether matching-oriented spaced-seed priors transfer into dense representation diagnostics.</w:t>
       </w:r>
     </w:p>
     <w:p>
       <w:r>
-        <w:t>For mixed representations, each block was computed separately and internally L2-normalized before weighted assembly. For read s_i, let K_i, P_i and M_i denote the reverse-complement canonical 4-mer identity block, the global biochemical-property block, and the multi-scale positional-property block, respectively. The internally normalized blocks were defined as</w:t>
+        <w:t>For mixed representations, each block was computed separately and internally L2-normalized before weighted assembly. For read s_i, let K_i, P_i and M_i denote the reverse-complement canonical 4-mer composition block, the global biochemical-property block, and the multi-scale positional-property block, respectively. The internally normalized blocks were defined as</w:t>
       </w:r>
     </w:p>
     <w:p>
@@ -272,7 +271,7 @@
     </w:p>
     <w:p>
       <w:r>
-        <w:t>where α, β and γ are block weights and [· ; ·] denotes concatenation. Because the block norms are fixed before concatenation, the denominator is a fixed scalar for a given weight setting rather than a read-specific global norm. The reported global drift metric was</w:t>
+        <w:t>where α, β and γ are block weights and [· ; ·] denotes concatenation. Unless otherwise stated, all three weights were set to 1. The block-weight audit compared equal weights with K-dominant (2,1,1) and property-dominant (1,2,2) settings; the separate MSP audit evaluated γ\in\0,0.25,0.5,1,2\. Because the block norms are fixed before concatenation, the denominator is a fixed scalar for a given weight setting rather than a read-specific global norm. The reported global drift metric was</w:t>
       </w:r>
     </w:p>
     <w:p>
@@ -310,7 +309,7 @@
     </w:p>
     <w:p>
       <w:r>
-        <w:t>For comparison with the identity-only drift d_K(i,j)=||K_i-K_j||_2, the mixed squared drift is lower than d_K^2 when</w:t>
+        <w:t>For comparison with the composition-only drift d_K(i,j)=||K_i-K_j||_2, the mixed squared drift is lower than d_K^2 when</w:t>
       </w:r>
     </w:p>
     <w:p>
@@ -328,7 +327,7 @@
     </w:p>
     <w:p>
       <w:r>
-        <w:t>where d_P and d_M are the corresponding blockwise drifts. Thus, lower property and MSP drift than identity drift is a sufficient, but not necessary, condition for a lower mixed drift. This explicit block construction allowed us to test whether the observed gains persisted when identity and property weights were changed. The design therefore does not assume that concatenation is intrinsically useful; it treats concatenation as a hypothesis that must survive same-dimension baselines, dimension-matched high-k compressed baselines, block-weight audits, blockwise drift decomposition and P/MSP counterfactual controls.</w:t>
+        <w:t>where d_P and d_M are the corresponding blockwise drifts. Thus, lower P and MSP drift than K drift is a sufficient, but not necessary, condition for a lower mixed drift. The diagnostic protocol takes matched clean/perturbed reads, reports stability and nearest-clean retrieval, tests structured local change with grouped delta-readout, and decomposes the result through the seven-group ablation and prespecified conditional contrasts. It yields a representation profile rather than an automated acceptance threshold.</w:t>
       </w:r>
     </w:p>
     <w:p>
@@ -504,7 +503,7 @@
                 <w:rFonts w:ascii="Times New Roman" w:hAnsi="Times New Roman"/>
                 <w:sz w:val="16"/>
               </w:rPr>
-              <w:t>exact local identity</w:t>
+              <w:t>canonical local k-mer composition</w:t>
             </w:r>
           </w:p>
         </w:tc>
@@ -528,7 +527,7 @@
                 <w:rFonts w:ascii="Times New Roman" w:hAnsi="Times New Roman"/>
                 <w:sz w:val="16"/>
               </w:rPr>
-              <w:t>identity backbone and comparator</w:t>
+              <w:t>composition backbone and comparator</w:t>
             </w:r>
           </w:p>
         </w:tc>
@@ -552,7 +551,7 @@
                 <w:rFonts w:ascii="Times New Roman" w:hAnsi="Times New Roman"/>
                 <w:sz w:val="16"/>
               </w:rPr>
-              <w:t>necessary for taxonomic, allele and SNP-level evidence</w:t>
+              <w:t>compact token-frequency evidence, not database-linked read identity</w:t>
             </w:r>
           </w:p>
         </w:tc>
@@ -602,7 +601,7 @@
                 <w:rFonts w:ascii="Times New Roman" w:hAnsi="Times New Roman"/>
                 <w:sz w:val="16"/>
               </w:rPr>
-              <w:t>biochemical summaries</w:t>
+              <w:t>global biochemical summaries</w:t>
             </w:r>
           </w:p>
         </w:tc>
@@ -626,7 +625,7 @@
                 <w:rFonts w:ascii="Times New Roman" w:hAnsi="Times New Roman"/>
                 <w:sz w:val="16"/>
               </w:rPr>
-              <w:t>perturbation-stable side channel</w:t>
+              <w:t>perturbation-stable channel</w:t>
             </w:r>
           </w:p>
         </w:tc>
@@ -650,7 +649,105 @@
                 <w:rFonts w:ascii="Times New Roman" w:hAnsi="Times New Roman"/>
                 <w:sz w:val="16"/>
               </w:rPr>
-              <w:t>adds robustness information but does not replace identity</w:t>
+              <w:t>tests global biochemical response without local composition</w:t>
+            </w:r>
+          </w:p>
+        </w:tc>
+      </w:tr>
+      <w:tr>
+        <w:tc>
+          <w:tcPr>
+            <w:tcW w:type="dxa" w:w="1700"/>
+            <w:vAlign w:val="center"/>
+            <w:tcMar>
+              <w:top w:w="80" w:type="dxa"/>
+              <w:start w:w="120" w:type="dxa"/>
+              <w:bottom w:w="80" w:type="dxa"/>
+              <w:end w:w="120" w:type="dxa"/>
+            </w:tcMar>
+          </w:tcPr>
+          <w:p>
+            <w:pPr>
+              <w:spacing w:after="0" w:line="240" w:lineRule="auto"/>
+            </w:pPr>
+            <w:r>
+              <w:rPr>
+                <w:rFonts w:ascii="Times New Roman" w:hAnsi="Times New Roman"/>
+                <w:sz w:val="16"/>
+              </w:rPr>
+              <w:t>MSP</w:t>
+            </w:r>
+          </w:p>
+        </w:tc>
+        <w:tc>
+          <w:tcPr>
+            <w:tcW w:type="dxa" w:w="3300"/>
+            <w:vAlign w:val="center"/>
+            <w:tcMar>
+              <w:top w:w="80" w:type="dxa"/>
+              <w:start w:w="120" w:type="dxa"/>
+              <w:bottom w:w="80" w:type="dxa"/>
+              <w:end w:w="120" w:type="dxa"/>
+            </w:tcMar>
+          </w:tcPr>
+          <w:p>
+            <w:pPr>
+              <w:spacing w:after="0" w:line="240" w:lineRule="auto"/>
+            </w:pPr>
+            <w:r>
+              <w:rPr>
+                <w:rFonts w:ascii="Times New Roman" w:hAnsi="Times New Roman"/>
+                <w:sz w:val="16"/>
+              </w:rPr>
+              <w:t>positionalized biochemical summaries</w:t>
+            </w:r>
+          </w:p>
+        </w:tc>
+        <w:tc>
+          <w:tcPr>
+            <w:tcW w:type="dxa" w:w="2200"/>
+            <w:vAlign w:val="center"/>
+            <w:tcMar>
+              <w:top w:w="80" w:type="dxa"/>
+              <w:start w:w="120" w:type="dxa"/>
+              <w:bottom w:w="80" w:type="dxa"/>
+              <w:end w:w="120" w:type="dxa"/>
+            </w:tcMar>
+          </w:tcPr>
+          <w:p>
+            <w:pPr>
+              <w:spacing w:after="0" w:line="240" w:lineRule="auto"/>
+            </w:pPr>
+            <w:r>
+              <w:rPr>
+                <w:rFonts w:ascii="Times New Roman" w:hAnsi="Times New Roman"/>
+                <w:sz w:val="16"/>
+              </w:rPr>
+              <w:t>coarse positional channel</w:t>
+            </w:r>
+          </w:p>
+        </w:tc>
+        <w:tc>
+          <w:tcPr>
+            <w:tcW w:type="dxa" w:w="2160"/>
+            <w:vAlign w:val="center"/>
+            <w:tcMar>
+              <w:top w:w="80" w:type="dxa"/>
+              <w:start w:w="120" w:type="dxa"/>
+              <w:bottom w:w="80" w:type="dxa"/>
+              <w:end w:w="120" w:type="dxa"/>
+            </w:tcMar>
+          </w:tcPr>
+          <w:p>
+            <w:pPr>
+              <w:spacing w:after="0" w:line="240" w:lineRule="auto"/>
+            </w:pPr>
+            <w:r>
+              <w:rPr>
+                <w:rFonts w:ascii="Times New Roman" w:hAnsi="Times New Roman"/>
+                <w:sz w:val="16"/>
+              </w:rPr>
+              <w:t>tests local-change readability without K or global P</w:t>
             </w:r>
           </w:p>
         </w:tc>
@@ -700,7 +797,7 @@
                 <w:rFonts w:ascii="Times New Roman" w:hAnsi="Times New Roman"/>
                 <w:sz w:val="16"/>
               </w:rPr>
-              <w:t>identity plus global biochemical signal</w:t>
+              <w:t>composition plus global biochemical signal</w:t>
             </w:r>
           </w:p>
         </w:tc>
@@ -798,7 +895,7 @@
                 <w:rFonts w:ascii="Times New Roman" w:hAnsi="Times New Roman"/>
                 <w:sz w:val="16"/>
               </w:rPr>
-              <w:t>identity plus positionalized biochemical signal</w:t>
+              <w:t>composition plus positionalized biochemical signal</w:t>
             </w:r>
           </w:p>
         </w:tc>
@@ -872,6 +969,104 @@
                 <w:rFonts w:ascii="Times New Roman" w:hAnsi="Times New Roman"/>
                 <w:sz w:val="16"/>
               </w:rPr>
+              <w:t>P+MSP</w:t>
+            </w:r>
+          </w:p>
+        </w:tc>
+        <w:tc>
+          <w:tcPr>
+            <w:tcW w:type="dxa" w:w="3300"/>
+            <w:vAlign w:val="center"/>
+            <w:tcMar>
+              <w:top w:w="80" w:type="dxa"/>
+              <w:start w:w="120" w:type="dxa"/>
+              <w:bottom w:w="80" w:type="dxa"/>
+              <w:end w:w="120" w:type="dxa"/>
+            </w:tcMar>
+          </w:tcPr>
+          <w:p>
+            <w:pPr>
+              <w:spacing w:after="0" w:line="240" w:lineRule="auto"/>
+            </w:pPr>
+            <w:r>
+              <w:rPr>
+                <w:rFonts w:ascii="Times New Roman" w:hAnsi="Times New Roman"/>
+                <w:sz w:val="16"/>
+              </w:rPr>
+              <w:t>global plus positionalized biochemical summaries</w:t>
+            </w:r>
+          </w:p>
+        </w:tc>
+        <w:tc>
+          <w:tcPr>
+            <w:tcW w:type="dxa" w:w="2200"/>
+            <w:vAlign w:val="center"/>
+            <w:tcMar>
+              <w:top w:w="80" w:type="dxa"/>
+              <w:start w:w="120" w:type="dxa"/>
+              <w:bottom w:w="80" w:type="dxa"/>
+              <w:end w:w="120" w:type="dxa"/>
+            </w:tcMar>
+          </w:tcPr>
+          <w:p>
+            <w:pPr>
+              <w:spacing w:after="0" w:line="240" w:lineRule="auto"/>
+            </w:pPr>
+            <w:r>
+              <w:rPr>
+                <w:rFonts w:ascii="Times New Roman" w:hAnsi="Times New Roman"/>
+                <w:sz w:val="16"/>
+              </w:rPr>
+              <w:t>property-only combination</w:t>
+            </w:r>
+          </w:p>
+        </w:tc>
+        <w:tc>
+          <w:tcPr>
+            <w:tcW w:type="dxa" w:w="2160"/>
+            <w:vAlign w:val="center"/>
+            <w:tcMar>
+              <w:top w:w="80" w:type="dxa"/>
+              <w:start w:w="120" w:type="dxa"/>
+              <w:bottom w:w="80" w:type="dxa"/>
+              <w:end w:w="120" w:type="dxa"/>
+            </w:tcMar>
+          </w:tcPr>
+          <w:p>
+            <w:pPr>
+              <w:spacing w:after="0" w:line="240" w:lineRule="auto"/>
+            </w:pPr>
+            <w:r>
+              <w:rPr>
+                <w:rFonts w:ascii="Times New Roman" w:hAnsi="Times New Roman"/>
+                <w:sz w:val="16"/>
+              </w:rPr>
+              <w:t>tests property stability and retrieval without K</w:t>
+            </w:r>
+          </w:p>
+        </w:tc>
+      </w:tr>
+      <w:tr>
+        <w:tc>
+          <w:tcPr>
+            <w:tcW w:type="dxa" w:w="1700"/>
+            <w:vAlign w:val="center"/>
+            <w:tcMar>
+              <w:top w:w="80" w:type="dxa"/>
+              <w:start w:w="120" w:type="dxa"/>
+              <w:bottom w:w="80" w:type="dxa"/>
+              <w:end w:w="120" w:type="dxa"/>
+            </w:tcMar>
+          </w:tcPr>
+          <w:p>
+            <w:pPr>
+              <w:spacing w:after="0" w:line="240" w:lineRule="auto"/>
+            </w:pPr>
+            <w:r>
+              <w:rPr>
+                <w:rFonts w:ascii="Times New Roman" w:hAnsi="Times New Roman"/>
+                <w:sz w:val="16"/>
+              </w:rPr>
               <w:t>CK4P-MSP</w:t>
             </w:r>
           </w:p>
@@ -896,7 +1091,7 @@
                 <w:rFonts w:ascii="Times New Roman" w:hAnsi="Times New Roman"/>
                 <w:sz w:val="16"/>
               </w:rPr>
-              <w:t>identity plus multi-scale biochemical layout</w:t>
+              <w:t>composition plus multi-scale biochemical layout</w:t>
             </w:r>
           </w:p>
         </w:tc>
@@ -944,7 +1139,7 @@
                 <w:rFonts w:ascii="Times New Roman" w:hAnsi="Times New Roman"/>
                 <w:sz w:val="16"/>
               </w:rPr>
-              <w:t>balances stability, readability and feature dimension</w:t>
+              <w:t>balances stability, readability and composition-linked retrieval</w:t>
             </w:r>
           </w:p>
         </w:tc>
@@ -994,7 +1189,7 @@
                 <w:rFonts w:ascii="Times New Roman" w:hAnsi="Times New Roman"/>
                 <w:sz w:val="16"/>
               </w:rPr>
-              <w:t>per-position identity or property signal</w:t>
+              <w:t>per-position token or property signal</w:t>
             </w:r>
           </w:p>
         </w:tc>
@@ -1157,22 +1352,22 @@
     </w:p>
     <w:p>
       <w:r>
-        <w:t>The experiments were organized into eight data layers, with the scale of each layer reported in Table 2. The WGS perturbation layer contained 25,200 rows from 3,600 clean templates across six genera, 21 species and six read lengths. The position-property ablation layer expanded this to 36,000 rows over the same template set and length grid. ART Illumina-like simulation contributed 75,592 paired rows from 37,796 templates across 69-150 bp reads. CAMI_TOY_low probes used a 104,166-row initial labelled subset and a 216,000-row expanded subset with 30 labels at 69, 75 and 100 bp. The CAMI II marine lightweight probe used 4,000 anonymous source reads and 48,000 length/condition rows at 69, 75 and 100 bp. The local mutation layer used 250 triplets per analysis cell across 12 representations, four local modes and three read lengths. WGS-derived paired perturbations measured clean-versus-perturbed stability. ART Illumina-like simulation tested whether the same trends persisted under simulator-derived sequencing errors. A quality-stratified ART audit further split simulator outputs by read-quality strata, providing an error-aware check without claiming to model all clinical error processes. CAMI_TOY_low probes tested external metagenomic readability, whereas the CAMI II marine subset tested perturbation stability on anonymous external metagenomic reads without read-level taxonomic labels in this lightweight analysis. Controlled position and order tasks tested whether positional information was recoverable. Local mutation sensitivity compared structured local changes with matched nuisance perturbation. Boundary probes tested spaced-seed transfer, context visibility and ARG/SNP limits.</w:t>
+        <w:t>The experiments were organized into nine data layers, with the scale of each layer reported in Table 2. The WGS perturbation layer contained 25,200 rows from 3,600 clean templates across six genera, 21 species and six read lengths. The position-property ablation layer expanded this to 36,000 rows over the same template set and length grid. The lower-bound continuity layer generated 76,440 global perturbation rows from 420 shared source templates at all 26 integer lengths from 50 to 75 bp, seven K/P/MSP representations and six non-clean perturbations. Its grouped local audit generated 18,720 matched template triplets, or 56,160 clean/local/nuisance variants, from 180 triplets per length-by-mode cell across four local modes. ART Illumina-like simulation contributed 55,961 matched clean/simulated pairs, represented as 111,922 rows, across 50, 60, 69, 75, 100, 125 and 150 bp [43]. The current-contract CAMI_TOY_low probe used 24,000 labelled 100-bp source reads and expanded them to 216,000 rows at 69, 75 and 100 bp under clean, 3% N masking and 1% substitution conditions. The CAMI II marine lightweight probe used 4,000 anonymous source reads and 48,000 length/condition rows at 69, 75 and 100 bp. The main local mutation layer used 250 triplets per analysis cell, four local modes and three read lengths. WGS-derived paired perturbations measured clean-versus-perturbed stability; the continuity layer isolated lower-range length effects on shared templates; ART added simulator-derived errors; CAMI resources supplied bounded external probes; controlled position and order tasks tested positional readability; and boundary probes tested spaced-seed transfer, context visibility and ARG/SNP limits.</w:t>
       </w:r>
     </w:p>
     <w:p>
       <w:r>
-        <w:t>For CAMI_TOY_low, labels were normalized to a species-level view when available, and genus-level and target-versus-background probes were derived from the same normalized label field. Background or unclassified reads were retained only for probes that explicitly required a target/background split, whereas the labelled subsets were used for lightweight external readout at 30 labels across 69, 75 and 100 bp. The initial labelled subset supported the first external probe, and the expanded subset was used when the probe required broader label coverage. This lightweight CAMI use was intended to test whether representation-level readability survives an external metagenomic probe, not to approximate production-scale community profiling.</w:t>
+        <w:t>For CAMI_TOY_low, read identifiers were joined to the available taxon mapping and normalized to a common label field [14,15]; the expanded source subset contained 30 candidate taxon identifiers. Unclassified reads were excluded from the labelled probe and retained only when a target-versus-background split explicitly required background reads. Per-class sampling was capped to prevent dominant labels from controlling the shallow probe. These CAMI readouts were generated before the public block-normalized CK4P-MSP contract and are retained only as external context; historical feature aliases were not relabelled as the current method. Consequently, the main text uses the coarse target-versus-background result and does not present the historical 30-label probe as a contract-v2 CK4P-MSP comparison.</w:t>
       </w:r>
     </w:p>
     <w:p>
       <w:r>
-        <w:t>We also added a lightweight CAMI II marine subset as an external short-read stability probe. We streamed a prefix of CAMI II marine short-read sample 0 and parsed 4,000 anonymous 150 bp reads from the embedded anonymous_reads.fq.gz member. These reads were truncated to 69, 75 and 100 bp and expanded into clean, N_3pct, substitution_1pct and substitution_1pct_N_3pct conditions, yielding 48,000 length/condition rows. CAMI II provides benchmark truth resources, but the anonymous FASTQ headers did not provide read-level taxonomic labels in the streamed-read file used here, and the separate OTU-specific truth bundles were not reconstructed for this lightweight analysis. This CAMI II probe was therefore restricted to paired perturbation-stability metrics. It should be interpreted as an external metagenomic stability check, not as CAMI II taxonomic validation.</w:t>
+        <w:t>We also added a lightweight CAMI II marine subset as an external short-read stability probe [15]. We streamed a prefix of CAMI II marine short-read sample 0 and parsed 4,000 anonymous 150 bp reads from the embedded anonymous_reads.fq.gz member. These reads were truncated to 69, 75 and 100 bp and expanded into clean, N_3pct, substitution_1pct and substitution_1pct_N_3pct conditions, yielding 48,000 length/condition rows. CAMI II provides benchmark truth resources, but the anonymous FASTQ headers did not provide read-level taxonomic labels in the streamed-read file used here, and the separate OTU-specific truth bundles were not reconstructed for this lightweight analysis. This CAMI II probe therefore reports paired perturbation-stability metrics on an external metagenomic sequence source rather than CAMI II taxonomic validation.</w:t>
       </w:r>
     </w:p>
     <w:p>
       <w:r>
-        <w:t>This layered simulation design was used because each component isolates a different failure mode. The controlled WGS grid makes perturbation type, read length and representation family directly comparable. ART adds a recognized Illumina-like simulator layer, but it is retained as a consistency check rather than treated as ground-truth clinical sequencing physics. The quality-stratified ART audit adds a more explicit error-aware view of the same simulator-derived layer. It supports statements about robustness across quality strata, but it does not by itself establish clinical validation.</w:t>
+        <w:t>This layered simulation design was used because each component isolates a different failure mode. The controlled WGS grid makes perturbation type, read length and representation family directly comparable. The continuity layer isolates the lower read-length variable through shared-template truncation; its dense points are descriptive sensitivity evidence and do not multiply the prespecified inferential grid. ART adds a recognized Illumina-like simulator layer under the current CK4P-MSP contract [43]. Because the selected ART profile produces non-monotonic cycle-dependent error loads, it supports within-length representation comparisons and quality-stratified ordering rather than a causal claim that every change across 50-150 bp is due to length alone.</w:t>
       </w:r>
     </w:p>
     <w:p>
@@ -1520,7 +1715,7 @@
                 <w:rFonts w:ascii="Times New Roman" w:hAnsi="Times New Roman"/>
                 <w:sz w:val="16"/>
               </w:rPr>
-              <w:t>What do P and MSP add to the CK4 identity backbone?</w:t>
+              <w:t>What do P and MSP add to the CK4 composition backbone?</w:t>
             </w:r>
           </w:p>
         </w:tc>
@@ -1594,6 +1789,128 @@
                 <w:rFonts w:ascii="Times New Roman" w:hAnsi="Times New Roman"/>
                 <w:sz w:val="16"/>
               </w:rPr>
+              <w:t>Shared-template length continuity</w:t>
+            </w:r>
+          </w:p>
+        </w:tc>
+        <w:tc>
+          <w:tcPr>
+            <w:tcW w:type="dxa" w:w="2350"/>
+            <w:vAlign w:val="center"/>
+            <w:tcMar>
+              <w:top w:w="80" w:type="dxa"/>
+              <w:start w:w="120" w:type="dxa"/>
+              <w:bottom w:w="80" w:type="dxa"/>
+              <w:end w:w="120" w:type="dxa"/>
+            </w:tcMar>
+          </w:tcPr>
+          <w:p>
+            <w:pPr>
+              <w:spacing w:after="0" w:line="240" w:lineRule="auto"/>
+            </w:pPr>
+            <w:r>
+              <w:rPr>
+                <w:rFonts w:ascii="Times New Roman" w:hAnsi="Times New Roman"/>
+                <w:sz w:val="16"/>
+              </w:rPr>
+              <w:t>420 shared templates at every integer length from 50 to 75 bp; 76,440 global rows and 18,720 local triplets</w:t>
+            </w:r>
+          </w:p>
+        </w:tc>
+        <w:tc>
+          <w:tcPr>
+            <w:tcW w:type="dxa" w:w="2000"/>
+            <w:vAlign w:val="center"/>
+            <w:tcMar>
+              <w:top w:w="80" w:type="dxa"/>
+              <w:start w:w="120" w:type="dxa"/>
+              <w:bottom w:w="80" w:type="dxa"/>
+              <w:end w:w="120" w:type="dxa"/>
+            </w:tcMar>
+          </w:tcPr>
+          <w:p>
+            <w:pPr>
+              <w:spacing w:after="0" w:line="240" w:lineRule="auto"/>
+            </w:pPr>
+            <w:r>
+              <w:rPr>
+                <w:rFonts w:ascii="Times New Roman" w:hAnsi="Times New Roman"/>
+                <w:sz w:val="16"/>
+              </w:rPr>
+              <w:t>Does the stability-readability profile persist across the lower short-read range?</w:t>
+            </w:r>
+          </w:p>
+        </w:tc>
+        <w:tc>
+          <w:tcPr>
+            <w:tcW w:type="dxa" w:w="1800"/>
+            <w:vAlign w:val="center"/>
+            <w:tcMar>
+              <w:top w:w="80" w:type="dxa"/>
+              <w:start w:w="120" w:type="dxa"/>
+              <w:bottom w:w="80" w:type="dxa"/>
+              <w:end w:w="120" w:type="dxa"/>
+            </w:tcMar>
+          </w:tcPr>
+          <w:p>
+            <w:pPr>
+              <w:spacing w:after="0" w:line="240" w:lineRule="auto"/>
+            </w:pPr>
+            <w:r>
+              <w:rPr>
+                <w:rFonts w:ascii="Times New Roman" w:hAnsi="Times New Roman"/>
+                <w:sz w:val="16"/>
+              </w:rPr>
+              <w:t>paired drift, grouped delta-readout, conditional P/MSP increments</w:t>
+            </w:r>
+          </w:p>
+        </w:tc>
+        <w:tc>
+          <w:tcPr>
+            <w:tcW w:type="dxa" w:w="1860"/>
+            <w:vAlign w:val="center"/>
+            <w:tcMar>
+              <w:top w:w="80" w:type="dxa"/>
+              <w:start w:w="120" w:type="dxa"/>
+              <w:bottom w:w="80" w:type="dxa"/>
+              <w:end w:w="120" w:type="dxa"/>
+            </w:tcMar>
+          </w:tcPr>
+          <w:p>
+            <w:pPr>
+              <w:spacing w:after="0" w:line="240" w:lineRule="auto"/>
+            </w:pPr>
+            <w:r>
+              <w:rPr>
+                <w:rFonts w:ascii="Times New Roman" w:hAnsi="Times New Roman"/>
+                <w:sz w:val="16"/>
+              </w:rPr>
+              <w:t>descriptive lower-bound sensitivity; not a dense 50-150 bp scan</w:t>
+            </w:r>
+          </w:p>
+        </w:tc>
+      </w:tr>
+      <w:tr>
+        <w:tc>
+          <w:tcPr>
+            <w:tcW w:type="dxa" w:w="1350"/>
+            <w:vAlign w:val="center"/>
+            <w:tcMar>
+              <w:top w:w="80" w:type="dxa"/>
+              <w:start w:w="120" w:type="dxa"/>
+              <w:bottom w:w="80" w:type="dxa"/>
+              <w:end w:w="120" w:type="dxa"/>
+            </w:tcMar>
+          </w:tcPr>
+          <w:p>
+            <w:pPr>
+              <w:spacing w:after="0" w:line="240" w:lineRule="auto"/>
+            </w:pPr>
+            <w:r>
+              <w:rPr>
+                <w:rFonts w:ascii="Times New Roman" w:hAnsi="Times New Roman"/>
+                <w:sz w:val="16"/>
+              </w:rPr>
               <w:t>ART Illumina-like simulation</w:t>
             </w:r>
           </w:p>
@@ -1618,7 +1935,7 @@
                 <w:rFonts w:ascii="Times New Roman" w:hAnsi="Times New Roman"/>
                 <w:sz w:val="16"/>
               </w:rPr>
-              <w:t>75,592 paired rows; 37,796 templates; 6 genera/21 species; lengths 69,75,100,125,150 bp</w:t>
+              <w:t>55,961 matched clean/simulated pairs; 111,922 rows; lengths 50,60,69,75,100,125,150 bp</w:t>
             </w:r>
           </w:p>
         </w:tc>
@@ -1642,7 +1959,7 @@
                 <w:rFonts w:ascii="Times New Roman" w:hAnsi="Times New Roman"/>
                 <w:sz w:val="16"/>
               </w:rPr>
-              <w:t>Do stability trends persist under simulator-derived read errors?</w:t>
+              <w:t>Does current-contract ordering persist within simulator lengths and quality strata?</w:t>
             </w:r>
           </w:p>
         </w:tc>
@@ -1666,7 +1983,7 @@
                 <w:rFonts w:ascii="Times New Roman" w:hAnsi="Times New Roman"/>
                 <w:sz w:val="16"/>
               </w:rPr>
-              <w:t>paired cosine, L2 drift, retrieval</w:t>
+              <w:t>drift ratio versus CK4, observed base difference rate</w:t>
             </w:r>
           </w:p>
         </w:tc>
@@ -1690,7 +2007,7 @@
                 <w:rFonts w:ascii="Times New Roman" w:hAnsi="Times New Roman"/>
                 <w:sz w:val="16"/>
               </w:rPr>
-              <w:t>platform-like consistency check</w:t>
+              <w:t>within-length simulator context; not a causal length trend or clinical error model</w:t>
             </w:r>
           </w:p>
         </w:tc>
@@ -1740,7 +2057,7 @@
                 <w:rFonts w:ascii="Times New Roman" w:hAnsi="Times New Roman"/>
                 <w:sz w:val="16"/>
               </w:rPr>
-              <w:t>104,166-row initial subset and 216,000-row expanded subset; 30 labels; lengths 69,75,100 bp</w:t>
+              <w:t>24,000 labelled source reads; 216,000 expanded rows; 30 taxon identifiers; lengths 69,75,100 bp</w:t>
             </w:r>
           </w:p>
         </w:tc>
@@ -1764,7 +2081,7 @@
                 <w:rFonts w:ascii="Times New Roman" w:hAnsi="Times New Roman"/>
                 <w:sz w:val="16"/>
               </w:rPr>
-              <w:t>Is information readable in an external metagenomic readout?</w:t>
+              <w:t>Is coarse or 30-label information readable in an external metagenomic source?</w:t>
             </w:r>
           </w:p>
         </w:tc>
@@ -1788,7 +2105,7 @@
                 <w:rFonts w:ascii="Times New Roman" w:hAnsi="Times New Roman"/>
                 <w:sz w:val="16"/>
               </w:rPr>
-              <w:t>macro-F1, accuracy</w:t>
+              <w:t>target/background and 30-label macro-F1</w:t>
             </w:r>
           </w:p>
         </w:tc>
@@ -1812,7 +2129,7 @@
                 <w:rFonts w:ascii="Times New Roman" w:hAnsi="Times New Roman"/>
                 <w:sz w:val="16"/>
               </w:rPr>
-              <w:t>lightweight readout, not clinical classification</w:t>
+              <w:t>current-contract external readout; not production taxonomic classification</w:t>
             </w:r>
           </w:p>
         </w:tc>
@@ -2317,17 +2634,17 @@
     </w:p>
     <w:p>
       <w:r>
-        <w:t>Perturbation stability was quantified by paired cosine similarity, paired L2 drift and nearest-clean retrieval. Readout was quantified by macro-F1 and accuracy from shallow probes, mainly logistic regression and nearest-centroid classification. Compactness was measured by feature dimension. Local mutation analysis used selective-sensitivity ratios and delta-readout to distinguish nuisance stability from sensitivity to structured local change. Bootstrap intervals summarized cell-level variation. Paired Wilcoxon tests with Benjamini-Hochberg correction were used for matched stability comparisons. Same-dimension PCA/SVD controls addressed dimensionality effects, and block-weight audits tested whether mixed-feature conclusions were stable under reasonable reweighting of identity and property blocks.</w:t>
+        <w:t>Perturbation stability was quantified by paired cosine similarity, paired L2 drift and nearest-clean retrieval. Representation readability was quantified by macro-F1 and accuracy from shallow logistic-regression or nearest-centroid probes. Compactness was measured by feature dimension. Local mutation analysis used selective-sensitivity ratios and grouped delta-readout; all derivatives of one template were kept in the same fold through stratified grouped cross-validation. For the seven-group audit, three contrasts were prespecified: K+P+MSP versus P+MSP for the conditional K contribution, versus K+MSP for P, and versus K+P for MSP. Mean matched-cell differences were summarized by 10,000 paired bootstrap resamples. Two-sided paired Wilcoxon signed-rank tests [44] were adjusted across the 12 metric-by-contrast rows by the Benjamini-Hochberg procedure [45].</w:t>
       </w:r>
     </w:p>
     <w:p>
       <w:r>
-        <w:t>The mixed-feature question was also tested through empirical information and counterfactual audits. For a perturbation label Y and representation-derived distance or readout features X, we estimated discretized pooled and conditional MI proxies using equal-frequency binning. The main pooled distance audits used eight bins, joint P/MSP summaries used five- or six-bin discretizations depending on the audit, and empirical permutation baselines used 200 shuffles per cell. These values are reported as estimator-dependent descriptive proxies rather than absolute physical information quantities. To test estimator sensitivity, we also ran a Ross/KSG-style k-nearest-neighbor MI robustness audit for continuous distance summaries and a discrete local-versus-noise perturbation label. This audit used k=5, 50 label permutations, 50 stratified subsampling repetitions and low-dimensional summaries including d_K, d_P, d_M, d_K+d_P, d_K+d_M, and d_K+d_P+d_M across the 69, 100 and 150 bp local-mutation cells. To separate the global and positional property layers, we additionally evaluated CK4, CK4+P, CK4+MSP and CK4P-MSP under the same block-normalized assembly rule. This direct contribution audit measured paired stability and local delta-readout, and was paired with a redundancy audit based on rank, canonical-correlation analysis and row-wise P/MSP alignment. To test whether the P/MSP contribution was more than additional dimensions, we also constructed CK4 plus permuted P/MSP blocks and CK4 plus Gaussian P/MSP blocks. These controls preserve a larger feature space but remove the sequence-linked biochemical mapping. The analysis was used as empirical support for perturbation-relevant information in the added property layers, not as a dataset-independent information-theoretic guarantee or as evidence that P and MSP are independent physical axes.</w:t>
+        <w:t>The mixed-feature question was also tested through empirical information audits. The historical equal-frequency discretized screen was retained as a supplementary descriptive check. The primary analysis used a Ross/Kraskov-Stogbauer-Grassberger (KSG)-style nearest-neighbour estimator [46,47] with k=5 on low-dimensional continuous summaries and a discrete local-versus-nuisance label, with 100 label permutations and 100 stratified subsamples per cell. These estimates are estimator-dependent empirical summaries rather than absolute physical information quantities. The seven-group contribution audit was paired with a relation audit based on rank, canonical-correlation analysis and row-wise P/MSP alignment. Together, these analyses test conditional empirical roles; they do not imply that P and MSP measure unrelated physical quantities.</w:t>
       </w:r>
     </w:p>
     <w:p>
       <w:r>
-        <w:t>We added a dimension-matched high-k compression audit to avoid comparing CK4P-MSP only with short contiguous k-mer baselines. Canonical k=15 signals were compressed to approximately the 222-feature CK4P-MSP budget using three controls: MinHash-style signatures, hashing-trick counts and sparse random projection. These baselines were evaluated on the same 69, 75, 100 and 150 bp perturbation grid using paired cosine similarity, L2 drift, nearest-clean retrieval and shallow readout. This audit tests whether the stability of CK4P-MSP persists against high-specificity k-mer information under a comparable compactness constraint. Finally, a feature-extraction runtime audit compared CK4P-MSP with CK4, CK4+P and dimension-matched high-k compressed controls. Runtime was treated as an engineering boundary, not as a primary performance claim.</w:t>
+        <w:t>We added a dimension-matched high-k compression audit to avoid comparing CK4P-MSP only with short contiguous k-mer baselines. Canonical k=15 signals were compressed to the 222-feature CK4P-MSP budget using hashing-trick counts and sparse random projection; these vector controls were evaluated on the same 69, 75, 100 and 150 bp perturbation grid using paired cosine similarity, L2 drift, nearest-clean retrieval and shallow readout. MinHash was assessed separately in its native collision/Jaccard geometry and was not treated as an L2 vector or linear readout feature. This audit tests whether compact stability persists against high-specificity k-mer information under a comparable vector budget. Finally, a feature-extraction runtime audit compared CK4P-MSP with CK4, CK4+P and the compact high-k controls. Runtime was treated as an engineering boundary, not as a primary performance claim.</w:t>
       </w:r>
     </w:p>
     <w:p>
@@ -2340,7 +2657,7 @@
     </w:p>
     <w:p>
       <w:r>
-        <w:t>All generated results used local scripts and result tables stored under the project workspace. Main figure assets are in info/paper/figures, table assets are in info/paper/tables, the baseline supplementary figures are generated by info/scripts/generate_paper_supplementary_figures.py, the kNN MI robustness audit by info/scripts/run_knn_mi_robustness_audit.py, the high-k compressed baseline audit by info/scripts/run_high_k_compressed_baselines.py, the P/MSP contribution audit by info/scripts/run_p_msp_contribution_audit.py, the P/MSP redundancy and runtime audit by info/scripts/run_property_redundancy_and_runtime_audit.py, the P-channel counterfactual audit by info/scripts/run_p_channel_counterfactual_audit.py, the CAMI II marine lightweight probe by info/scripts/run_cami2_marine_lightweight_probe.py, and its supplementary figure by info/scripts/generate_supp_fig_s10_cami2_marine_probe.py. The manuscript should not be read as using restricted hospital reads, as claiming clinical validation, or as proposing a replacement for exact matching systems. Its supported scope is narrower: compact biochemical and position-aware summaries can serve as auxiliary diagnostic channels for representation-level robustness auditing in controlled short-read settings.</w:t>
+        <w:t>The public implementation and the contract-v2 result namespace are maintained in the release repository. The manuscript-facing API is methods/ck4p_msp.py; the contribution, high-k, KSG, MSP sensitivity and redundancy/runtime audits are executed from experiments/audits/ and mapped to their result tables in docs/contract_v2_evidence_map.md. Historical scripts and outputs remain available for provenance but are not aliases for the public block-normalized CK4P-MSP method. The supported scope is compact and controlled: biochemical and position-aware summaries are evaluated as block-decomposable representation-level audit coordinates in short-read settings.</w:t>
       </w:r>
     </w:p>
     <w:p>
@@ -2356,17 +2673,17 @@
         <w:pStyle w:val="Heading3"/>
       </w:pPr>
       <w:r>
-        <w:t>Mixed-feature information gain under local perturbation</w:t>
+        <w:t>Empirical mixed-feature information audit under local perturbation</w:t>
       </w:r>
     </w:p>
     <w:p>
       <w:r>
-        <w:t>We first tested whether the added biochemical channel carried perturbation-relevant information rather than simply changing the scale of a mixed feature space. In the local-mutation audit, the equal-frequency MI proxy gave a higher pooled value for joint CK4+P/MSP distances than for CK4 distance alone, and the conditional proxy remained positive after conditioning on CK4 distance. Because discretized MI estimates are estimator-dependent, we treated this result as a descriptive screen and repeated the analysis with a k-nearest-neighbor MI robustness audit on low-dimensional distance summaries. Across the 12 local-mutation cells, the kNN audit estimated higher MI for the joint d_K+d_P+d_M summaries than for d_K alone, with a mean incremental estimate of approximately 0.138 bits beyond d_K and permutation support across the tested cells. This result is reported as estimator-dependent empirical evidence: on the tested perturbation grid and estimators, P/MSP distances carried perturbation information beyond a pure identity-only distance.</w:t>
+        <w:t>We first tested whether the added property channels showed perturbation-associated signal rather than only changing the scale of a mixed feature space. The contract-v2 KSG-style audit was applied to low-dimensional blockwise distance summaries for local change versus matched nuisance perturbation. Across 12 local-mutation cells, the mean estimate was 0.889 bits for d_K+d_P+d_M and 0.752 bits for d_K alone, an average incremental estimate of 0.138 bits. All primary summaries exceeded their label-permutation reference under the tested audit. This result is estimator-dependent empirical evidence: under the tested perturbation grid and estimator, P/MSP distance summaries improved local-versus-noise separability beyond the CK4 distance summary.</w:t>
       </w:r>
     </w:p>
     <w:p>
       <w:r>
-        <w:t>This audit is important for the interpretation of CK4P-MSP. A lower standardized drift could otherwise be attributed to dimensional dilution by low-variance auxiliary features. The MI robustness checks support a more specific conclusion: the property and MSP channels contributed perturbation-relevant empirical information under the tested local-change regime, while the block-weight audit separately checked that the conclusion was not tied to one arbitrary block scaling. The claim is therefore geometric and empirical, not a statement that heterogeneous L2 coordinates have identical physical units.</w:t>
+        <w:t>This audit does not turn the mixed representation into an information-theoretic theorem. It provides a complementary check on the ablation results: the property blocks contribute empirically detectable perturbation signal under the tested local-change regime, while the block-normalized metric remains a standardized diagnostic drift rather than a physical distance with commensurate units.</w:t>
       </w:r>
     </w:p>
     <w:p>
@@ -2424,6 +2741,29 @@
     <w:p/>
     <w:p>
       <w:pPr>
+        <w:pStyle w:val="Heading3"/>
+      </w:pPr>
+      <w:r>
+        <w:t>Global and positional property layers have related but distinct roles</w:t>
+      </w:r>
+    </w:p>
+    <w:p>
+      <w:r>
+        <w:t>We then evaluated all seven non-empty K/P/MSP combinations over 69, 75, 100 and 150 bp reads. Pure property summaries had the lowest numerical drift (P, 0.025; MSP, 0.027; P+MSP, 0.027), but they did not preserve the same nearest-clean behavior as K-containing representations: retrieval was 0.295 for P and 0.942 for P+MSP, compared with 1.000 for CK4P-MSP. Relative to P+MSP, adding K increased retrieval by 0.058 (95% bootstrap CI 0.036-0.081; BH-adjusted q=7.3\times10^-4) while increasing, rather than decreasing, drift.</w:t>
+      </w:r>
+    </w:p>
+    <w:p>
+      <w:r>
+        <w:t>Conditional effects differed by audit axis. Adding P to CK4+MSP reduced mean drift from 0.156 to 0.129 (improvement 0.027, 95% CI 0.023-0.031; q=2.4\times10^-7), but did not materially change grouped delta-readout. Adding MSP to CK4+P produced a similar drift reduction and increased grouped local-change macro-F1 from 0.904 to 0.979 (difference 0.074, 95% CI 0.035-0.117; q=7.3\times10^-4). Adding K to P+MSP increased macro-F1 by only 0.008 and the interval included zero. These results assign P primarily to global stability, MSP to local-change readability and K to composition-linked retrieval under the tested grid; they do not establish statistical independence or universal necessity.</w:t>
+      </w:r>
+    </w:p>
+    <w:p>
+      <w:r>
+        <w:t>The redundancy audit also cautions against overinterpreting P and MSP as separable sources. Across the tested lengths, the first canonical correlation between P and MSP was near one and their first principal components were strongly aligned, as expected because both blocks are derived from the same biochemical property family. However, MSP had higher numerical rank than P, and row-wise P/MSP alignment after compression was incomplete. We therefore interpret the blocks as related layers at different scales, not as interchangeable evidence sources or as measurements of unrelated physical quantities.</w:t>
+      </w:r>
+    </w:p>
+    <w:p>
+      <w:pPr>
         <w:pStyle w:val="Caption"/>
         <w:keepNext/>
       </w:pPr>
@@ -2431,7 +2771,7 @@
         <w:rPr>
           <w:b/>
         </w:rPr>
-        <w:t>Supplementary Figure S7. kNN MI robustness and dimension-matched high-k compressed baseline audit.</w:t>
+        <w:t>Figure 2. Compact stability under controlled perturbation.</w:t>
       </w:r>
     </w:p>
     <w:p>
@@ -2442,7 +2782,7 @@
       <w:r>
         <w:drawing>
           <wp:inline xmlns:a="http://schemas.openxmlformats.org/drawingml/2006/main" xmlns:pic="http://schemas.openxmlformats.org/drawingml/2006/picture">
-            <wp:extent cx="5669280" cy="4078732"/>
+            <wp:extent cx="5577840" cy="2519324"/>
             <wp:docPr id="3" name="Picture 3" descr="Picture 3"/>
             <wp:cNvGraphicFramePr>
               <a:graphicFrameLocks noChangeAspect="1"/>
@@ -2451,7 +2791,7 @@
               <a:graphicData uri="http://schemas.openxmlformats.org/drawingml/2006/picture">
                 <pic:pic>
                   <pic:nvPicPr>
-                    <pic:cNvPr id="0" name="supp_fig_s7_method_hardening_audit.jpg"/>
+                    <pic:cNvPr id="0" name="nature_fig2_compact_stability.jpg"/>
                     <pic:cNvPicPr/>
                   </pic:nvPicPr>
                   <pic:blipFill>
@@ -2463,7 +2803,7 @@
                   <pic:spPr>
                     <a:xfrm>
                       <a:off x="0" y="0"/>
-                      <a:ext cx="5669280" cy="4078732"/>
+                      <a:ext cx="5577840" cy="2519324"/>
                     </a:xfrm>
                     <a:prstGeom prst="rect"/>
                   </pic:spPr>
@@ -2475,82 +2815,6 @@
       </w:r>
     </w:p>
     <w:p/>
-    <w:p>
-      <w:pPr>
-        <w:pStyle w:val="Caption"/>
-        <w:keepNext/>
-      </w:pPr>
-      <w:r>
-        <w:rPr>
-          <w:b/>
-        </w:rPr>
-        <w:t>Supplementary Figure S5. P-channel counterfactual and short-bin reliability audit.</w:t>
-      </w:r>
-    </w:p>
-    <w:p>
-      <w:pPr>
-        <w:keepLines/>
-        <w:jc w:val="center"/>
-      </w:pPr>
-      <w:r>
-        <w:drawing>
-          <wp:inline xmlns:a="http://schemas.openxmlformats.org/drawingml/2006/main" xmlns:pic="http://schemas.openxmlformats.org/drawingml/2006/picture">
-            <wp:extent cx="5669280" cy="4251960"/>
-            <wp:docPr id="4" name="Picture 4" descr="Picture 4"/>
-            <wp:cNvGraphicFramePr>
-              <a:graphicFrameLocks noChangeAspect="1"/>
-            </wp:cNvGraphicFramePr>
-            <a:graphic>
-              <a:graphicData uri="http://schemas.openxmlformats.org/drawingml/2006/picture">
-                <pic:pic>
-                  <pic:nvPicPr>
-                    <pic:cNvPr id="0" name="supp_fig_s5_p_channel_counterfactual_audit.jpg"/>
-                    <pic:cNvPicPr/>
-                  </pic:nvPicPr>
-                  <pic:blipFill>
-                    <a:blip r:embed="rId12"/>
-                    <a:stretch>
-                      <a:fillRect/>
-                    </a:stretch>
-                  </pic:blipFill>
-                  <pic:spPr>
-                    <a:xfrm>
-                      <a:off x="0" y="0"/>
-                      <a:ext cx="5669280" cy="4251960"/>
-                    </a:xfrm>
-                    <a:prstGeom prst="rect"/>
-                  </pic:spPr>
-                </pic:pic>
-              </a:graphicData>
-            </a:graphic>
-          </wp:inline>
-        </w:drawing>
-      </w:r>
-    </w:p>
-    <w:p/>
-    <w:p>
-      <w:pPr>
-        <w:pStyle w:val="Heading3"/>
-      </w:pPr>
-      <w:r>
-        <w:t>Global and positional property layers have related but distinct roles</w:t>
-      </w:r>
-    </w:p>
-    <w:p>
-      <w:r>
-        <w:t>We then separated the two property layers directly. In a matched contribution audit over 69, 75, 100 and 150 bp reads, CK4 alone had a mean paired L2 drift of 0.254. Adding either global P or MSP reduced this drift to 0.182 and 0.181, respectively, and CK4P-MSP reduced it further to 0.150. Thus, both property layers contributed to nuisance-perturbation stability under the block-normalized metric.</w:t>
-      </w:r>
-    </w:p>
-    <w:p>
-      <w:r>
-        <w:t>The local delta-readout pattern was more specific. CK4 and CK4+P achieved mean macro-F1 values of 0.888 and 0.894 for distinguishing structured local change from matched nuisance perturbation, whereas CK4+MSP reached 0.976 and CK4P-MSP reached 0.977. This indicates that the positionalized property layer, rather than the global P block alone, carried most of the coarse positional readout gain. This supports the intended design: P provides a global biochemical stability summary, whereas MSP uses the same property family to return low-dimensional positional information to a compact identity-frequency backbone.</w:t>
-      </w:r>
-    </w:p>
-    <w:p>
-      <w:r>
-        <w:t>The redundancy audit also cautions against overinterpreting P and MSP as independent axes. Across the tested lengths, the first canonical correlation between P and MSP was near one and their first principal components were strongly aligned, as expected because both blocks are derived from the same biochemical property family. However, MSP had higher numerical rank than P, and row-wise P/MSP alignment after compression was incomplete. We therefore interpret the blocks as related layers at different scales, not as interchangeable evidence sources or as independent physical axes.</w:t>
-      </w:r>
-    </w:p>
     <w:p>
       <w:pPr>
         <w:pStyle w:val="Caption"/>
@@ -2572,7 +2836,7 @@
         <w:drawing>
           <wp:inline xmlns:a="http://schemas.openxmlformats.org/drawingml/2006/main" xmlns:pic="http://schemas.openxmlformats.org/drawingml/2006/picture">
             <wp:extent cx="5669280" cy="4585818"/>
-            <wp:docPr id="5" name="Picture 5" descr="Picture 5"/>
+            <wp:docPr id="4" name="Picture 4" descr="Picture 4"/>
             <wp:cNvGraphicFramePr>
               <a:graphicFrameLocks noChangeAspect="1"/>
             </wp:cNvGraphicFramePr>
@@ -2584,7 +2848,7 @@
                     <pic:cNvPicPr/>
                   </pic:nvPicPr>
                   <pic:blipFill>
-                    <a:blip r:embed="rId13"/>
+                    <a:blip r:embed="rId12"/>
                     <a:stretch>
                       <a:fillRect/>
                     </a:stretch>
@@ -2606,73 +2870,20 @@
     <w:p/>
     <w:p>
       <w:pPr>
-        <w:pStyle w:val="Caption"/>
-        <w:keepNext/>
-      </w:pPr>
-      <w:r>
-        <w:rPr>
-          <w:b/>
-        </w:rPr>
-        <w:t>Supplementary Figure S9. P/MSP relation audit.</w:t>
-      </w:r>
-    </w:p>
-    <w:p>
-      <w:pPr>
-        <w:keepLines/>
-        <w:jc w:val="center"/>
-      </w:pPr>
-      <w:r>
-        <w:drawing>
-          <wp:inline xmlns:a="http://schemas.openxmlformats.org/drawingml/2006/main" xmlns:pic="http://schemas.openxmlformats.org/drawingml/2006/picture">
-            <wp:extent cx="5669280" cy="5593690"/>
-            <wp:docPr id="6" name="Picture 6" descr="Picture 6"/>
-            <wp:cNvGraphicFramePr>
-              <a:graphicFrameLocks noChangeAspect="1"/>
-            </wp:cNvGraphicFramePr>
-            <a:graphic>
-              <a:graphicData uri="http://schemas.openxmlformats.org/drawingml/2006/picture">
-                <pic:pic>
-                  <pic:nvPicPr>
-                    <pic:cNvPr id="0" name="supp_fig_s9_p_msp_relation_audit.jpg"/>
-                    <pic:cNvPicPr/>
-                  </pic:nvPicPr>
-                  <pic:blipFill>
-                    <a:blip r:embed="rId14"/>
-                    <a:stretch>
-                      <a:fillRect/>
-                    </a:stretch>
-                  </pic:blipFill>
-                  <pic:spPr>
-                    <a:xfrm>
-                      <a:off x="0" y="0"/>
-                      <a:ext cx="5669280" cy="5593690"/>
-                    </a:xfrm>
-                    <a:prstGeom prst="rect"/>
-                  </pic:spPr>
-                </pic:pic>
-              </a:graphicData>
-            </a:graphic>
-          </wp:inline>
-        </w:drawing>
-      </w:r>
-    </w:p>
-    <w:p/>
-    <w:p>
-      <w:pPr>
         <w:pStyle w:val="Heading3"/>
       </w:pPr>
       <w:r>
-        <w:t>MSP short-bin reliability remains usable at 69-75 bp</w:t>
+        <w:t>MSP short-bin reliability persists across 50-75 bp</w:t>
       </w:r>
     </w:p>
     <w:p>
       <w:r>
-        <w:t>We next tested whether MSP becomes noise-dominated when ultra-short reads are divided into finer relative-position bins. The short-bin audit did not show a catastrophic collapse at 69 or 75 bp. In the stability screen, moving from a 2-bin MSP to the full 2+3+4+6-bin MSP changed paired cosine and L2 drift only slightly at the default γ=1 setting: at 69 bp, paired cosine remained approximately 0.986 and L2 drift remained near 0.147; at 75 bp, paired cosine remained approximately 0.987 and L2 drift remained near 0.141. Retrieval also remained effectively saturated.</w:t>
+        <w:t>We next tested whether MSP becomes noise-dominated when short reads are divided into finer relative-position bins. The shared-template continuity audit did not show an abrupt failure across the 26 integer lengths from 50 to 75 bp. At 50 bp, mean grouped local delta-readout macro-F1 was 0.961 with the coarsest 2-bin summary and 0.988 with the complete 2+3+4+6 binset; the complete binset remained between 0.978 and 0.999 across the lower-range grid. Thus, finer relative bins increased rather than erased the structured local-change signal under this controlled construction.</w:t>
       </w:r>
     </w:p>
     <w:p>
       <w:r>
-        <w:t>The local delta-readout audit showed the opposite of an immediate short-bin failure. Finer multi-scale pooling improved mutation readout at fixed gamma. At 69 bp and γ=1, mean macro-F1 increased from approximately 0.865 with 2 bins to approximately 0.899 with 2+3 bins, 0.946 with 2+3+4 bins and 0.953 with 2+3+4+6 bins. The same monotonic pattern persisted at 100 and 150 bp. Bootstrap widths for pooled property features remained small, whereas worst-case binomial sampling error increased as expected when bins narrowed. The combined interpretation is therefore restrained but favorable: static MSP is not catastrophically noise-dominated in the tested ultra-short-read regime, yet it should still be interpreted as a coarse positional summary rather than as an optimized variance-aware weighting model.</w:t>
+        <w:t>The same audit separated the conditional roles of P and MSP. Across 50-75 bp, adding P to K+MSP reduced mean paired drift by approximately 0.029-0.036, whereas adding MSP to K+P increased grouped local-change macro-F1 by approximately 0.011-0.043, depending on length. CK4P-MSP drift decreased smoothly from 0.174 at 50 bp to 0.139 at 75 bp, while CK4 decreased from 0.294 to 0.235; grouped local-change macro-F1 was 0.988 and 0.993 for CK4P-MSP at the two endpoints. The legacy weight scan at 69 and 75 bp likewise showed that γ=1 was not a fragile point. Increasing γ to 2 further reduced global drift, so the default remains a fixed balanced setting rather than an empirically optimized stability weight. Static MSP is therefore usable in the tested short-read regime, but it remains a coarse positional summary rather than an optimized variance-aware estimator.</w:t>
       </w:r>
     </w:p>
     <w:p>
@@ -2696,7 +2907,7 @@
         <w:drawing>
           <wp:inline xmlns:a="http://schemas.openxmlformats.org/drawingml/2006/main" xmlns:pic="http://schemas.openxmlformats.org/drawingml/2006/picture">
             <wp:extent cx="5669280" cy="3838538"/>
-            <wp:docPr id="7" name="Picture 7" descr="Picture 7"/>
+            <wp:docPr id="5" name="Picture 5" descr="Picture 5"/>
             <wp:cNvGraphicFramePr>
               <a:graphicFrameLocks noChangeAspect="1"/>
             </wp:cNvGraphicFramePr>
@@ -2708,7 +2919,7 @@
                     <pic:cNvPicPr/>
                   </pic:nvPicPr>
                   <pic:blipFill>
-                    <a:blip r:embed="rId15"/>
+                    <a:blip r:embed="rId13"/>
                     <a:stretch>
                       <a:fillRect/>
                     </a:stretch>
@@ -2738,12 +2949,12 @@
     </w:p>
     <w:p>
       <w:r>
-        <w:t>We next asked whether the external simulator evidence depended on treating ART as one pooled error source. In the quality-stratified ART audit, representative compact controls remained readable across low-, mid- and high-quality bins. The property-aware compact representation preserved high paired cosine and bounded L2 drift across quality strata, and the hybrid identity/spaced representation retained retrieval and readout consistency.</w:t>
+        <w:t>The current-contract ART audit evaluated CK4, CK4+P, CK4+MSP, CK4P-MSP and CK5 at 50, 60, 69, 75, 100, 125 and 150 bp. Within every length, CK4P-MSP retained 0.58-0.60 of the CK4 standardized drift, and CK4+P and CK4+MSP each retained approximately 0.70-0.73. The ordering was also stable within low-, middle- and high-quality strata, indicating that the property-aware reduction was not created by pooling all simulator-derived reads into one error group.</w:t>
       </w:r>
     </w:p>
     <w:p>
       <w:r>
-        <w:t>These results strengthen, but do not overstate, the ART evidence. They show that the main pattern is not restricted to an undifferentiated simulator summary. They do not claim that ART quality strata capture the full physical error distribution of a clinical sequencing run.</w:t>
+        <w:t>The observed same-coordinate base-difference rate was not monotonic in read length: it rose from 2.70% at 50 bp to 6.64% at 100 bp, then fell below 0.22% at 125 and 150 bp under the selected ART profile. Consequently, the ART data are used for within-length and within-stratum representation comparisons, not to infer a physical read-length response across independently generated simulator cycles. ART also remains a simulator rather than a complete model of clinical sequencing error.</w:t>
       </w:r>
     </w:p>
     <w:p>
@@ -2767,7 +2978,7 @@
         <w:drawing>
           <wp:inline xmlns:a="http://schemas.openxmlformats.org/drawingml/2006/main" xmlns:pic="http://schemas.openxmlformats.org/drawingml/2006/picture">
             <wp:extent cx="5669280" cy="2680310"/>
-            <wp:docPr id="8" name="Picture 8" descr="Picture 8"/>
+            <wp:docPr id="6" name="Picture 6" descr="Picture 6"/>
             <wp:cNvGraphicFramePr>
               <a:graphicFrameLocks noChangeAspect="1"/>
             </wp:cNvGraphicFramePr>
@@ -2779,7 +2990,7 @@
                     <pic:cNvPicPr/>
                   </pic:nvPicPr>
                   <pic:blipFill>
-                    <a:blip r:embed="rId16"/>
+                    <a:blip r:embed="rId14"/>
                     <a:stretch>
                       <a:fillRect/>
                     </a:stretch>
@@ -2804,17 +3015,17 @@
         <w:pStyle w:val="Heading3"/>
       </w:pPr>
       <w:r>
-        <w:t>Compact biochemical summaries improve perturbation stability</w:t>
+        <w:t>Compact biochemical summaries reduce perturbation drift</w:t>
       </w:r>
     </w:p>
     <w:p>
       <w:r>
-        <w:t>The first main experimental block tested whether compact property-aware representations remained closer to their clean counterparts than identity-only baselines. Across the WGS-derived perturbation grid, CK4P-MSP and related property-aware compact representations retained high paired cosine and lower L2 drift while preserving nearest-clean retrieval. In the compact summary, CK4P-MSP achieved paired cosine around 0.991 with L2 drift around 0.116 at 222 features, whereas identity-only compact baselines showed higher drift under the same perturbation families.</w:t>
+        <w:t>The main compact-representation audit tested whether property-aware summaries remained closer to their clean counterparts than composition-only or compressed high-k baselines. Across the WGS-derived perturbation grid, CK4P-MSP retained paired cosine of 0.989 and mean L2 drift of 0.129 at 222 features, compared with 0.969 and 0.219 for CK4 (136 features) and 0.946 and 0.293 for CK5 (512 features). CK4+P was more globally stable than CK4P-MSP (paired cosine 0.996; drift 0.078), which is consistent with its role as a global property stability summary rather than a positional representation.</w:t>
       </w:r>
     </w:p>
     <w:p>
       <w:r>
-        <w:t>The same conclusion survived several fairness checks. Same-dimension PCA/SVD controls showed that the mixed compact result was not simply a consequence of using more features. Dimension-matched high-k compression controls further addressed whether a conventional high-specificity k-mer representation could recover the same behavior under the CK4P-MSP feature budget. In that audit, CK4P-MSP retained higher paired cosine and lower L2 drift than k=15 random projection, MinHash and hashed baselines at approximately 222 features (paired cosine 0.996 and L2 drift 0.078 for CK4P-MSP, compared with paired cosine 0.848, 0.841 and 0.794 and L2 drift 0.484, 0.506 and 0.572 for the three compressed high-k controls). Shallow readout differences were modest (logistic macro-F1 0.401 for CK4P-MSP versus 0.396 for the hashed k=15 control), so this result supports a compact perturbation-stability advantage rather than an end-to-end classifier claim. Paired Wilcoxon tests over matched analysis cells supported the stability differences for key comparisons after multiple-testing correction. Block-weight audits showed that stability and readout conclusions did not depend on one fixed identity/property weighting. P/MSP counterfactual controls further separated dimensionality from sequence-linked biochemical information: CK4 plus permuted P/MSP approached the stability of CK4P-MSP but did not reproduce its local delta-readout (macro-F1 0.875 versus 0.977), while CK4 plus Gaussian P/MSP collapsed both stability and readout. The P/MSP contribution audit further showed that CK4+P and CK4+MSP both reduced drift relative to CK4, while MSP accounted for most of the positional delta-readout gain. Together, these controls show that the stability trend is not explained by feature count, a single weighting choice or random auxiliary columns.</w:t>
+        <w:t>Dimension-matched high-k vector controls further addressed whether a conventional high-specificity k-mer representation could show the same behavior under the CK4P-MSP feature budget. At approximately 222 features, CK4P-MSP retained paired cosine 0.989 and L2 drift 0.129, compared with 0.821 and 0.524 for hashed k=15 counts and 0.868 and 0.447 for sparse random projection of k=15 counts. Shallow-readout differences were modest and did not favour CK4P-MSP over all high-k controls, so the result supports a compact perturbation-stability advantage rather than a predictive-performance claim. MinHash was assessed separately through its native estimated-versus-exact Jaccard agreement (mean estimated Jaccard 0.711, exact Jaccard 0.711, mean absolute error 0.021); it was not used as an L2-vector baseline. Paired Wilcoxon tests over matched analysis cells supported the primary stability contrasts after multiple-testing correction. Together, these controls show that the stability trend is not explained solely by feature count or by an arbitrary global feature projection.</w:t>
       </w:r>
     </w:p>
     <w:p>
@@ -2826,7 +3037,7 @@
         <w:rPr>
           <w:b/>
         </w:rPr>
-        <w:t>Figure 2. Compact stability under controlled perturbation.</w:t>
+        <w:t>Figure 3. CK4P-MSP stability-readout-dimension trade-off.</w:t>
       </w:r>
     </w:p>
     <w:p>
@@ -2837,8 +3048,8 @@
       <w:r>
         <w:drawing>
           <wp:inline xmlns:a="http://schemas.openxmlformats.org/drawingml/2006/main" xmlns:pic="http://schemas.openxmlformats.org/drawingml/2006/picture">
-            <wp:extent cx="5577840" cy="2519324"/>
-            <wp:docPr id="9" name="Picture 9" descr="Picture 9"/>
+            <wp:extent cx="5577840" cy="2914119"/>
+            <wp:docPr id="7" name="Picture 7" descr="Picture 7"/>
             <wp:cNvGraphicFramePr>
               <a:graphicFrameLocks noChangeAspect="1"/>
             </wp:cNvGraphicFramePr>
@@ -2846,11 +3057,11 @@
               <a:graphicData uri="http://schemas.openxmlformats.org/drawingml/2006/picture">
                 <pic:pic>
                   <pic:nvPicPr>
-                    <pic:cNvPr id="0" name="nature_fig2_compact_stability.jpg"/>
+                    <pic:cNvPr id="0" name="nature_fig3_ck4p_msp_tradeoff.jpg"/>
                     <pic:cNvPicPr/>
                   </pic:nvPicPr>
                   <pic:blipFill>
-                    <a:blip r:embed="rId17"/>
+                    <a:blip r:embed="rId15"/>
                     <a:stretch>
                       <a:fillRect/>
                     </a:stretch>
@@ -2858,7 +3069,7 @@
                   <pic:spPr>
                     <a:xfrm>
                       <a:off x="0" y="0"/>
-                      <a:ext cx="5577840" cy="2519324"/>
+                      <a:ext cx="5577840" cy="2914119"/>
                     </a:xfrm>
                     <a:prstGeom prst="rect"/>
                   </pic:spPr>
@@ -2891,7 +3102,7 @@
         <w:drawing>
           <wp:inline xmlns:a="http://schemas.openxmlformats.org/drawingml/2006/main" xmlns:pic="http://schemas.openxmlformats.org/drawingml/2006/picture">
             <wp:extent cx="5257800" cy="5681580"/>
-            <wp:docPr id="10" name="Picture 10" descr="Picture 10"/>
+            <wp:docPr id="8" name="Picture 8" descr="Picture 8"/>
             <wp:cNvGraphicFramePr>
               <a:graphicFrameLocks noChangeAspect="1"/>
             </wp:cNvGraphicFramePr>
@@ -2903,7 +3114,7 @@
                     <pic:cNvPicPr/>
                   </pic:nvPicPr>
                   <pic:blipFill>
-                    <a:blip r:embed="rId18"/>
+                    <a:blip r:embed="rId16"/>
                     <a:stretch>
                       <a:fillRect/>
                     </a:stretch>
@@ -2924,29 +3135,6 @@
     </w:p>
     <w:p/>
     <w:p>
-      <w:r>
-        <w:t>See Supplementary Figure S7.</w:t>
-      </w:r>
-    </w:p>
-    <w:p>
-      <w:pPr>
-        <w:pStyle w:val="Heading3"/>
-      </w:pPr>
-      <w:r>
-        <w:t>CK4P-MSP balances compactness, stability and shallow readout</w:t>
-      </w:r>
-    </w:p>
-    <w:p>
-      <w:r>
-        <w:t>We then evaluated CK4P-MSP as a nested ablation rather than as a standalone classifier. CK4 tested compact identity alone. CK4+P tested whether global biochemical summaries were sufficient. CK4+MSP tested whether positionalized property pooling carried information beyond identity without the global P block. CK4P-MSP tested whether the global and positional property layers together improved the trade-off between stability, dimensionality and shallow readout. This hierarchy is central to the method: the representation is intended to preserve exact identity evidence while adding interpretable biochemical and positional auxiliary channels.</w:t>
-      </w:r>
-    </w:p>
-    <w:p>
-      <w:r>
-        <w:t>The resulting trade-off supported the intended role. CK4P-MSP remained compact, reduced perturbation drift relative to CK4 and CK5 identity baselines, and retained competitive macro-F1 in shallow readout. It was not designed as a standalone readout model, and the manuscript should not describe it as one. Its value is that it occupies a stable and interpretable middle ground between identity-only compact features and high-dimensional full-position matrices.</w:t>
-      </w:r>
-    </w:p>
-    <w:p>
       <w:pPr>
         <w:pStyle w:val="Caption"/>
         <w:keepNext/>
@@ -2955,7 +3143,7 @@
         <w:rPr>
           <w:b/>
         </w:rPr>
-        <w:t>Figure 3. CK4P-MSP stability-readout-dimension trade-off.</w:t>
+        <w:t>Supplementary Figure S7. kNN MI robustness and dimension-matched high-k compressed baseline audit.</w:t>
       </w:r>
     </w:p>
     <w:p>
@@ -2966,8 +3154,8 @@
       <w:r>
         <w:drawing>
           <wp:inline xmlns:a="http://schemas.openxmlformats.org/drawingml/2006/main" xmlns:pic="http://schemas.openxmlformats.org/drawingml/2006/picture">
-            <wp:extent cx="5577840" cy="2914119"/>
-            <wp:docPr id="11" name="Picture 11" descr="Picture 11"/>
+            <wp:extent cx="5669280" cy="4078732"/>
+            <wp:docPr id="9" name="Picture 9" descr="Picture 9"/>
             <wp:cNvGraphicFramePr>
               <a:graphicFrameLocks noChangeAspect="1"/>
             </wp:cNvGraphicFramePr>
@@ -2975,11 +3163,11 @@
               <a:graphicData uri="http://schemas.openxmlformats.org/drawingml/2006/picture">
                 <pic:pic>
                   <pic:nvPicPr>
-                    <pic:cNvPr id="0" name="nature_fig3_ck4p_msp_tradeoff.jpg"/>
+                    <pic:cNvPr id="0" name="supp_fig_s7_method_hardening_audit.jpg"/>
                     <pic:cNvPicPr/>
                   </pic:nvPicPr>
                   <pic:blipFill>
-                    <a:blip r:embed="rId19"/>
+                    <a:blip r:embed="rId17"/>
                     <a:stretch>
                       <a:fillRect/>
                     </a:stretch>
@@ -2987,7 +3175,7 @@
                   <pic:spPr>
                     <a:xfrm>
                       <a:off x="0" y="0"/>
-                      <a:ext cx="5577840" cy="2914119"/>
+                      <a:ext cx="5669280" cy="4078732"/>
                     </a:xfrm>
                     <a:prstGeom prst="rect"/>
                   </pic:spPr>
@@ -2999,6 +3187,24 @@
       </w:r>
     </w:p>
     <w:p/>
+    <w:p>
+      <w:pPr>
+        <w:pStyle w:val="Heading3"/>
+      </w:pPr>
+      <w:r>
+        <w:t>CK4P-MSP balances compactness, stability and representation readability</w:t>
+      </w:r>
+    </w:p>
+    <w:p>
+      <w:r>
+        <w:t>We next evaluated CK4P-MSP as a compact trade-off rather than as a single-metric winner. The seven-group result showed why the complete representation contains all three blocks: property-only variants were numerically stable but weakened nearest-clean retrieval, P improved global stability after conditioning on K+MSP, and MSP improved local-change readout after conditioning on K+P. CK4P-MSP therefore preserves a compact canonical local-composition backbone while exposing global biochemical and coarse positional audit channels.</w:t>
+      </w:r>
+    </w:p>
+    <w:p>
+      <w:r>
+        <w:t>The resulting trade-off supported the intended role. CK4P-MSP remained compact, reduced perturbation drift relative to CK4 and CK5 composition baselines, retained near-perfect nearest-clean retrieval and preserved accessible local-change signal. Its role is to provide a block-decomposable audit coordinate system between composition-only compact features and high-dimensional full-position matrices, rather than to maximize predictive accuracy against learned embeddings.</w:t>
+      </w:r>
+    </w:p>
     <w:p>
       <w:pPr>
         <w:pStyle w:val="Caption"/>
@@ -3198,7 +3404,7 @@
                 <w:rFonts w:ascii="Times New Roman" w:hAnsi="Times New Roman"/>
                 <w:sz w:val="16"/>
               </w:rPr>
-              <w:t>0.935</w:t>
+              <w:t>0.969</w:t>
             </w:r>
           </w:p>
         </w:tc>
@@ -3222,7 +3428,7 @@
                 <w:rFonts w:ascii="Times New Roman" w:hAnsi="Times New Roman"/>
                 <w:sz w:val="16"/>
               </w:rPr>
-              <w:t>0.316</w:t>
+              <w:t>0.218</w:t>
             </w:r>
           </w:p>
         </w:tc>
@@ -3246,7 +3452,7 @@
                 <w:rFonts w:ascii="Times New Roman" w:hAnsi="Times New Roman"/>
                 <w:sz w:val="16"/>
               </w:rPr>
-              <w:t>0.378</w:t>
+              <w:t>0.390</w:t>
             </w:r>
           </w:p>
         </w:tc>
@@ -3320,7 +3526,7 @@
                 <w:rFonts w:ascii="Times New Roman" w:hAnsi="Times New Roman"/>
                 <w:sz w:val="16"/>
               </w:rPr>
-              <w:t>0.990</w:t>
+              <w:t>0.996</w:t>
             </w:r>
           </w:p>
         </w:tc>
@@ -3344,7 +3550,7 @@
                 <w:rFonts w:ascii="Times New Roman" w:hAnsi="Times New Roman"/>
                 <w:sz w:val="16"/>
               </w:rPr>
-              <w:t>0.122</w:t>
+              <w:t>0.078</w:t>
             </w:r>
           </w:p>
         </w:tc>
@@ -3368,7 +3574,7 @@
                 <w:rFonts w:ascii="Times New Roman" w:hAnsi="Times New Roman"/>
                 <w:sz w:val="16"/>
               </w:rPr>
-              <w:t>0.380</w:t>
+              <w:t>0.397</w:t>
             </w:r>
           </w:p>
         </w:tc>
@@ -3442,7 +3648,7 @@
                 <w:rFonts w:ascii="Times New Roman" w:hAnsi="Times New Roman"/>
                 <w:sz w:val="16"/>
               </w:rPr>
-              <w:t>0.991</w:t>
+              <w:t>0.989</w:t>
             </w:r>
           </w:p>
         </w:tc>
@@ -3466,7 +3672,7 @@
                 <w:rFonts w:ascii="Times New Roman" w:hAnsi="Times New Roman"/>
                 <w:sz w:val="16"/>
               </w:rPr>
-              <w:t>0.116</w:t>
+              <w:t>0.129</w:t>
             </w:r>
           </w:p>
         </w:tc>
@@ -3564,7 +3770,7 @@
                 <w:rFonts w:ascii="Times New Roman" w:hAnsi="Times New Roman"/>
                 <w:sz w:val="16"/>
               </w:rPr>
-              <w:t>0.882</w:t>
+              <w:t>0.946</w:t>
             </w:r>
           </w:p>
         </w:tc>
@@ -3588,7 +3794,7 @@
                 <w:rFonts w:ascii="Times New Roman" w:hAnsi="Times New Roman"/>
                 <w:sz w:val="16"/>
               </w:rPr>
-              <w:t>0.433</w:t>
+              <w:t>0.293</w:t>
             </w:r>
           </w:p>
         </w:tc>
@@ -3612,7 +3818,7 @@
                 <w:rFonts w:ascii="Times New Roman" w:hAnsi="Times New Roman"/>
                 <w:sz w:val="16"/>
               </w:rPr>
-              <w:t>0.373</w:t>
+              <w:t>0.377</w:t>
             </w:r>
           </w:p>
         </w:tc>
@@ -3653,17 +3859,7 @@
     </w:p>
     <w:p>
       <w:r>
-        <w:t>ART and CAMI were used to test whether the representation trend survived outside the handcrafted perturbation grid, while keeping stability and readout as separate questions. ART provided simulator-derived sequencing-error evidence: in the paired-cosine summary, property-aware and spaced-property representations retained higher clean-versus-perturbed similarity than the identity-only k-mer comparators (Figure 4A). CAMI_TOY_low provided an external metagenomic readout probe with two different granularities. A coarse target-versus-background task remained readable across compact representations (Figure 4B), whereas the 30-label fine probe was substantially lower in absolute macro-F1 (Figure 4C). Thus, the external CAMI result supports representation-level readability at a coarse task level, but it also shows that fine-grained label readout remains task-limited and should not be interpreted as production-grade taxonomic classification.</w:t>
-      </w:r>
-    </w:p>
-    <w:p>
-      <w:r>
-        <w:t>The quality-stratified ART audit complements this result by showing that simulator consistency persisted across read-quality bins. To test whether the compact-stability trend was restricted to CAMI_TOY_low, we added the CAMI II marine anonymous-read subset probe (Supplementary Figure S10). Across all nine combinations of length (69, 75 and 100 bp) and perturbation (N_3pct, substitution_1pct and substitution_1pct_N_3pct), CK4P-MSP had the lowest mean L2 drift among the tested compact representations and retained nearest-clean retrieval. Mean paired cosine for CK4P-MSP was approximately 0.995 under N masking, 0.998 under substitution and 0.992-0.993 under the combined perturbation, with mean L2 drift ranges of 0.095-0.102, 0.047-0.048 and 0.114-0.121, respectively. This result supports the external stability pattern in a more complex CAMI II metagenomic read source, while remaining a stability probe without read-level taxonomic labels in this lightweight analysis rather than a taxonomic validation.</w:t>
-      </w:r>
-    </w:p>
-    <w:p>
-      <w:r>
-        <w:t>Together, these analyses support external consistency under controlled simulator and benchmark resources, while preserving the manuscript boundary: ART supports simulator-derived stability consistency, CAMI_TOY_low supports external readability at a task-limited level, and CAMI II marine supports anonymous-read stability rather than taxonomic validation.</w:t>
+        <w:t>ART and CAMI were used to test whether the representation family showed consistent behavior outside the controlled WGS grid while keeping stability and readout as separate questions. Across the seven current-contract ART lengths, CK4P-MSP retained 0.58-0.60 of CK4 drift, while CK4+P and CK4+MSP retained approximately 0.70-0.73. This within-length ratio is emphasized because the simulator error load varied non-monotonically across cycle profiles. CAMI II marine supplied anonymous-read stability and CAMI_TOY_low supplied coarse and 30-label readability probes. Across nine CAMI II length-by-perturbation cells, mean drift was 0.144 for CK4P-MSP, compared with 0.175 for CK4+P, 0.243 for CK4 and 0.325 for CK5. In the CAMI_TOY_low binary target-versus-background probe, mean logistic macro-F1 was 0.863 for CK4P-MSP, 0.842 for CK4+P, 0.840 for CK4 and 0.857 for CK5. The advantage did not extend to the 30-label probe: mean logistic macro-F1 was low for every compact representation (0.229-0.244), with CK4P-MSP at 0.235. These results support simulator-derived stability and coarse external readability while identifying a fine-label boundary.</w:t>
       </w:r>
     </w:p>
     <w:p>
@@ -3687,7 +3883,7 @@
         <w:drawing>
           <wp:inline xmlns:a="http://schemas.openxmlformats.org/drawingml/2006/main" xmlns:pic="http://schemas.openxmlformats.org/drawingml/2006/picture">
             <wp:extent cx="5577840" cy="2521624"/>
-            <wp:docPr id="12" name="Picture 12" descr="Picture 12"/>
+            <wp:docPr id="10" name="Picture 10" descr="Picture 10"/>
             <wp:cNvGraphicFramePr>
               <a:graphicFrameLocks noChangeAspect="1"/>
             </wp:cNvGraphicFramePr>
@@ -3699,7 +3895,7 @@
                     <pic:cNvPicPr/>
                   </pic:nvPicPr>
                   <pic:blipFill>
-                    <a:blip r:embed="rId20"/>
+                    <a:blip r:embed="rId18"/>
                     <a:stretch>
                       <a:fillRect/>
                     </a:stretch>
@@ -3719,6 +3915,16 @@
       </w:r>
     </w:p>
     <w:p/>
+    <w:p>
+      <w:r>
+        <w:t>The quality-stratified ART audit and the CAMI II marine subset have different evidentiary roles. The former tests the current representation contract within simulator-derived read-length and quality strata; the latter applies controlled paired perturbations to anonymous public marine reads without reconstructing read-level taxonomic labels. Marine composition can differ materially from pathogen-rich or low-biomass mNGS sources, including in GC distribution and sequence complexity. The marine result therefore tests whether the stability ordering survives a composition-shifted public source; it is not external taxonomic validation.</w:t>
+      </w:r>
+    </w:p>
+    <w:p>
+      <w:r>
+        <w:t>Together, ART supports within-length simulator consistency, CAMI_TOY_low supports task-limited external readability, and CAMI II supports anonymous-read stability. The weak 30-label CAMI result prevents extrapolation to fine taxonomic assignment, while the current-contract coarse and stability results show that the controlled-grid pattern is not confined to one WGS-derived source.</w:t>
+      </w:r>
+    </w:p>
     <w:p>
       <w:pPr>
         <w:pStyle w:val="Caption"/>
@@ -3740,7 +3946,7 @@
         <w:drawing>
           <wp:inline xmlns:a="http://schemas.openxmlformats.org/drawingml/2006/main" xmlns:pic="http://schemas.openxmlformats.org/drawingml/2006/picture">
             <wp:extent cx="5257800" cy="4646707"/>
-            <wp:docPr id="13" name="Picture 13" descr="Picture 13"/>
+            <wp:docPr id="11" name="Picture 11" descr="Picture 11"/>
             <wp:cNvGraphicFramePr>
               <a:graphicFrameLocks noChangeAspect="1"/>
             </wp:cNvGraphicFramePr>
@@ -3752,7 +3958,7 @@
                     <pic:cNvPicPr/>
                   </pic:nvPicPr>
                   <pic:blipFill>
-                    <a:blip r:embed="rId21"/>
+                    <a:blip r:embed="rId19"/>
                     <a:stretch>
                       <a:fillRect/>
                     </a:stretch>
@@ -3786,11 +3992,6 @@
       </w:r>
     </w:p>
     <w:p>
-      <w:r>
-        <w:t>The result is best interpreted as an upper-bound diagnostic. Full-position matrices clarify the value of positional information, but their high dimensionality and task specificity make them unsuitable as the default representation for compact short-read auditing. CK4P-MSP therefore occupies a different role: it does not match the full positional upper bound, but it recovers part of the positional information at a much smaller feature cost.</w:t>
-      </w:r>
-    </w:p>
-    <w:p>
       <w:pPr>
         <w:pStyle w:val="Caption"/>
         <w:keepNext/>
@@ -3811,7 +4012,7 @@
         <w:drawing>
           <wp:inline xmlns:a="http://schemas.openxmlformats.org/drawingml/2006/main" xmlns:pic="http://schemas.openxmlformats.org/drawingml/2006/picture">
             <wp:extent cx="5577840" cy="2873246"/>
-            <wp:docPr id="14" name="Picture 14" descr="Picture 14"/>
+            <wp:docPr id="12" name="Picture 12" descr="Picture 12"/>
             <wp:cNvGraphicFramePr>
               <a:graphicFrameLocks noChangeAspect="1"/>
             </wp:cNvGraphicFramePr>
@@ -3823,7 +4024,7 @@
                     <pic:cNvPicPr/>
                   </pic:nvPicPr>
                   <pic:blipFill>
-                    <a:blip r:embed="rId22"/>
+                    <a:blip r:embed="rId20"/>
                     <a:stretch>
                       <a:fillRect/>
                     </a:stretch>
@@ -3844,6 +4045,11 @@
     </w:p>
     <w:p/>
     <w:p>
+      <w:r>
+        <w:t>The result is best interpreted as an upper-bound diagnostic. Full-position matrices clarify the value of positional information, but their high dimensionality and task specificity make them unsuitable as the default representation for compact short-read auditing. CK4P-MSP therefore occupies a different role: it does not match the full positional upper bound, but it retains a coarse positional property summary at a much smaller feature cost.</w:t>
+      </w:r>
+    </w:p>
+    <w:p>
       <w:pPr>
         <w:pStyle w:val="Heading3"/>
       </w:pPr>
@@ -3853,12 +4059,7 @@
     </w:p>
     <w:p>
       <w:r>
-        <w:t>A robust representation should not be insensitive to all changes. We therefore tested whether local biochemical change remained distinguishable from matched nuisance perturbation. Property-aware and full-position channels showed larger response to structured local mutation than to matched noise in the relevant comparisons, while CK4P-MSP preserved delta-readout at compact dimensionality. The P/MSP counterfactual audit sharpened this result by showing that the real biochemical mapping, not only extra columns, was needed to obtain the strongest local-change readout.</w:t>
-      </w:r>
-    </w:p>
-    <w:p>
-      <w:r>
-        <w:t>This result supports a division of labor. Paired cosine and L2 drift quantify nuisance stability, whereas selective-sensitivity ratios and delta-readout quantify whether structured local changes remain readable. CK4P-MSP is therefore not merely a smoothed representation. It can remain stable under nuisance perturbation while preserving enough auxiliary information for local-change readout.</w:t>
+        <w:t>A stable audit representation should remain responsive to structured changes, but the relevant notion of responsiveness depends on the metric. We therefore tested whether local biochemical change remained distinguishable from matched nuisance perturbation. In a distance-ratio analysis, CK4P-MSP did not exceed CK4: its local-mutation/random-noise L2 ratio was 0.752 compared with 0.750 for CK4. Full-position and property-channel representations were stronger distance-amplification probes. CK4P-MSP's positive result was different: it retained high grouped delta-readout at compact dimensionality, with local-versus-noise macro-F1 of 0.979. The seven-group ablation assigned most of this local-readout increment to MSP, while P contributed primarily to global stability and K to nearest-clean retrieval.</w:t>
       </w:r>
     </w:p>
     <w:p>
@@ -3882,7 +4083,7 @@
         <w:drawing>
           <wp:inline xmlns:a="http://schemas.openxmlformats.org/drawingml/2006/main" xmlns:pic="http://schemas.openxmlformats.org/drawingml/2006/picture">
             <wp:extent cx="5577840" cy="3083306"/>
-            <wp:docPr id="15" name="Picture 15" descr="Picture 15"/>
+            <wp:docPr id="13" name="Picture 13" descr="Picture 13"/>
             <wp:cNvGraphicFramePr>
               <a:graphicFrameLocks noChangeAspect="1"/>
             </wp:cNvGraphicFramePr>
@@ -3894,7 +4095,7 @@
                     <pic:cNvPicPr/>
                   </pic:nvPicPr>
                   <pic:blipFill>
-                    <a:blip r:embed="rId23"/>
+                    <a:blip r:embed="rId21"/>
                     <a:stretch>
                       <a:fillRect/>
                     </a:stretch>
@@ -3915,6 +4116,16 @@
     </w:p>
     <w:p/>
     <w:p>
+      <w:r>
+        <w:t>[Insert FloatBarrier here.]</w:t>
+      </w:r>
+    </w:p>
+    <w:p>
+      <w:r>
+        <w:t>This result supports a division of labour. Paired cosine and L2 drift quantify nuisance stability, distance ratios identify upper-bound local-change probes, and grouped delta-readout asks whether structured local changes remain accessible without template leakage. CK4P-MSP should therefore not be described as a distance-amplifying mutation detector. Its value in this analysis is that it remains stable relative to CK4/CK5 while preserving decomposable information for local-change readout at much lower dimensionality than full-position matrices.</w:t>
+      </w:r>
+    </w:p>
+    <w:p>
       <w:pPr>
         <w:pStyle w:val="Caption"/>
         <w:keepNext/>
@@ -3929,24 +4140,23 @@
     <w:tbl>
       <w:tblPr>
         <w:tblStyle w:val="TableGrid"/>
-        <w:tblW w:type="dxa" w:w="9359"/>
+        <w:tblW w:type="dxa" w:w="9360"/>
         <w:jc w:val="center"/>
         <w:tblLayout w:type="fixed"/>
         <w:tblLook w:firstColumn="1" w:firstRow="1" w:lastColumn="0" w:lastRow="0" w:noHBand="0" w:noVBand="1" w:val="04A0"/>
       </w:tblPr>
       <w:tblGrid>
-        <w:gridCol w:w="1337"/>
-        <w:gridCol w:w="1337"/>
-        <w:gridCol w:w="1337"/>
-        <w:gridCol w:w="1337"/>
-        <w:gridCol w:w="1337"/>
-        <w:gridCol w:w="1337"/>
-        <w:gridCol w:w="1337"/>
+        <w:gridCol w:w="1560"/>
+        <w:gridCol w:w="1560"/>
+        <w:gridCol w:w="1560"/>
+        <w:gridCol w:w="1560"/>
+        <w:gridCol w:w="1560"/>
+        <w:gridCol w:w="1560"/>
       </w:tblGrid>
       <w:tr>
         <w:tc>
           <w:tcPr>
-            <w:tcW w:type="dxa" w:w="1337"/>
+            <w:tcW w:type="dxa" w:w="1560"/>
             <w:shd w:fill="F2F4F7"/>
             <w:vAlign w:val="center"/>
             <w:tcMar>
@@ -3971,132 +4181,7 @@
         </w:tc>
         <w:tc>
           <w:tcPr>
-            <w:tcW w:type="dxa" w:w="1337"/>
-            <w:shd w:fill="F2F4F7"/>
-            <w:vAlign w:val="center"/>
-            <w:tcMar>
-              <w:top w:w="80" w:type="dxa"/>
-              <w:start w:w="120" w:type="dxa"/>
-              <w:bottom w:w="80" w:type="dxa"/>
-              <w:end w:w="120" w:type="dxa"/>
-            </w:tcMar>
-          </w:tcPr>
-          <w:p>
-            <w:pPr>
-              <w:spacing w:after="0" w:line="240" w:lineRule="auto"/>
-            </w:pPr>
-            <w:r>
-              <w:rPr>
-                <w:rFonts w:ascii="Times New Roman" w:hAnsi="Times New Roman"/>
-                <w:sz w:val="16"/>
-              </w:rPr>
-              <w:t>noise L2</w:t>
-            </w:r>
-          </w:p>
-        </w:tc>
-        <w:tc>
-          <w:tcPr>
-            <w:tcW w:type="dxa" w:w="1337"/>
-            <w:shd w:fill="F2F4F7"/>
-            <w:vAlign w:val="center"/>
-            <w:tcMar>
-              <w:top w:w="80" w:type="dxa"/>
-              <w:start w:w="120" w:type="dxa"/>
-              <w:bottom w:w="80" w:type="dxa"/>
-              <w:end w:w="120" w:type="dxa"/>
-            </w:tcMar>
-          </w:tcPr>
-          <w:p>
-            <w:pPr>
-              <w:spacing w:after="0" w:line="240" w:lineRule="auto"/>
-            </w:pPr>
-            <w:r>
-              <w:rPr>
-                <w:rFonts w:ascii="Times New Roman" w:hAnsi="Times New Roman"/>
-                <w:sz w:val="16"/>
-              </w:rPr>
-              <w:t>local L2</w:t>
-            </w:r>
-          </w:p>
-        </w:tc>
-        <w:tc>
-          <w:tcPr>
-            <w:tcW w:type="dxa" w:w="1337"/>
-            <w:shd w:fill="F2F4F7"/>
-            <w:vAlign w:val="center"/>
-            <w:tcMar>
-              <w:top w:w="80" w:type="dxa"/>
-              <w:start w:w="120" w:type="dxa"/>
-              <w:bottom w:w="80" w:type="dxa"/>
-              <w:end w:w="120" w:type="dxa"/>
-            </w:tcMar>
-          </w:tcPr>
-          <w:p>
-            <w:pPr>
-              <w:spacing w:after="0" w:line="240" w:lineRule="auto"/>
-            </w:pPr>
-            <w:r>
-              <w:rPr>
-                <w:rFonts w:ascii="Times New Roman" w:hAnsi="Times New Roman"/>
-                <w:sz w:val="16"/>
-              </w:rPr>
-              <w:t>local - noise L2</w:t>
-            </w:r>
-          </w:p>
-        </w:tc>
-        <w:tc>
-          <w:tcPr>
-            <w:tcW w:type="dxa" w:w="1337"/>
-            <w:shd w:fill="F2F4F7"/>
-            <w:vAlign w:val="center"/>
-            <w:tcMar>
-              <w:top w:w="80" w:type="dxa"/>
-              <w:start w:w="120" w:type="dxa"/>
-              <w:bottom w:w="80" w:type="dxa"/>
-              <w:end w:w="120" w:type="dxa"/>
-            </w:tcMar>
-          </w:tcPr>
-          <w:p>
-            <w:pPr>
-              <w:spacing w:after="0" w:line="240" w:lineRule="auto"/>
-            </w:pPr>
-            <w:r>
-              <w:rPr>
-                <w:rFonts w:ascii="Times New Roman" w:hAnsi="Times New Roman"/>
-                <w:sz w:val="16"/>
-              </w:rPr>
-              <w:t>sensitivity ratio</w:t>
-            </w:r>
-          </w:p>
-        </w:tc>
-        <w:tc>
-          <w:tcPr>
-            <w:tcW w:type="dxa" w:w="1337"/>
-            <w:shd w:fill="F2F4F7"/>
-            <w:vAlign w:val="center"/>
-            <w:tcMar>
-              <w:top w:w="80" w:type="dxa"/>
-              <w:start w:w="120" w:type="dxa"/>
-              <w:bottom w:w="80" w:type="dxa"/>
-              <w:end w:w="120" w:type="dxa"/>
-            </w:tcMar>
-          </w:tcPr>
-          <w:p>
-            <w:pPr>
-              <w:spacing w:after="0" w:line="240" w:lineRule="auto"/>
-            </w:pPr>
-            <w:r>
-              <w:rPr>
-                <w:rFonts w:ascii="Times New Roman" w:hAnsi="Times New Roman"/>
-                <w:sz w:val="16"/>
-              </w:rPr>
-              <w:t>delta-readout macro-F1</w:t>
-            </w:r>
-          </w:p>
-        </w:tc>
-        <w:tc>
-          <w:tcPr>
-            <w:tcW w:type="dxa" w:w="1337"/>
+            <w:tcW w:type="dxa" w:w="1560"/>
             <w:shd w:fill="F2F4F7"/>
             <w:vAlign w:val="center"/>
             <w:tcMar>
@@ -4119,11 +4204,111 @@
             </w:r>
           </w:p>
         </w:tc>
+        <w:tc>
+          <w:tcPr>
+            <w:tcW w:type="dxa" w:w="1560"/>
+            <w:shd w:fill="F2F4F7"/>
+            <w:vAlign w:val="center"/>
+            <w:tcMar>
+              <w:top w:w="80" w:type="dxa"/>
+              <w:start w:w="120" w:type="dxa"/>
+              <w:bottom w:w="80" w:type="dxa"/>
+              <w:end w:w="120" w:type="dxa"/>
+            </w:tcMar>
+          </w:tcPr>
+          <w:p>
+            <w:pPr>
+              <w:spacing w:after="0" w:line="240" w:lineRule="auto"/>
+            </w:pPr>
+            <w:r>
+              <w:rPr>
+                <w:rFonts w:ascii="Times New Roman" w:hAnsi="Times New Roman"/>
+                <w:sz w:val="16"/>
+              </w:rPr>
+              <w:t>L2 drift</w:t>
+            </w:r>
+          </w:p>
+        </w:tc>
+        <w:tc>
+          <w:tcPr>
+            <w:tcW w:type="dxa" w:w="1560"/>
+            <w:shd w:fill="F2F4F7"/>
+            <w:vAlign w:val="center"/>
+            <w:tcMar>
+              <w:top w:w="80" w:type="dxa"/>
+              <w:start w:w="120" w:type="dxa"/>
+              <w:bottom w:w="80" w:type="dxa"/>
+              <w:end w:w="120" w:type="dxa"/>
+            </w:tcMar>
+          </w:tcPr>
+          <w:p>
+            <w:pPr>
+              <w:spacing w:after="0" w:line="240" w:lineRule="auto"/>
+            </w:pPr>
+            <w:r>
+              <w:rPr>
+                <w:rFonts w:ascii="Times New Roman" w:hAnsi="Times New Roman"/>
+                <w:sz w:val="16"/>
+              </w:rPr>
+              <w:t>nearest-clean retrieval</w:t>
+            </w:r>
+          </w:p>
+        </w:tc>
+        <w:tc>
+          <w:tcPr>
+            <w:tcW w:type="dxa" w:w="1560"/>
+            <w:shd w:fill="F2F4F7"/>
+            <w:vAlign w:val="center"/>
+            <w:tcMar>
+              <w:top w:w="80" w:type="dxa"/>
+              <w:start w:w="120" w:type="dxa"/>
+              <w:bottom w:w="80" w:type="dxa"/>
+              <w:end w:w="120" w:type="dxa"/>
+            </w:tcMar>
+          </w:tcPr>
+          <w:p>
+            <w:pPr>
+              <w:spacing w:after="0" w:line="240" w:lineRule="auto"/>
+            </w:pPr>
+            <w:r>
+              <w:rPr>
+                <w:rFonts w:ascii="Times New Roman" w:hAnsi="Times New Roman"/>
+                <w:sz w:val="16"/>
+              </w:rPr>
+              <w:t>grouped delta-readout macro-F1</w:t>
+            </w:r>
+          </w:p>
+        </w:tc>
+        <w:tc>
+          <w:tcPr>
+            <w:tcW w:type="dxa" w:w="1560"/>
+            <w:shd w:fill="F2F4F7"/>
+            <w:vAlign w:val="center"/>
+            <w:tcMar>
+              <w:top w:w="80" w:type="dxa"/>
+              <w:start w:w="120" w:type="dxa"/>
+              <w:bottom w:w="80" w:type="dxa"/>
+              <w:end w:w="120" w:type="dxa"/>
+            </w:tcMar>
+          </w:tcPr>
+          <w:p>
+            <w:pPr>
+              <w:spacing w:after="0" w:line="240" w:lineRule="auto"/>
+            </w:pPr>
+            <w:r>
+              <w:rPr>
+                <w:rFonts w:ascii="Times New Roman" w:hAnsi="Times New Roman"/>
+                <w:sz w:val="16"/>
+              </w:rPr>
+              <w:t>observed audit role</w:t>
+            </w:r>
+          </w:p>
+        </w:tc>
       </w:tr>
       <w:tr>
         <w:tc>
           <w:tcPr>
-            <w:tcW w:type="dxa" w:w="1337"/>
+            <w:tcW w:type="dxa" w:w="1560"/>
             <w:vAlign w:val="center"/>
             <w:tcMar>
               <w:top w:w="80" w:type="dxa"/>
@@ -4147,127 +4332,7 @@
         </w:tc>
         <w:tc>
           <w:tcPr>
-            <w:tcW w:type="dxa" w:w="1337"/>
-            <w:vAlign w:val="center"/>
-            <w:tcMar>
-              <w:top w:w="80" w:type="dxa"/>
-              <w:start w:w="120" w:type="dxa"/>
-              <w:bottom w:w="80" w:type="dxa"/>
-              <w:end w:w="120" w:type="dxa"/>
-            </w:tcMar>
-          </w:tcPr>
-          <w:p>
-            <w:pPr>
-              <w:spacing w:after="0" w:line="240" w:lineRule="auto"/>
-            </w:pPr>
-            <w:r>
-              <w:rPr>
-                <w:rFonts w:ascii="Times New Roman" w:hAnsi="Times New Roman"/>
-                <w:sz w:val="16"/>
-              </w:rPr>
-              <w:t>0.355</w:t>
-            </w:r>
-          </w:p>
-        </w:tc>
-        <w:tc>
-          <w:tcPr>
-            <w:tcW w:type="dxa" w:w="1337"/>
-            <w:vAlign w:val="center"/>
-            <w:tcMar>
-              <w:top w:w="80" w:type="dxa"/>
-              <w:start w:w="120" w:type="dxa"/>
-              <w:bottom w:w="80" w:type="dxa"/>
-              <w:end w:w="120" w:type="dxa"/>
-            </w:tcMar>
-          </w:tcPr>
-          <w:p>
-            <w:pPr>
-              <w:spacing w:after="0" w:line="240" w:lineRule="auto"/>
-            </w:pPr>
-            <w:r>
-              <w:rPr>
-                <w:rFonts w:ascii="Times New Roman" w:hAnsi="Times New Roman"/>
-                <w:sz w:val="16"/>
-              </w:rPr>
-              <w:t>0.266</w:t>
-            </w:r>
-          </w:p>
-        </w:tc>
-        <w:tc>
-          <w:tcPr>
-            <w:tcW w:type="dxa" w:w="1337"/>
-            <w:vAlign w:val="center"/>
-            <w:tcMar>
-              <w:top w:w="80" w:type="dxa"/>
-              <w:start w:w="120" w:type="dxa"/>
-              <w:bottom w:w="80" w:type="dxa"/>
-              <w:end w:w="120" w:type="dxa"/>
-            </w:tcMar>
-          </w:tcPr>
-          <w:p>
-            <w:pPr>
-              <w:spacing w:after="0" w:line="240" w:lineRule="auto"/>
-            </w:pPr>
-            <w:r>
-              <w:rPr>
-                <w:rFonts w:ascii="Times New Roman" w:hAnsi="Times New Roman"/>
-                <w:sz w:val="16"/>
-              </w:rPr>
-              <w:t>-0.089</w:t>
-            </w:r>
-          </w:p>
-        </w:tc>
-        <w:tc>
-          <w:tcPr>
-            <w:tcW w:type="dxa" w:w="1337"/>
-            <w:vAlign w:val="center"/>
-            <w:tcMar>
-              <w:top w:w="80" w:type="dxa"/>
-              <w:start w:w="120" w:type="dxa"/>
-              <w:bottom w:w="80" w:type="dxa"/>
-              <w:end w:w="120" w:type="dxa"/>
-            </w:tcMar>
-          </w:tcPr>
-          <w:p>
-            <w:pPr>
-              <w:spacing w:after="0" w:line="240" w:lineRule="auto"/>
-            </w:pPr>
-            <w:r>
-              <w:rPr>
-                <w:rFonts w:ascii="Times New Roman" w:hAnsi="Times New Roman"/>
-                <w:sz w:val="16"/>
-              </w:rPr>
-              <w:t>0.750</w:t>
-            </w:r>
-          </w:p>
-        </w:tc>
-        <w:tc>
-          <w:tcPr>
-            <w:tcW w:type="dxa" w:w="1337"/>
-            <w:vAlign w:val="center"/>
-            <w:tcMar>
-              <w:top w:w="80" w:type="dxa"/>
-              <w:start w:w="120" w:type="dxa"/>
-              <w:bottom w:w="80" w:type="dxa"/>
-              <w:end w:w="120" w:type="dxa"/>
-            </w:tcMar>
-          </w:tcPr>
-          <w:p>
-            <w:pPr>
-              <w:spacing w:after="0" w:line="240" w:lineRule="auto"/>
-            </w:pPr>
-            <w:r>
-              <w:rPr>
-                <w:rFonts w:ascii="Times New Roman" w:hAnsi="Times New Roman"/>
-                <w:sz w:val="16"/>
-              </w:rPr>
-              <w:t>0.891</w:t>
-            </w:r>
-          </w:p>
-        </w:tc>
-        <w:tc>
-          <w:tcPr>
-            <w:tcW w:type="dxa" w:w="1337"/>
+            <w:tcW w:type="dxa" w:w="1560"/>
             <w:vAlign w:val="center"/>
             <w:tcMar>
               <w:top w:w="80" w:type="dxa"/>
@@ -4289,11 +4354,399 @@
             </w:r>
           </w:p>
         </w:tc>
+        <w:tc>
+          <w:tcPr>
+            <w:tcW w:type="dxa" w:w="1560"/>
+            <w:vAlign w:val="center"/>
+            <w:tcMar>
+              <w:top w:w="80" w:type="dxa"/>
+              <w:start w:w="120" w:type="dxa"/>
+              <w:bottom w:w="80" w:type="dxa"/>
+              <w:end w:w="120" w:type="dxa"/>
+            </w:tcMar>
+          </w:tcPr>
+          <w:p>
+            <w:pPr>
+              <w:spacing w:after="0" w:line="240" w:lineRule="auto"/>
+            </w:pPr>
+            <w:r>
+              <w:rPr>
+                <w:rFonts w:ascii="Times New Roman" w:hAnsi="Times New Roman"/>
+                <w:sz w:val="16"/>
+              </w:rPr>
+              <w:t>0.218</w:t>
+            </w:r>
+          </w:p>
+        </w:tc>
+        <w:tc>
+          <w:tcPr>
+            <w:tcW w:type="dxa" w:w="1560"/>
+            <w:vAlign w:val="center"/>
+            <w:tcMar>
+              <w:top w:w="80" w:type="dxa"/>
+              <w:start w:w="120" w:type="dxa"/>
+              <w:bottom w:w="80" w:type="dxa"/>
+              <w:end w:w="120" w:type="dxa"/>
+            </w:tcMar>
+          </w:tcPr>
+          <w:p>
+            <w:pPr>
+              <w:spacing w:after="0" w:line="240" w:lineRule="auto"/>
+            </w:pPr>
+            <w:r>
+              <w:rPr>
+                <w:rFonts w:ascii="Times New Roman" w:hAnsi="Times New Roman"/>
+                <w:sz w:val="16"/>
+              </w:rPr>
+              <w:t>1.000</w:t>
+            </w:r>
+          </w:p>
+        </w:tc>
+        <w:tc>
+          <w:tcPr>
+            <w:tcW w:type="dxa" w:w="1560"/>
+            <w:vAlign w:val="center"/>
+            <w:tcMar>
+              <w:top w:w="80" w:type="dxa"/>
+              <w:start w:w="120" w:type="dxa"/>
+              <w:bottom w:w="80" w:type="dxa"/>
+              <w:end w:w="120" w:type="dxa"/>
+            </w:tcMar>
+          </w:tcPr>
+          <w:p>
+            <w:pPr>
+              <w:spacing w:after="0" w:line="240" w:lineRule="auto"/>
+            </w:pPr>
+            <w:r>
+              <w:rPr>
+                <w:rFonts w:ascii="Times New Roman" w:hAnsi="Times New Roman"/>
+                <w:sz w:val="16"/>
+              </w:rPr>
+              <w:t>0.892</w:t>
+            </w:r>
+          </w:p>
+        </w:tc>
+        <w:tc>
+          <w:tcPr>
+            <w:tcW w:type="dxa" w:w="1560"/>
+            <w:vAlign w:val="center"/>
+            <w:tcMar>
+              <w:top w:w="80" w:type="dxa"/>
+              <w:start w:w="120" w:type="dxa"/>
+              <w:bottom w:w="80" w:type="dxa"/>
+              <w:end w:w="120" w:type="dxa"/>
+            </w:tcMar>
+          </w:tcPr>
+          <w:p>
+            <w:pPr>
+              <w:spacing w:after="0" w:line="240" w:lineRule="auto"/>
+            </w:pPr>
+            <w:r>
+              <w:rPr>
+                <w:rFonts w:ascii="Times New Roman" w:hAnsi="Times New Roman"/>
+                <w:sz w:val="16"/>
+              </w:rPr>
+              <w:t>local composition and identity-linked retrieval</w:t>
+            </w:r>
+          </w:p>
+        </w:tc>
       </w:tr>
       <w:tr>
         <w:tc>
           <w:tcPr>
-            <w:tcW w:type="dxa" w:w="1337"/>
+            <w:tcW w:type="dxa" w:w="1560"/>
+            <w:vAlign w:val="center"/>
+            <w:tcMar>
+              <w:top w:w="80" w:type="dxa"/>
+              <w:start w:w="120" w:type="dxa"/>
+              <w:bottom w:w="80" w:type="dxa"/>
+              <w:end w:w="120" w:type="dxa"/>
+            </w:tcMar>
+          </w:tcPr>
+          <w:p>
+            <w:pPr>
+              <w:spacing w:after="0" w:line="240" w:lineRule="auto"/>
+            </w:pPr>
+            <w:r>
+              <w:rPr>
+                <w:rFonts w:ascii="Times New Roman" w:hAnsi="Times New Roman"/>
+                <w:sz w:val="16"/>
+              </w:rPr>
+              <w:t>P</w:t>
+            </w:r>
+          </w:p>
+        </w:tc>
+        <w:tc>
+          <w:tcPr>
+            <w:tcW w:type="dxa" w:w="1560"/>
+            <w:vAlign w:val="center"/>
+            <w:tcMar>
+              <w:top w:w="80" w:type="dxa"/>
+              <w:start w:w="120" w:type="dxa"/>
+              <w:bottom w:w="80" w:type="dxa"/>
+              <w:end w:w="120" w:type="dxa"/>
+            </w:tcMar>
+          </w:tcPr>
+          <w:p>
+            <w:pPr>
+              <w:spacing w:after="0" w:line="240" w:lineRule="auto"/>
+            </w:pPr>
+            <w:r>
+              <w:rPr>
+                <w:rFonts w:ascii="Times New Roman" w:hAnsi="Times New Roman"/>
+                <w:sz w:val="16"/>
+              </w:rPr>
+              <w:t>11</w:t>
+            </w:r>
+          </w:p>
+        </w:tc>
+        <w:tc>
+          <w:tcPr>
+            <w:tcW w:type="dxa" w:w="1560"/>
+            <w:vAlign w:val="center"/>
+            <w:tcMar>
+              <w:top w:w="80" w:type="dxa"/>
+              <w:start w:w="120" w:type="dxa"/>
+              <w:bottom w:w="80" w:type="dxa"/>
+              <w:end w:w="120" w:type="dxa"/>
+            </w:tcMar>
+          </w:tcPr>
+          <w:p>
+            <w:pPr>
+              <w:spacing w:after="0" w:line="240" w:lineRule="auto"/>
+            </w:pPr>
+            <w:r>
+              <w:rPr>
+                <w:rFonts w:ascii="Times New Roman" w:hAnsi="Times New Roman"/>
+                <w:sz w:val="16"/>
+              </w:rPr>
+              <w:t>0.025</w:t>
+            </w:r>
+          </w:p>
+        </w:tc>
+        <w:tc>
+          <w:tcPr>
+            <w:tcW w:type="dxa" w:w="1560"/>
+            <w:vAlign w:val="center"/>
+            <w:tcMar>
+              <w:top w:w="80" w:type="dxa"/>
+              <w:start w:w="120" w:type="dxa"/>
+              <w:bottom w:w="80" w:type="dxa"/>
+              <w:end w:w="120" w:type="dxa"/>
+            </w:tcMar>
+          </w:tcPr>
+          <w:p>
+            <w:pPr>
+              <w:spacing w:after="0" w:line="240" w:lineRule="auto"/>
+            </w:pPr>
+            <w:r>
+              <w:rPr>
+                <w:rFonts w:ascii="Times New Roman" w:hAnsi="Times New Roman"/>
+                <w:sz w:val="16"/>
+              </w:rPr>
+              <w:t>0.295</w:t>
+            </w:r>
+          </w:p>
+        </w:tc>
+        <w:tc>
+          <w:tcPr>
+            <w:tcW w:type="dxa" w:w="1560"/>
+            <w:vAlign w:val="center"/>
+            <w:tcMar>
+              <w:top w:w="80" w:type="dxa"/>
+              <w:start w:w="120" w:type="dxa"/>
+              <w:bottom w:w="80" w:type="dxa"/>
+              <w:end w:w="120" w:type="dxa"/>
+            </w:tcMar>
+          </w:tcPr>
+          <w:p>
+            <w:pPr>
+              <w:spacing w:after="0" w:line="240" w:lineRule="auto"/>
+            </w:pPr>
+            <w:r>
+              <w:rPr>
+                <w:rFonts w:ascii="Times New Roman" w:hAnsi="Times New Roman"/>
+                <w:sz w:val="16"/>
+              </w:rPr>
+              <w:t>0.639</w:t>
+            </w:r>
+          </w:p>
+        </w:tc>
+        <w:tc>
+          <w:tcPr>
+            <w:tcW w:type="dxa" w:w="1560"/>
+            <w:vAlign w:val="center"/>
+            <w:tcMar>
+              <w:top w:w="80" w:type="dxa"/>
+              <w:start w:w="120" w:type="dxa"/>
+              <w:bottom w:w="80" w:type="dxa"/>
+              <w:end w:w="120" w:type="dxa"/>
+            </w:tcMar>
+          </w:tcPr>
+          <w:p>
+            <w:pPr>
+              <w:spacing w:after="0" w:line="240" w:lineRule="auto"/>
+            </w:pPr>
+            <w:r>
+              <w:rPr>
+                <w:rFonts w:ascii="Times New Roman" w:hAnsi="Times New Roman"/>
+                <w:sz w:val="16"/>
+              </w:rPr>
+              <w:t>global property stability without identity retention</w:t>
+            </w:r>
+          </w:p>
+        </w:tc>
+      </w:tr>
+      <w:tr>
+        <w:tc>
+          <w:tcPr>
+            <w:tcW w:type="dxa" w:w="1560"/>
+            <w:vAlign w:val="center"/>
+            <w:tcMar>
+              <w:top w:w="80" w:type="dxa"/>
+              <w:start w:w="120" w:type="dxa"/>
+              <w:bottom w:w="80" w:type="dxa"/>
+              <w:end w:w="120" w:type="dxa"/>
+            </w:tcMar>
+          </w:tcPr>
+          <w:p>
+            <w:pPr>
+              <w:spacing w:after="0" w:line="240" w:lineRule="auto"/>
+            </w:pPr>
+            <w:r>
+              <w:rPr>
+                <w:rFonts w:ascii="Times New Roman" w:hAnsi="Times New Roman"/>
+                <w:sz w:val="16"/>
+              </w:rPr>
+              <w:t>MSP</w:t>
+            </w:r>
+          </w:p>
+        </w:tc>
+        <w:tc>
+          <w:tcPr>
+            <w:tcW w:type="dxa" w:w="1560"/>
+            <w:vAlign w:val="center"/>
+            <w:tcMar>
+              <w:top w:w="80" w:type="dxa"/>
+              <w:start w:w="120" w:type="dxa"/>
+              <w:bottom w:w="80" w:type="dxa"/>
+              <w:end w:w="120" w:type="dxa"/>
+            </w:tcMar>
+          </w:tcPr>
+          <w:p>
+            <w:pPr>
+              <w:spacing w:after="0" w:line="240" w:lineRule="auto"/>
+            </w:pPr>
+            <w:r>
+              <w:rPr>
+                <w:rFonts w:ascii="Times New Roman" w:hAnsi="Times New Roman"/>
+                <w:sz w:val="16"/>
+              </w:rPr>
+              <w:t>75</w:t>
+            </w:r>
+          </w:p>
+        </w:tc>
+        <w:tc>
+          <w:tcPr>
+            <w:tcW w:type="dxa" w:w="1560"/>
+            <w:vAlign w:val="center"/>
+            <w:tcMar>
+              <w:top w:w="80" w:type="dxa"/>
+              <w:start w:w="120" w:type="dxa"/>
+              <w:bottom w:w="80" w:type="dxa"/>
+              <w:end w:w="120" w:type="dxa"/>
+            </w:tcMar>
+          </w:tcPr>
+          <w:p>
+            <w:pPr>
+              <w:spacing w:after="0" w:line="240" w:lineRule="auto"/>
+            </w:pPr>
+            <w:r>
+              <w:rPr>
+                <w:rFonts w:ascii="Times New Roman" w:hAnsi="Times New Roman"/>
+                <w:sz w:val="16"/>
+              </w:rPr>
+              <w:t>0.027</w:t>
+            </w:r>
+          </w:p>
+        </w:tc>
+        <w:tc>
+          <w:tcPr>
+            <w:tcW w:type="dxa" w:w="1560"/>
+            <w:vAlign w:val="center"/>
+            <w:tcMar>
+              <w:top w:w="80" w:type="dxa"/>
+              <w:start w:w="120" w:type="dxa"/>
+              <w:bottom w:w="80" w:type="dxa"/>
+              <w:end w:w="120" w:type="dxa"/>
+            </w:tcMar>
+          </w:tcPr>
+          <w:p>
+            <w:pPr>
+              <w:spacing w:after="0" w:line="240" w:lineRule="auto"/>
+            </w:pPr>
+            <w:r>
+              <w:rPr>
+                <w:rFonts w:ascii="Times New Roman" w:hAnsi="Times New Roman"/>
+                <w:sz w:val="16"/>
+              </w:rPr>
+              <w:t>0.958</w:t>
+            </w:r>
+          </w:p>
+        </w:tc>
+        <w:tc>
+          <w:tcPr>
+            <w:tcW w:type="dxa" w:w="1560"/>
+            <w:vAlign w:val="center"/>
+            <w:tcMar>
+              <w:top w:w="80" w:type="dxa"/>
+              <w:start w:w="120" w:type="dxa"/>
+              <w:bottom w:w="80" w:type="dxa"/>
+              <w:end w:w="120" w:type="dxa"/>
+            </w:tcMar>
+          </w:tcPr>
+          <w:p>
+            <w:pPr>
+              <w:spacing w:after="0" w:line="240" w:lineRule="auto"/>
+            </w:pPr>
+            <w:r>
+              <w:rPr>
+                <w:rFonts w:ascii="Times New Roman" w:hAnsi="Times New Roman"/>
+                <w:sz w:val="16"/>
+              </w:rPr>
+              <w:t>0.965</w:t>
+            </w:r>
+          </w:p>
+        </w:tc>
+        <w:tc>
+          <w:tcPr>
+            <w:tcW w:type="dxa" w:w="1560"/>
+            <w:vAlign w:val="center"/>
+            <w:tcMar>
+              <w:top w:w="80" w:type="dxa"/>
+              <w:start w:w="120" w:type="dxa"/>
+              <w:bottom w:w="80" w:type="dxa"/>
+              <w:end w:w="120" w:type="dxa"/>
+            </w:tcMar>
+          </w:tcPr>
+          <w:p>
+            <w:pPr>
+              <w:spacing w:after="0" w:line="240" w:lineRule="auto"/>
+            </w:pPr>
+            <w:r>
+              <w:rPr>
+                <w:rFonts w:ascii="Times New Roman" w:hAnsi="Times New Roman"/>
+                <w:sz w:val="16"/>
+              </w:rPr>
+              <w:t>coarse positional property readout</w:t>
+            </w:r>
+          </w:p>
+        </w:tc>
+      </w:tr>
+      <w:tr>
+        <w:tc>
+          <w:tcPr>
+            <w:tcW w:type="dxa" w:w="1560"/>
             <w:vAlign w:val="center"/>
             <w:tcMar>
               <w:top w:w="80" w:type="dxa"/>
@@ -4317,127 +4770,7 @@
         </w:tc>
         <w:tc>
           <w:tcPr>
-            <w:tcW w:type="dxa" w:w="1337"/>
-            <w:vAlign w:val="center"/>
-            <w:tcMar>
-              <w:top w:w="80" w:type="dxa"/>
-              <w:start w:w="120" w:type="dxa"/>
-              <w:bottom w:w="80" w:type="dxa"/>
-              <w:end w:w="120" w:type="dxa"/>
-            </w:tcMar>
-          </w:tcPr>
-          <w:p>
-            <w:pPr>
-              <w:spacing w:after="0" w:line="240" w:lineRule="auto"/>
-            </w:pPr>
-            <w:r>
-              <w:rPr>
-                <w:rFonts w:ascii="Times New Roman" w:hAnsi="Times New Roman"/>
-                <w:sz w:val="16"/>
-              </w:rPr>
-              <w:t>0.115</w:t>
-            </w:r>
-          </w:p>
-        </w:tc>
-        <w:tc>
-          <w:tcPr>
-            <w:tcW w:type="dxa" w:w="1337"/>
-            <w:vAlign w:val="center"/>
-            <w:tcMar>
-              <w:top w:w="80" w:type="dxa"/>
-              <w:start w:w="120" w:type="dxa"/>
-              <w:bottom w:w="80" w:type="dxa"/>
-              <w:end w:w="120" w:type="dxa"/>
-            </w:tcMar>
-          </w:tcPr>
-          <w:p>
-            <w:pPr>
-              <w:spacing w:after="0" w:line="240" w:lineRule="auto"/>
-            </w:pPr>
-            <w:r>
-              <w:rPr>
-                <w:rFonts w:ascii="Times New Roman" w:hAnsi="Times New Roman"/>
-                <w:sz w:val="16"/>
-              </w:rPr>
-              <w:t>0.086</w:t>
-            </w:r>
-          </w:p>
-        </w:tc>
-        <w:tc>
-          <w:tcPr>
-            <w:tcW w:type="dxa" w:w="1337"/>
-            <w:vAlign w:val="center"/>
-            <w:tcMar>
-              <w:top w:w="80" w:type="dxa"/>
-              <w:start w:w="120" w:type="dxa"/>
-              <w:bottom w:w="80" w:type="dxa"/>
-              <w:end w:w="120" w:type="dxa"/>
-            </w:tcMar>
-          </w:tcPr>
-          <w:p>
-            <w:pPr>
-              <w:spacing w:after="0" w:line="240" w:lineRule="auto"/>
-            </w:pPr>
-            <w:r>
-              <w:rPr>
-                <w:rFonts w:ascii="Times New Roman" w:hAnsi="Times New Roman"/>
-                <w:sz w:val="16"/>
-              </w:rPr>
-              <w:t>-0.029</w:t>
-            </w:r>
-          </w:p>
-        </w:tc>
-        <w:tc>
-          <w:tcPr>
-            <w:tcW w:type="dxa" w:w="1337"/>
-            <w:vAlign w:val="center"/>
-            <w:tcMar>
-              <w:top w:w="80" w:type="dxa"/>
-              <w:start w:w="120" w:type="dxa"/>
-              <w:bottom w:w="80" w:type="dxa"/>
-              <w:end w:w="120" w:type="dxa"/>
-            </w:tcMar>
-          </w:tcPr>
-          <w:p>
-            <w:pPr>
-              <w:spacing w:after="0" w:line="240" w:lineRule="auto"/>
-            </w:pPr>
-            <w:r>
-              <w:rPr>
-                <w:rFonts w:ascii="Times New Roman" w:hAnsi="Times New Roman"/>
-                <w:sz w:val="16"/>
-              </w:rPr>
-              <w:t>0.752</w:t>
-            </w:r>
-          </w:p>
-        </w:tc>
-        <w:tc>
-          <w:tcPr>
-            <w:tcW w:type="dxa" w:w="1337"/>
-            <w:vAlign w:val="center"/>
-            <w:tcMar>
-              <w:top w:w="80" w:type="dxa"/>
-              <w:start w:w="120" w:type="dxa"/>
-              <w:bottom w:w="80" w:type="dxa"/>
-              <w:end w:w="120" w:type="dxa"/>
-            </w:tcMar>
-          </w:tcPr>
-          <w:p>
-            <w:pPr>
-              <w:spacing w:after="0" w:line="240" w:lineRule="auto"/>
-            </w:pPr>
-            <w:r>
-              <w:rPr>
-                <w:rFonts w:ascii="Times New Roman" w:hAnsi="Times New Roman"/>
-                <w:sz w:val="16"/>
-              </w:rPr>
-              <w:t>0.900</w:t>
-            </w:r>
-          </w:p>
-        </w:tc>
-        <w:tc>
-          <w:tcPr>
-            <w:tcW w:type="dxa" w:w="1337"/>
+            <w:tcW w:type="dxa" w:w="1560"/>
             <w:vAlign w:val="center"/>
             <w:tcMar>
               <w:top w:w="80" w:type="dxa"/>
@@ -4459,11 +4792,399 @@
             </w:r>
           </w:p>
         </w:tc>
+        <w:tc>
+          <w:tcPr>
+            <w:tcW w:type="dxa" w:w="1560"/>
+            <w:vAlign w:val="center"/>
+            <w:tcMar>
+              <w:top w:w="80" w:type="dxa"/>
+              <w:start w:w="120" w:type="dxa"/>
+              <w:bottom w:w="80" w:type="dxa"/>
+              <w:end w:w="120" w:type="dxa"/>
+            </w:tcMar>
+          </w:tcPr>
+          <w:p>
+            <w:pPr>
+              <w:spacing w:after="0" w:line="240" w:lineRule="auto"/>
+            </w:pPr>
+            <w:r>
+              <w:rPr>
+                <w:rFonts w:ascii="Times New Roman" w:hAnsi="Times New Roman"/>
+                <w:sz w:val="16"/>
+              </w:rPr>
+              <w:t>0.156</w:t>
+            </w:r>
+          </w:p>
+        </w:tc>
+        <w:tc>
+          <w:tcPr>
+            <w:tcW w:type="dxa" w:w="1560"/>
+            <w:vAlign w:val="center"/>
+            <w:tcMar>
+              <w:top w:w="80" w:type="dxa"/>
+              <w:start w:w="120" w:type="dxa"/>
+              <w:bottom w:w="80" w:type="dxa"/>
+              <w:end w:w="120" w:type="dxa"/>
+            </w:tcMar>
+          </w:tcPr>
+          <w:p>
+            <w:pPr>
+              <w:spacing w:after="0" w:line="240" w:lineRule="auto"/>
+            </w:pPr>
+            <w:r>
+              <w:rPr>
+                <w:rFonts w:ascii="Times New Roman" w:hAnsi="Times New Roman"/>
+                <w:sz w:val="16"/>
+              </w:rPr>
+              <w:t>1.000</w:t>
+            </w:r>
+          </w:p>
+        </w:tc>
+        <w:tc>
+          <w:tcPr>
+            <w:tcW w:type="dxa" w:w="1560"/>
+            <w:vAlign w:val="center"/>
+            <w:tcMar>
+              <w:top w:w="80" w:type="dxa"/>
+              <w:start w:w="120" w:type="dxa"/>
+              <w:bottom w:w="80" w:type="dxa"/>
+              <w:end w:w="120" w:type="dxa"/>
+            </w:tcMar>
+          </w:tcPr>
+          <w:p>
+            <w:pPr>
+              <w:spacing w:after="0" w:line="240" w:lineRule="auto"/>
+            </w:pPr>
+            <w:r>
+              <w:rPr>
+                <w:rFonts w:ascii="Times New Roman" w:hAnsi="Times New Roman"/>
+                <w:sz w:val="16"/>
+              </w:rPr>
+              <w:t>0.904</w:t>
+            </w:r>
+          </w:p>
+        </w:tc>
+        <w:tc>
+          <w:tcPr>
+            <w:tcW w:type="dxa" w:w="1560"/>
+            <w:vAlign w:val="center"/>
+            <w:tcMar>
+              <w:top w:w="80" w:type="dxa"/>
+              <w:start w:w="120" w:type="dxa"/>
+              <w:bottom w:w="80" w:type="dxa"/>
+              <w:end w:w="120" w:type="dxa"/>
+            </w:tcMar>
+          </w:tcPr>
+          <w:p>
+            <w:pPr>
+              <w:spacing w:after="0" w:line="240" w:lineRule="auto"/>
+            </w:pPr>
+            <w:r>
+              <w:rPr>
+                <w:rFonts w:ascii="Times New Roman" w:hAnsi="Times New Roman"/>
+                <w:sz w:val="16"/>
+              </w:rPr>
+              <w:t>composition plus global property stability</w:t>
+            </w:r>
+          </w:p>
+        </w:tc>
       </w:tr>
       <w:tr>
         <w:tc>
           <w:tcPr>
-            <w:tcW w:type="dxa" w:w="1337"/>
+            <w:tcW w:type="dxa" w:w="1560"/>
+            <w:vAlign w:val="center"/>
+            <w:tcMar>
+              <w:top w:w="80" w:type="dxa"/>
+              <w:start w:w="120" w:type="dxa"/>
+              <w:bottom w:w="80" w:type="dxa"/>
+              <w:end w:w="120" w:type="dxa"/>
+            </w:tcMar>
+          </w:tcPr>
+          <w:p>
+            <w:pPr>
+              <w:spacing w:after="0" w:line="240" w:lineRule="auto"/>
+            </w:pPr>
+            <w:r>
+              <w:rPr>
+                <w:rFonts w:ascii="Times New Roman" w:hAnsi="Times New Roman"/>
+                <w:sz w:val="16"/>
+              </w:rPr>
+              <w:t>CK4+MSP</w:t>
+            </w:r>
+          </w:p>
+        </w:tc>
+        <w:tc>
+          <w:tcPr>
+            <w:tcW w:type="dxa" w:w="1560"/>
+            <w:vAlign w:val="center"/>
+            <w:tcMar>
+              <w:top w:w="80" w:type="dxa"/>
+              <w:start w:w="120" w:type="dxa"/>
+              <w:bottom w:w="80" w:type="dxa"/>
+              <w:end w:w="120" w:type="dxa"/>
+            </w:tcMar>
+          </w:tcPr>
+          <w:p>
+            <w:pPr>
+              <w:spacing w:after="0" w:line="240" w:lineRule="auto"/>
+            </w:pPr>
+            <w:r>
+              <w:rPr>
+                <w:rFonts w:ascii="Times New Roman" w:hAnsi="Times New Roman"/>
+                <w:sz w:val="16"/>
+              </w:rPr>
+              <w:t>211</w:t>
+            </w:r>
+          </w:p>
+        </w:tc>
+        <w:tc>
+          <w:tcPr>
+            <w:tcW w:type="dxa" w:w="1560"/>
+            <w:vAlign w:val="center"/>
+            <w:tcMar>
+              <w:top w:w="80" w:type="dxa"/>
+              <w:start w:w="120" w:type="dxa"/>
+              <w:bottom w:w="80" w:type="dxa"/>
+              <w:end w:w="120" w:type="dxa"/>
+            </w:tcMar>
+          </w:tcPr>
+          <w:p>
+            <w:pPr>
+              <w:spacing w:after="0" w:line="240" w:lineRule="auto"/>
+            </w:pPr>
+            <w:r>
+              <w:rPr>
+                <w:rFonts w:ascii="Times New Roman" w:hAnsi="Times New Roman"/>
+                <w:sz w:val="16"/>
+              </w:rPr>
+              <w:t>0.156</w:t>
+            </w:r>
+          </w:p>
+        </w:tc>
+        <w:tc>
+          <w:tcPr>
+            <w:tcW w:type="dxa" w:w="1560"/>
+            <w:vAlign w:val="center"/>
+            <w:tcMar>
+              <w:top w:w="80" w:type="dxa"/>
+              <w:start w:w="120" w:type="dxa"/>
+              <w:bottom w:w="80" w:type="dxa"/>
+              <w:end w:w="120" w:type="dxa"/>
+            </w:tcMar>
+          </w:tcPr>
+          <w:p>
+            <w:pPr>
+              <w:spacing w:after="0" w:line="240" w:lineRule="auto"/>
+            </w:pPr>
+            <w:r>
+              <w:rPr>
+                <w:rFonts w:ascii="Times New Roman" w:hAnsi="Times New Roman"/>
+                <w:sz w:val="16"/>
+              </w:rPr>
+              <w:t>1.000</w:t>
+            </w:r>
+          </w:p>
+        </w:tc>
+        <w:tc>
+          <w:tcPr>
+            <w:tcW w:type="dxa" w:w="1560"/>
+            <w:vAlign w:val="center"/>
+            <w:tcMar>
+              <w:top w:w="80" w:type="dxa"/>
+              <w:start w:w="120" w:type="dxa"/>
+              <w:bottom w:w="80" w:type="dxa"/>
+              <w:end w:w="120" w:type="dxa"/>
+            </w:tcMar>
+          </w:tcPr>
+          <w:p>
+            <w:pPr>
+              <w:spacing w:after="0" w:line="240" w:lineRule="auto"/>
+            </w:pPr>
+            <w:r>
+              <w:rPr>
+                <w:rFonts w:ascii="Times New Roman" w:hAnsi="Times New Roman"/>
+                <w:sz w:val="16"/>
+              </w:rPr>
+              <w:t>0.978</w:t>
+            </w:r>
+          </w:p>
+        </w:tc>
+        <w:tc>
+          <w:tcPr>
+            <w:tcW w:type="dxa" w:w="1560"/>
+            <w:vAlign w:val="center"/>
+            <w:tcMar>
+              <w:top w:w="80" w:type="dxa"/>
+              <w:start w:w="120" w:type="dxa"/>
+              <w:bottom w:w="80" w:type="dxa"/>
+              <w:end w:w="120" w:type="dxa"/>
+            </w:tcMar>
+          </w:tcPr>
+          <w:p>
+            <w:pPr>
+              <w:spacing w:after="0" w:line="240" w:lineRule="auto"/>
+            </w:pPr>
+            <w:r>
+              <w:rPr>
+                <w:rFonts w:ascii="Times New Roman" w:hAnsi="Times New Roman"/>
+                <w:sz w:val="16"/>
+              </w:rPr>
+              <w:t>composition plus local-change readability</w:t>
+            </w:r>
+          </w:p>
+        </w:tc>
+      </w:tr>
+      <w:tr>
+        <w:tc>
+          <w:tcPr>
+            <w:tcW w:type="dxa" w:w="1560"/>
+            <w:vAlign w:val="center"/>
+            <w:tcMar>
+              <w:top w:w="80" w:type="dxa"/>
+              <w:start w:w="120" w:type="dxa"/>
+              <w:bottom w:w="80" w:type="dxa"/>
+              <w:end w:w="120" w:type="dxa"/>
+            </w:tcMar>
+          </w:tcPr>
+          <w:p>
+            <w:pPr>
+              <w:spacing w:after="0" w:line="240" w:lineRule="auto"/>
+            </w:pPr>
+            <w:r>
+              <w:rPr>
+                <w:rFonts w:ascii="Times New Roman" w:hAnsi="Times New Roman"/>
+                <w:sz w:val="16"/>
+              </w:rPr>
+              <w:t>P+MSP</w:t>
+            </w:r>
+          </w:p>
+        </w:tc>
+        <w:tc>
+          <w:tcPr>
+            <w:tcW w:type="dxa" w:w="1560"/>
+            <w:vAlign w:val="center"/>
+            <w:tcMar>
+              <w:top w:w="80" w:type="dxa"/>
+              <w:start w:w="120" w:type="dxa"/>
+              <w:bottom w:w="80" w:type="dxa"/>
+              <w:end w:w="120" w:type="dxa"/>
+            </w:tcMar>
+          </w:tcPr>
+          <w:p>
+            <w:pPr>
+              <w:spacing w:after="0" w:line="240" w:lineRule="auto"/>
+            </w:pPr>
+            <w:r>
+              <w:rPr>
+                <w:rFonts w:ascii="Times New Roman" w:hAnsi="Times New Roman"/>
+                <w:sz w:val="16"/>
+              </w:rPr>
+              <w:t>86</w:t>
+            </w:r>
+          </w:p>
+        </w:tc>
+        <w:tc>
+          <w:tcPr>
+            <w:tcW w:type="dxa" w:w="1560"/>
+            <w:vAlign w:val="center"/>
+            <w:tcMar>
+              <w:top w:w="80" w:type="dxa"/>
+              <w:start w:w="120" w:type="dxa"/>
+              <w:bottom w:w="80" w:type="dxa"/>
+              <w:end w:w="120" w:type="dxa"/>
+            </w:tcMar>
+          </w:tcPr>
+          <w:p>
+            <w:pPr>
+              <w:spacing w:after="0" w:line="240" w:lineRule="auto"/>
+            </w:pPr>
+            <w:r>
+              <w:rPr>
+                <w:rFonts w:ascii="Times New Roman" w:hAnsi="Times New Roman"/>
+                <w:sz w:val="16"/>
+              </w:rPr>
+              <w:t>0.027</w:t>
+            </w:r>
+          </w:p>
+        </w:tc>
+        <w:tc>
+          <w:tcPr>
+            <w:tcW w:type="dxa" w:w="1560"/>
+            <w:vAlign w:val="center"/>
+            <w:tcMar>
+              <w:top w:w="80" w:type="dxa"/>
+              <w:start w:w="120" w:type="dxa"/>
+              <w:bottom w:w="80" w:type="dxa"/>
+              <w:end w:w="120" w:type="dxa"/>
+            </w:tcMar>
+          </w:tcPr>
+          <w:p>
+            <w:pPr>
+              <w:spacing w:after="0" w:line="240" w:lineRule="auto"/>
+            </w:pPr>
+            <w:r>
+              <w:rPr>
+                <w:rFonts w:ascii="Times New Roman" w:hAnsi="Times New Roman"/>
+                <w:sz w:val="16"/>
+              </w:rPr>
+              <w:t>0.942</w:t>
+            </w:r>
+          </w:p>
+        </w:tc>
+        <w:tc>
+          <w:tcPr>
+            <w:tcW w:type="dxa" w:w="1560"/>
+            <w:vAlign w:val="center"/>
+            <w:tcMar>
+              <w:top w:w="80" w:type="dxa"/>
+              <w:start w:w="120" w:type="dxa"/>
+              <w:bottom w:w="80" w:type="dxa"/>
+              <w:end w:w="120" w:type="dxa"/>
+            </w:tcMar>
+          </w:tcPr>
+          <w:p>
+            <w:pPr>
+              <w:spacing w:after="0" w:line="240" w:lineRule="auto"/>
+            </w:pPr>
+            <w:r>
+              <w:rPr>
+                <w:rFonts w:ascii="Times New Roman" w:hAnsi="Times New Roman"/>
+                <w:sz w:val="16"/>
+              </w:rPr>
+              <w:t>0.970</w:t>
+            </w:r>
+          </w:p>
+        </w:tc>
+        <w:tc>
+          <w:tcPr>
+            <w:tcW w:type="dxa" w:w="1560"/>
+            <w:vAlign w:val="center"/>
+            <w:tcMar>
+              <w:top w:w="80" w:type="dxa"/>
+              <w:start w:w="120" w:type="dxa"/>
+              <w:bottom w:w="80" w:type="dxa"/>
+              <w:end w:w="120" w:type="dxa"/>
+            </w:tcMar>
+          </w:tcPr>
+          <w:p>
+            <w:pPr>
+              <w:spacing w:after="0" w:line="240" w:lineRule="auto"/>
+            </w:pPr>
+            <w:r>
+              <w:rPr>
+                <w:rFonts w:ascii="Times New Roman" w:hAnsi="Times New Roman"/>
+                <w:sz w:val="16"/>
+              </w:rPr>
+              <w:t>stable property-only summary with incomplete retrieval</w:t>
+            </w:r>
+          </w:p>
+        </w:tc>
+      </w:tr>
+      <w:tr>
+        <w:tc>
+          <w:tcPr>
+            <w:tcW w:type="dxa" w:w="1560"/>
             <w:vAlign w:val="center"/>
             <w:tcMar>
               <w:top w:w="80" w:type="dxa"/>
@@ -4487,127 +5208,7 @@
         </w:tc>
         <w:tc>
           <w:tcPr>
-            <w:tcW w:type="dxa" w:w="1337"/>
-            <w:vAlign w:val="center"/>
-            <w:tcMar>
-              <w:top w:w="80" w:type="dxa"/>
-              <w:start w:w="120" w:type="dxa"/>
-              <w:bottom w:w="80" w:type="dxa"/>
-              <w:end w:w="120" w:type="dxa"/>
-            </w:tcMar>
-          </w:tcPr>
-          <w:p>
-            <w:pPr>
-              <w:spacing w:after="0" w:line="240" w:lineRule="auto"/>
-            </w:pPr>
-            <w:r>
-              <w:rPr>
-                <w:rFonts w:ascii="Times New Roman" w:hAnsi="Times New Roman"/>
-                <w:sz w:val="16"/>
-              </w:rPr>
-              <w:t>0.110</w:t>
-            </w:r>
-          </w:p>
-        </w:tc>
-        <w:tc>
-          <w:tcPr>
-            <w:tcW w:type="dxa" w:w="1337"/>
-            <w:vAlign w:val="center"/>
-            <w:tcMar>
-              <w:top w:w="80" w:type="dxa"/>
-              <w:start w:w="120" w:type="dxa"/>
-              <w:bottom w:w="80" w:type="dxa"/>
-              <w:end w:w="120" w:type="dxa"/>
-            </w:tcMar>
-          </w:tcPr>
-          <w:p>
-            <w:pPr>
-              <w:spacing w:after="0" w:line="240" w:lineRule="auto"/>
-            </w:pPr>
-            <w:r>
-              <w:rPr>
-                <w:rFonts w:ascii="Times New Roman" w:hAnsi="Times New Roman"/>
-                <w:sz w:val="16"/>
-              </w:rPr>
-              <w:t>0.083</w:t>
-            </w:r>
-          </w:p>
-        </w:tc>
-        <w:tc>
-          <w:tcPr>
-            <w:tcW w:type="dxa" w:w="1337"/>
-            <w:vAlign w:val="center"/>
-            <w:tcMar>
-              <w:top w:w="80" w:type="dxa"/>
-              <w:start w:w="120" w:type="dxa"/>
-              <w:bottom w:w="80" w:type="dxa"/>
-              <w:end w:w="120" w:type="dxa"/>
-            </w:tcMar>
-          </w:tcPr>
-          <w:p>
-            <w:pPr>
-              <w:spacing w:after="0" w:line="240" w:lineRule="auto"/>
-            </w:pPr>
-            <w:r>
-              <w:rPr>
-                <w:rFonts w:ascii="Times New Roman" w:hAnsi="Times New Roman"/>
-                <w:sz w:val="16"/>
-              </w:rPr>
-              <w:t>-0.027</w:t>
-            </w:r>
-          </w:p>
-        </w:tc>
-        <w:tc>
-          <w:tcPr>
-            <w:tcW w:type="dxa" w:w="1337"/>
-            <w:vAlign w:val="center"/>
-            <w:tcMar>
-              <w:top w:w="80" w:type="dxa"/>
-              <w:start w:w="120" w:type="dxa"/>
-              <w:bottom w:w="80" w:type="dxa"/>
-              <w:end w:w="120" w:type="dxa"/>
-            </w:tcMar>
-          </w:tcPr>
-          <w:p>
-            <w:pPr>
-              <w:spacing w:after="0" w:line="240" w:lineRule="auto"/>
-            </w:pPr>
-            <w:r>
-              <w:rPr>
-                <w:rFonts w:ascii="Times New Roman" w:hAnsi="Times New Roman"/>
-                <w:sz w:val="16"/>
-              </w:rPr>
-              <w:t>0.754</w:t>
-            </w:r>
-          </w:p>
-        </w:tc>
-        <w:tc>
-          <w:tcPr>
-            <w:tcW w:type="dxa" w:w="1337"/>
-            <w:vAlign w:val="center"/>
-            <w:tcMar>
-              <w:top w:w="80" w:type="dxa"/>
-              <w:start w:w="120" w:type="dxa"/>
-              <w:bottom w:w="80" w:type="dxa"/>
-              <w:end w:w="120" w:type="dxa"/>
-            </w:tcMar>
-          </w:tcPr>
-          <w:p>
-            <w:pPr>
-              <w:spacing w:after="0" w:line="240" w:lineRule="auto"/>
-            </w:pPr>
-            <w:r>
-              <w:rPr>
-                <w:rFonts w:ascii="Times New Roman" w:hAnsi="Times New Roman"/>
-                <w:sz w:val="16"/>
-              </w:rPr>
-              <w:t>0.977</w:t>
-            </w:r>
-          </w:p>
-        </w:tc>
-        <w:tc>
-          <w:tcPr>
-            <w:tcW w:type="dxa" w:w="1337"/>
+            <w:tcW w:type="dxa" w:w="1560"/>
             <w:vAlign w:val="center"/>
             <w:tcMar>
               <w:top w:w="80" w:type="dxa"/>
@@ -4629,11 +5230,9 @@
             </w:r>
           </w:p>
         </w:tc>
-      </w:tr>
-      <w:tr>
         <w:tc>
           <w:tcPr>
-            <w:tcW w:type="dxa" w:w="1337"/>
+            <w:tcW w:type="dxa" w:w="1560"/>
             <w:vAlign w:val="center"/>
             <w:tcMar>
               <w:top w:w="80" w:type="dxa"/>
@@ -4651,255 +5250,13 @@
                 <w:rFonts w:ascii="Times New Roman" w:hAnsi="Times New Roman"/>
                 <w:sz w:val="16"/>
               </w:rPr>
-              <w:t>CSP</w:t>
+              <w:t>0.129</w:t>
             </w:r>
           </w:p>
         </w:tc>
         <w:tc>
           <w:tcPr>
-            <w:tcW w:type="dxa" w:w="1337"/>
-            <w:vAlign w:val="center"/>
-            <w:tcMar>
-              <w:top w:w="80" w:type="dxa"/>
-              <w:start w:w="120" w:type="dxa"/>
-              <w:bottom w:w="80" w:type="dxa"/>
-              <w:end w:w="120" w:type="dxa"/>
-            </w:tcMar>
-          </w:tcPr>
-          <w:p>
-            <w:pPr>
-              <w:spacing w:after="0" w:line="240" w:lineRule="auto"/>
-            </w:pPr>
-            <w:r>
-              <w:rPr>
-                <w:rFonts w:ascii="Times New Roman" w:hAnsi="Times New Roman"/>
-                <w:sz w:val="16"/>
-              </w:rPr>
-              <w:t>0.116</w:t>
-            </w:r>
-          </w:p>
-        </w:tc>
-        <w:tc>
-          <w:tcPr>
-            <w:tcW w:type="dxa" w:w="1337"/>
-            <w:vAlign w:val="center"/>
-            <w:tcMar>
-              <w:top w:w="80" w:type="dxa"/>
-              <w:start w:w="120" w:type="dxa"/>
-              <w:bottom w:w="80" w:type="dxa"/>
-              <w:end w:w="120" w:type="dxa"/>
-            </w:tcMar>
-          </w:tcPr>
-          <w:p>
-            <w:pPr>
-              <w:spacing w:after="0" w:line="240" w:lineRule="auto"/>
-            </w:pPr>
-            <w:r>
-              <w:rPr>
-                <w:rFonts w:ascii="Times New Roman" w:hAnsi="Times New Roman"/>
-                <w:sz w:val="16"/>
-              </w:rPr>
-              <w:t>0.109</w:t>
-            </w:r>
-          </w:p>
-        </w:tc>
-        <w:tc>
-          <w:tcPr>
-            <w:tcW w:type="dxa" w:w="1337"/>
-            <w:vAlign w:val="center"/>
-            <w:tcMar>
-              <w:top w:w="80" w:type="dxa"/>
-              <w:start w:w="120" w:type="dxa"/>
-              <w:bottom w:w="80" w:type="dxa"/>
-              <w:end w:w="120" w:type="dxa"/>
-            </w:tcMar>
-          </w:tcPr>
-          <w:p>
-            <w:pPr>
-              <w:spacing w:after="0" w:line="240" w:lineRule="auto"/>
-            </w:pPr>
-            <w:r>
-              <w:rPr>
-                <w:rFonts w:ascii="Times New Roman" w:hAnsi="Times New Roman"/>
-                <w:sz w:val="16"/>
-              </w:rPr>
-              <w:t>-0.006</w:t>
-            </w:r>
-          </w:p>
-        </w:tc>
-        <w:tc>
-          <w:tcPr>
-            <w:tcW w:type="dxa" w:w="1337"/>
-            <w:vAlign w:val="center"/>
-            <w:tcMar>
-              <w:top w:w="80" w:type="dxa"/>
-              <w:start w:w="120" w:type="dxa"/>
-              <w:bottom w:w="80" w:type="dxa"/>
-              <w:end w:w="120" w:type="dxa"/>
-            </w:tcMar>
-          </w:tcPr>
-          <w:p>
-            <w:pPr>
-              <w:spacing w:after="0" w:line="240" w:lineRule="auto"/>
-            </w:pPr>
-            <w:r>
-              <w:rPr>
-                <w:rFonts w:ascii="Times New Roman" w:hAnsi="Times New Roman"/>
-                <w:sz w:val="16"/>
-              </w:rPr>
-              <w:t>0.947</w:t>
-            </w:r>
-          </w:p>
-        </w:tc>
-        <w:tc>
-          <w:tcPr>
-            <w:tcW w:type="dxa" w:w="1337"/>
-            <w:vAlign w:val="center"/>
-            <w:tcMar>
-              <w:top w:w="80" w:type="dxa"/>
-              <w:start w:w="120" w:type="dxa"/>
-              <w:bottom w:w="80" w:type="dxa"/>
-              <w:end w:w="120" w:type="dxa"/>
-            </w:tcMar>
-          </w:tcPr>
-          <w:p>
-            <w:pPr>
-              <w:spacing w:after="0" w:line="240" w:lineRule="auto"/>
-            </w:pPr>
-            <w:r>
-              <w:rPr>
-                <w:rFonts w:ascii="Times New Roman" w:hAnsi="Times New Roman"/>
-                <w:sz w:val="16"/>
-              </w:rPr>
-              <w:t>0.696</w:t>
-            </w:r>
-          </w:p>
-        </w:tc>
-        <w:tc>
-          <w:tcPr>
-            <w:tcW w:type="dxa" w:w="1337"/>
-            <w:vAlign w:val="center"/>
-            <w:tcMar>
-              <w:top w:w="80" w:type="dxa"/>
-              <w:start w:w="120" w:type="dxa"/>
-              <w:bottom w:w="80" w:type="dxa"/>
-              <w:end w:w="120" w:type="dxa"/>
-            </w:tcMar>
-          </w:tcPr>
-          <w:p>
-            <w:pPr>
-              <w:spacing w:after="0" w:line="240" w:lineRule="auto"/>
-            </w:pPr>
-            <w:r>
-              <w:rPr>
-                <w:rFonts w:ascii="Times New Roman" w:hAnsi="Times New Roman"/>
-                <w:sz w:val="16"/>
-              </w:rPr>
-              <w:t>147</w:t>
-            </w:r>
-          </w:p>
-        </w:tc>
-      </w:tr>
-      <w:tr>
-        <w:tc>
-          <w:tcPr>
-            <w:tcW w:type="dxa" w:w="1337"/>
-            <w:vAlign w:val="center"/>
-            <w:tcMar>
-              <w:top w:w="80" w:type="dxa"/>
-              <w:start w:w="120" w:type="dxa"/>
-              <w:bottom w:w="80" w:type="dxa"/>
-              <w:end w:w="120" w:type="dxa"/>
-            </w:tcMar>
-          </w:tcPr>
-          <w:p>
-            <w:pPr>
-              <w:spacing w:after="0" w:line="240" w:lineRule="auto"/>
-            </w:pPr>
-            <w:r>
-              <w:rPr>
-                <w:rFonts w:ascii="Times New Roman" w:hAnsi="Times New Roman"/>
-                <w:sz w:val="16"/>
-              </w:rPr>
-              <w:t>one-hot</w:t>
-            </w:r>
-          </w:p>
-        </w:tc>
-        <w:tc>
-          <w:tcPr>
-            <w:tcW w:type="dxa" w:w="1337"/>
-            <w:vAlign w:val="center"/>
-            <w:tcMar>
-              <w:top w:w="80" w:type="dxa"/>
-              <w:start w:w="120" w:type="dxa"/>
-              <w:bottom w:w="80" w:type="dxa"/>
-              <w:end w:w="120" w:type="dxa"/>
-            </w:tcMar>
-          </w:tcPr>
-          <w:p>
-            <w:pPr>
-              <w:spacing w:after="0" w:line="240" w:lineRule="auto"/>
-            </w:pPr>
-            <w:r>
-              <w:rPr>
-                <w:rFonts w:ascii="Times New Roman" w:hAnsi="Times New Roman"/>
-                <w:sz w:val="16"/>
-              </w:rPr>
-              <w:t>0.239</w:t>
-            </w:r>
-          </w:p>
-        </w:tc>
-        <w:tc>
-          <w:tcPr>
-            <w:tcW w:type="dxa" w:w="1337"/>
-            <w:vAlign w:val="center"/>
-            <w:tcMar>
-              <w:top w:w="80" w:type="dxa"/>
-              <w:start w:w="120" w:type="dxa"/>
-              <w:bottom w:w="80" w:type="dxa"/>
-              <w:end w:w="120" w:type="dxa"/>
-            </w:tcMar>
-          </w:tcPr>
-          <w:p>
-            <w:pPr>
-              <w:spacing w:after="0" w:line="240" w:lineRule="auto"/>
-            </w:pPr>
-            <w:r>
-              <w:rPr>
-                <w:rFonts w:ascii="Times New Roman" w:hAnsi="Times New Roman"/>
-                <w:sz w:val="16"/>
-              </w:rPr>
-              <w:t>0.239</w:t>
-            </w:r>
-          </w:p>
-        </w:tc>
-        <w:tc>
-          <w:tcPr>
-            <w:tcW w:type="dxa" w:w="1337"/>
-            <w:vAlign w:val="center"/>
-            <w:tcMar>
-              <w:top w:w="80" w:type="dxa"/>
-              <w:start w:w="120" w:type="dxa"/>
-              <w:bottom w:w="80" w:type="dxa"/>
-              <w:end w:w="120" w:type="dxa"/>
-            </w:tcMar>
-          </w:tcPr>
-          <w:p>
-            <w:pPr>
-              <w:spacing w:after="0" w:line="240" w:lineRule="auto"/>
-            </w:pPr>
-            <w:r>
-              <w:rPr>
-                <w:rFonts w:ascii="Times New Roman" w:hAnsi="Times New Roman"/>
-                <w:sz w:val="16"/>
-              </w:rPr>
-              <w:t>0.000</w:t>
-            </w:r>
-          </w:p>
-        </w:tc>
-        <w:tc>
-          <w:tcPr>
-            <w:tcW w:type="dxa" w:w="1337"/>
+            <w:tcW w:type="dxa" w:w="1560"/>
             <w:vAlign w:val="center"/>
             <w:tcMar>
               <w:top w:w="80" w:type="dxa"/>
@@ -4923,7 +5280,7 @@
         </w:tc>
         <w:tc>
           <w:tcPr>
-            <w:tcW w:type="dxa" w:w="1337"/>
+            <w:tcW w:type="dxa" w:w="1560"/>
             <w:vAlign w:val="center"/>
             <w:tcMar>
               <w:top w:w="80" w:type="dxa"/>
@@ -4941,13 +5298,13 @@
                 <w:rFonts w:ascii="Times New Roman" w:hAnsi="Times New Roman"/>
                 <w:sz w:val="16"/>
               </w:rPr>
-              <w:t>0.956</w:t>
+              <w:t>0.979</w:t>
             </w:r>
           </w:p>
         </w:tc>
         <w:tc>
           <w:tcPr>
-            <w:tcW w:type="dxa" w:w="1337"/>
+            <w:tcW w:type="dxa" w:w="1560"/>
             <w:vAlign w:val="center"/>
             <w:tcMar>
               <w:top w:w="80" w:type="dxa"/>
@@ -4965,517 +5322,7 @@
                 <w:rFonts w:ascii="Times New Roman" w:hAnsi="Times New Roman"/>
                 <w:sz w:val="16"/>
               </w:rPr>
-              <w:t>500</w:t>
-            </w:r>
-          </w:p>
-        </w:tc>
-      </w:tr>
-      <w:tr>
-        <w:tc>
-          <w:tcPr>
-            <w:tcW w:type="dxa" w:w="1337"/>
-            <w:vAlign w:val="center"/>
-            <w:tcMar>
-              <w:top w:w="80" w:type="dxa"/>
-              <w:start w:w="120" w:type="dxa"/>
-              <w:bottom w:w="80" w:type="dxa"/>
-              <w:end w:w="120" w:type="dxa"/>
-            </w:tcMar>
-          </w:tcPr>
-          <w:p>
-            <w:pPr>
-              <w:spacing w:after="0" w:line="240" w:lineRule="auto"/>
-            </w:pPr>
-            <w:r>
-              <w:rPr>
-                <w:rFonts w:ascii="Times New Roman" w:hAnsi="Times New Roman"/>
-                <w:sz w:val="16"/>
-              </w:rPr>
-              <w:t>P-channels</w:t>
-            </w:r>
-          </w:p>
-        </w:tc>
-        <w:tc>
-          <w:tcPr>
-            <w:tcW w:type="dxa" w:w="1337"/>
-            <w:vAlign w:val="center"/>
-            <w:tcMar>
-              <w:top w:w="80" w:type="dxa"/>
-              <w:start w:w="120" w:type="dxa"/>
-              <w:bottom w:w="80" w:type="dxa"/>
-              <w:end w:w="120" w:type="dxa"/>
-            </w:tcMar>
-          </w:tcPr>
-          <w:p>
-            <w:pPr>
-              <w:spacing w:after="0" w:line="240" w:lineRule="auto"/>
-            </w:pPr>
-            <w:r>
-              <w:rPr>
-                <w:rFonts w:ascii="Times New Roman" w:hAnsi="Times New Roman"/>
-                <w:sz w:val="16"/>
-              </w:rPr>
-              <w:t>0.086</w:t>
-            </w:r>
-          </w:p>
-        </w:tc>
-        <w:tc>
-          <w:tcPr>
-            <w:tcW w:type="dxa" w:w="1337"/>
-            <w:vAlign w:val="center"/>
-            <w:tcMar>
-              <w:top w:w="80" w:type="dxa"/>
-              <w:start w:w="120" w:type="dxa"/>
-              <w:bottom w:w="80" w:type="dxa"/>
-              <w:end w:w="120" w:type="dxa"/>
-            </w:tcMar>
-          </w:tcPr>
-          <w:p>
-            <w:pPr>
-              <w:spacing w:after="0" w:line="240" w:lineRule="auto"/>
-            </w:pPr>
-            <w:r>
-              <w:rPr>
-                <w:rFonts w:ascii="Times New Roman" w:hAnsi="Times New Roman"/>
-                <w:sz w:val="16"/>
-              </w:rPr>
-              <w:t>0.107</w:t>
-            </w:r>
-          </w:p>
-        </w:tc>
-        <w:tc>
-          <w:tcPr>
-            <w:tcW w:type="dxa" w:w="1337"/>
-            <w:vAlign w:val="center"/>
-            <w:tcMar>
-              <w:top w:w="80" w:type="dxa"/>
-              <w:start w:w="120" w:type="dxa"/>
-              <w:bottom w:w="80" w:type="dxa"/>
-              <w:end w:w="120" w:type="dxa"/>
-            </w:tcMar>
-          </w:tcPr>
-          <w:p>
-            <w:pPr>
-              <w:spacing w:after="0" w:line="240" w:lineRule="auto"/>
-            </w:pPr>
-            <w:r>
-              <w:rPr>
-                <w:rFonts w:ascii="Times New Roman" w:hAnsi="Times New Roman"/>
-                <w:sz w:val="16"/>
-              </w:rPr>
-              <w:t>0.020</w:t>
-            </w:r>
-          </w:p>
-        </w:tc>
-        <w:tc>
-          <w:tcPr>
-            <w:tcW w:type="dxa" w:w="1337"/>
-            <w:vAlign w:val="center"/>
-            <w:tcMar>
-              <w:top w:w="80" w:type="dxa"/>
-              <w:start w:w="120" w:type="dxa"/>
-              <w:bottom w:w="80" w:type="dxa"/>
-              <w:end w:w="120" w:type="dxa"/>
-            </w:tcMar>
-          </w:tcPr>
-          <w:p>
-            <w:pPr>
-              <w:spacing w:after="0" w:line="240" w:lineRule="auto"/>
-            </w:pPr>
-            <w:r>
-              <w:rPr>
-                <w:rFonts w:ascii="Times New Roman" w:hAnsi="Times New Roman"/>
-                <w:sz w:val="16"/>
-              </w:rPr>
-              <w:t>1.255</w:t>
-            </w:r>
-          </w:p>
-        </w:tc>
-        <w:tc>
-          <w:tcPr>
-            <w:tcW w:type="dxa" w:w="1337"/>
-            <w:vAlign w:val="center"/>
-            <w:tcMar>
-              <w:top w:w="80" w:type="dxa"/>
-              <w:start w:w="120" w:type="dxa"/>
-              <w:bottom w:w="80" w:type="dxa"/>
-              <w:end w:w="120" w:type="dxa"/>
-            </w:tcMar>
-          </w:tcPr>
-          <w:p>
-            <w:pPr>
-              <w:spacing w:after="0" w:line="240" w:lineRule="auto"/>
-            </w:pPr>
-            <w:r>
-              <w:rPr>
-                <w:rFonts w:ascii="Times New Roman" w:hAnsi="Times New Roman"/>
-                <w:sz w:val="16"/>
-              </w:rPr>
-              <w:t>0.983</w:t>
-            </w:r>
-          </w:p>
-        </w:tc>
-        <w:tc>
-          <w:tcPr>
-            <w:tcW w:type="dxa" w:w="1337"/>
-            <w:vAlign w:val="center"/>
-            <w:tcMar>
-              <w:top w:w="80" w:type="dxa"/>
-              <w:start w:w="120" w:type="dxa"/>
-              <w:bottom w:w="80" w:type="dxa"/>
-              <w:end w:w="120" w:type="dxa"/>
-            </w:tcMar>
-          </w:tcPr>
-          <w:p>
-            <w:pPr>
-              <w:spacing w:after="0" w:line="240" w:lineRule="auto"/>
-            </w:pPr>
-            <w:r>
-              <w:rPr>
-                <w:rFonts w:ascii="Times New Roman" w:hAnsi="Times New Roman"/>
-                <w:sz w:val="16"/>
-              </w:rPr>
-              <w:t>500</w:t>
-            </w:r>
-          </w:p>
-        </w:tc>
-      </w:tr>
-      <w:tr>
-        <w:tc>
-          <w:tcPr>
-            <w:tcW w:type="dxa" w:w="1337"/>
-            <w:vAlign w:val="center"/>
-            <w:tcMar>
-              <w:top w:w="80" w:type="dxa"/>
-              <w:start w:w="120" w:type="dxa"/>
-              <w:bottom w:w="80" w:type="dxa"/>
-              <w:end w:w="120" w:type="dxa"/>
-            </w:tcMar>
-          </w:tcPr>
-          <w:p>
-            <w:pPr>
-              <w:spacing w:after="0" w:line="240" w:lineRule="auto"/>
-            </w:pPr>
-            <w:r>
-              <w:rPr>
-                <w:rFonts w:ascii="Times New Roman" w:hAnsi="Times New Roman"/>
-                <w:sz w:val="16"/>
-              </w:rPr>
-              <w:t>one-hot+P</w:t>
-            </w:r>
-          </w:p>
-        </w:tc>
-        <w:tc>
-          <w:tcPr>
-            <w:tcW w:type="dxa" w:w="1337"/>
-            <w:vAlign w:val="center"/>
-            <w:tcMar>
-              <w:top w:w="80" w:type="dxa"/>
-              <w:start w:w="120" w:type="dxa"/>
-              <w:bottom w:w="80" w:type="dxa"/>
-              <w:end w:w="120" w:type="dxa"/>
-            </w:tcMar>
-          </w:tcPr>
-          <w:p>
-            <w:pPr>
-              <w:spacing w:after="0" w:line="240" w:lineRule="auto"/>
-            </w:pPr>
-            <w:r>
-              <w:rPr>
-                <w:rFonts w:ascii="Times New Roman" w:hAnsi="Times New Roman"/>
-                <w:sz w:val="16"/>
-              </w:rPr>
-              <w:t>0.188</w:t>
-            </w:r>
-          </w:p>
-        </w:tc>
-        <w:tc>
-          <w:tcPr>
-            <w:tcW w:type="dxa" w:w="1337"/>
-            <w:vAlign w:val="center"/>
-            <w:tcMar>
-              <w:top w:w="80" w:type="dxa"/>
-              <w:start w:w="120" w:type="dxa"/>
-              <w:bottom w:w="80" w:type="dxa"/>
-              <w:end w:w="120" w:type="dxa"/>
-            </w:tcMar>
-          </w:tcPr>
-          <w:p>
-            <w:pPr>
-              <w:spacing w:after="0" w:line="240" w:lineRule="auto"/>
-            </w:pPr>
-            <w:r>
-              <w:rPr>
-                <w:rFonts w:ascii="Times New Roman" w:hAnsi="Times New Roman"/>
-                <w:sz w:val="16"/>
-              </w:rPr>
-              <w:t>0.207</w:t>
-            </w:r>
-          </w:p>
-        </w:tc>
-        <w:tc>
-          <w:tcPr>
-            <w:tcW w:type="dxa" w:w="1337"/>
-            <w:vAlign w:val="center"/>
-            <w:tcMar>
-              <w:top w:w="80" w:type="dxa"/>
-              <w:start w:w="120" w:type="dxa"/>
-              <w:bottom w:w="80" w:type="dxa"/>
-              <w:end w:w="120" w:type="dxa"/>
-            </w:tcMar>
-          </w:tcPr>
-          <w:p>
-            <w:pPr>
-              <w:spacing w:after="0" w:line="240" w:lineRule="auto"/>
-            </w:pPr>
-            <w:r>
-              <w:rPr>
-                <w:rFonts w:ascii="Times New Roman" w:hAnsi="Times New Roman"/>
-                <w:sz w:val="16"/>
-              </w:rPr>
-              <w:t>0.019</w:t>
-            </w:r>
-          </w:p>
-        </w:tc>
-        <w:tc>
-          <w:tcPr>
-            <w:tcW w:type="dxa" w:w="1337"/>
-            <w:vAlign w:val="center"/>
-            <w:tcMar>
-              <w:top w:w="80" w:type="dxa"/>
-              <w:start w:w="120" w:type="dxa"/>
-              <w:bottom w:w="80" w:type="dxa"/>
-              <w:end w:w="120" w:type="dxa"/>
-            </w:tcMar>
-          </w:tcPr>
-          <w:p>
-            <w:pPr>
-              <w:spacing w:after="0" w:line="240" w:lineRule="auto"/>
-            </w:pPr>
-            <w:r>
-              <w:rPr>
-                <w:rFonts w:ascii="Times New Roman" w:hAnsi="Times New Roman"/>
-                <w:sz w:val="16"/>
-              </w:rPr>
-              <w:t>1.101</w:t>
-            </w:r>
-          </w:p>
-        </w:tc>
-        <w:tc>
-          <w:tcPr>
-            <w:tcW w:type="dxa" w:w="1337"/>
-            <w:vAlign w:val="center"/>
-            <w:tcMar>
-              <w:top w:w="80" w:type="dxa"/>
-              <w:start w:w="120" w:type="dxa"/>
-              <w:bottom w:w="80" w:type="dxa"/>
-              <w:end w:w="120" w:type="dxa"/>
-            </w:tcMar>
-          </w:tcPr>
-          <w:p>
-            <w:pPr>
-              <w:spacing w:after="0" w:line="240" w:lineRule="auto"/>
-            </w:pPr>
-            <w:r>
-              <w:rPr>
-                <w:rFonts w:ascii="Times New Roman" w:hAnsi="Times New Roman"/>
-                <w:sz w:val="16"/>
-              </w:rPr>
-              <w:t>0.973</w:t>
-            </w:r>
-          </w:p>
-        </w:tc>
-        <w:tc>
-          <w:tcPr>
-            <w:tcW w:type="dxa" w:w="1337"/>
-            <w:vAlign w:val="center"/>
-            <w:tcMar>
-              <w:top w:w="80" w:type="dxa"/>
-              <w:start w:w="120" w:type="dxa"/>
-              <w:bottom w:w="80" w:type="dxa"/>
-              <w:end w:w="120" w:type="dxa"/>
-            </w:tcMar>
-          </w:tcPr>
-          <w:p>
-            <w:pPr>
-              <w:spacing w:after="0" w:line="240" w:lineRule="auto"/>
-            </w:pPr>
-            <w:r>
-              <w:rPr>
-                <w:rFonts w:ascii="Times New Roman" w:hAnsi="Times New Roman"/>
-                <w:sz w:val="16"/>
-              </w:rPr>
-              <w:t>1000</w:t>
-            </w:r>
-          </w:p>
-        </w:tc>
-      </w:tr>
-      <w:tr>
-        <w:tc>
-          <w:tcPr>
-            <w:tcW w:type="dxa" w:w="1337"/>
-            <w:vAlign w:val="center"/>
-            <w:tcMar>
-              <w:top w:w="80" w:type="dxa"/>
-              <w:start w:w="120" w:type="dxa"/>
-              <w:bottom w:w="80" w:type="dxa"/>
-              <w:end w:w="120" w:type="dxa"/>
-            </w:tcMar>
-          </w:tcPr>
-          <w:p>
-            <w:pPr>
-              <w:spacing w:after="0" w:line="240" w:lineRule="auto"/>
-            </w:pPr>
-            <w:r>
-              <w:rPr>
-                <w:rFonts w:ascii="Times New Roman" w:hAnsi="Times New Roman"/>
-                <w:sz w:val="16"/>
-              </w:rPr>
-              <w:t>position k-mer P</w:t>
-            </w:r>
-          </w:p>
-        </w:tc>
-        <w:tc>
-          <w:tcPr>
-            <w:tcW w:type="dxa" w:w="1337"/>
-            <w:vAlign w:val="center"/>
-            <w:tcMar>
-              <w:top w:w="80" w:type="dxa"/>
-              <w:start w:w="120" w:type="dxa"/>
-              <w:bottom w:w="80" w:type="dxa"/>
-              <w:end w:w="120" w:type="dxa"/>
-            </w:tcMar>
-          </w:tcPr>
-          <w:p>
-            <w:pPr>
-              <w:spacing w:after="0" w:line="240" w:lineRule="auto"/>
-            </w:pPr>
-            <w:r>
-              <w:rPr>
-                <w:rFonts w:ascii="Times New Roman" w:hAnsi="Times New Roman"/>
-                <w:sz w:val="16"/>
-              </w:rPr>
-              <w:t>0.167</w:t>
-            </w:r>
-          </w:p>
-        </w:tc>
-        <w:tc>
-          <w:tcPr>
-            <w:tcW w:type="dxa" w:w="1337"/>
-            <w:vAlign w:val="center"/>
-            <w:tcMar>
-              <w:top w:w="80" w:type="dxa"/>
-              <w:start w:w="120" w:type="dxa"/>
-              <w:bottom w:w="80" w:type="dxa"/>
-              <w:end w:w="120" w:type="dxa"/>
-            </w:tcMar>
-          </w:tcPr>
-          <w:p>
-            <w:pPr>
-              <w:spacing w:after="0" w:line="240" w:lineRule="auto"/>
-            </w:pPr>
-            <w:r>
-              <w:rPr>
-                <w:rFonts w:ascii="Times New Roman" w:hAnsi="Times New Roman"/>
-                <w:sz w:val="16"/>
-              </w:rPr>
-              <w:t>0.185</w:t>
-            </w:r>
-          </w:p>
-        </w:tc>
-        <w:tc>
-          <w:tcPr>
-            <w:tcW w:type="dxa" w:w="1337"/>
-            <w:vAlign w:val="center"/>
-            <w:tcMar>
-              <w:top w:w="80" w:type="dxa"/>
-              <w:start w:w="120" w:type="dxa"/>
-              <w:bottom w:w="80" w:type="dxa"/>
-              <w:end w:w="120" w:type="dxa"/>
-            </w:tcMar>
-          </w:tcPr>
-          <w:p>
-            <w:pPr>
-              <w:spacing w:after="0" w:line="240" w:lineRule="auto"/>
-            </w:pPr>
-            <w:r>
-              <w:rPr>
-                <w:rFonts w:ascii="Times New Roman" w:hAnsi="Times New Roman"/>
-                <w:sz w:val="16"/>
-              </w:rPr>
-              <w:t>0.017</w:t>
-            </w:r>
-          </w:p>
-        </w:tc>
-        <w:tc>
-          <w:tcPr>
-            <w:tcW w:type="dxa" w:w="1337"/>
-            <w:vAlign w:val="center"/>
-            <w:tcMar>
-              <w:top w:w="80" w:type="dxa"/>
-              <w:start w:w="120" w:type="dxa"/>
-              <w:bottom w:w="80" w:type="dxa"/>
-              <w:end w:w="120" w:type="dxa"/>
-            </w:tcMar>
-          </w:tcPr>
-          <w:p>
-            <w:pPr>
-              <w:spacing w:after="0" w:line="240" w:lineRule="auto"/>
-            </w:pPr>
-            <w:r>
-              <w:rPr>
-                <w:rFonts w:ascii="Times New Roman" w:hAnsi="Times New Roman"/>
-                <w:sz w:val="16"/>
-              </w:rPr>
-              <w:t>1.125</w:t>
-            </w:r>
-          </w:p>
-        </w:tc>
-        <w:tc>
-          <w:tcPr>
-            <w:tcW w:type="dxa" w:w="1337"/>
-            <w:vAlign w:val="center"/>
-            <w:tcMar>
-              <w:top w:w="80" w:type="dxa"/>
-              <w:start w:w="120" w:type="dxa"/>
-              <w:bottom w:w="80" w:type="dxa"/>
-              <w:end w:w="120" w:type="dxa"/>
-            </w:tcMar>
-          </w:tcPr>
-          <w:p>
-            <w:pPr>
-              <w:spacing w:after="0" w:line="240" w:lineRule="auto"/>
-            </w:pPr>
-            <w:r>
-              <w:rPr>
-                <w:rFonts w:ascii="Times New Roman" w:hAnsi="Times New Roman"/>
-                <w:sz w:val="16"/>
-              </w:rPr>
-              <w:t>0.972</w:t>
-            </w:r>
-          </w:p>
-        </w:tc>
-        <w:tc>
-          <w:tcPr>
-            <w:tcW w:type="dxa" w:w="1337"/>
-            <w:vAlign w:val="center"/>
-            <w:tcMar>
-              <w:top w:w="80" w:type="dxa"/>
-              <w:start w:w="120" w:type="dxa"/>
-              <w:bottom w:w="80" w:type="dxa"/>
-              <w:end w:w="120" w:type="dxa"/>
-            </w:tcMar>
-          </w:tcPr>
-          <w:p>
-            <w:pPr>
-              <w:spacing w:after="0" w:line="240" w:lineRule="auto"/>
-            </w:pPr>
-            <w:r>
-              <w:rPr>
-                <w:rFonts w:ascii="Times New Roman" w:hAnsi="Times New Roman"/>
-                <w:sz w:val="16"/>
-              </w:rPr>
-              <w:t>1536</w:t>
+              <w:t>balanced block-decomposable trade-off</w:t>
             </w:r>
           </w:p>
         </w:tc>
@@ -5503,7 +5350,7 @@
         <w:drawing>
           <wp:inline xmlns:a="http://schemas.openxmlformats.org/drawingml/2006/main" xmlns:pic="http://schemas.openxmlformats.org/drawingml/2006/picture">
             <wp:extent cx="5669280" cy="3152750"/>
-            <wp:docPr id="16" name="Picture 16" descr="Picture 16"/>
+            <wp:docPr id="14" name="Picture 14" descr="Picture 14"/>
             <wp:cNvGraphicFramePr>
               <a:graphicFrameLocks noChangeAspect="1"/>
             </wp:cNvGraphicFramePr>
@@ -5515,7 +5362,7 @@
                     <pic:cNvPicPr/>
                   </pic:nvPicPr>
                   <pic:blipFill>
-                    <a:blip r:embed="rId24"/>
+                    <a:blip r:embed="rId22"/>
                     <a:stretch>
                       <a:fillRect/>
                     </a:stretch>
@@ -5550,7 +5397,7 @@
     </w:p>
     <w:p>
       <w:r>
-        <w:t>These negative and boundary results are part of the manuscript's logic. They keep the claim focused on representation diagnostics and auxiliary robustness auditing, rather than allowing the compact feature space to be misread as a full biological interpretation system.</w:t>
+        <w:t>These negative and boundary results are part of the manuscript's logic. They keep the claim focused on representation diagnostics and representation-level perturbation auditing, rather than allowing the compact feature space to be misread as a full biological interpretation system.</w:t>
       </w:r>
     </w:p>
     <w:p>
@@ -5889,27 +5736,32 @@
     </w:p>
     <w:p>
       <w:r>
-        <w:t>This study treats short-read sequence representation as a diagnostic object rather than as a black-box prelude to classification. Across controlled short-read settings, exact identity evidence remained essential, but auxiliary biochemical and coarse positional summaries changed what could be measured under perturbation. CK4P-MSP was most informative in this role: it preserved a reverse-complement canonical 4-mer identity backbone while adding biochemical and multi-scale property pooling channels that improved perturbation stability and retained shallow readout at compact dimensionality.</w:t>
+        <w:t>This study treats short-read sequence representation as an inspectable object rather than only as a prelude to classification. Across controlled short-read settings, database-linked exact matching remained outside the representation itself, whereas canonical local k-mer composition, biochemical summaries and coarse positional summaries exposed different aspects of perturbation behaviour. CK4P-MSP provided a compact trade-off in this role: it preserved a reverse-complement canonical 4-mer composition block while adding global biochemical and multi-scale property-pooling channels that reduced drift relative to CK4/CK5 and retained local-change readability at compact dimensionality.</w:t>
       </w:r>
     </w:p>
     <w:p>
       <w:r>
-        <w:t>The results support a division of labor between representation families. Exact k-mer features provide the identity backbone needed for database-linked interpretation. Global biochemical summaries provide an auxiliary stability channel that can remain informative when individual exact matches are weakened by trimming, ambiguity or local perturbation. Multi-scale positional property pooling uses the same biochemical property family to return coarse layout information to an otherwise order-poor k-mer frequency vector; it is not a larger k-mer vocabulary or a learned token mapping. Full-position matrices, by contrast, define what can be gained when positional information is preserved almost explicitly; they are useful diagnostic upper bounds but are not the preferred compact representation.</w:t>
+        <w:t>The results support a division of labour between representation families. Canonical k-mer counts provide a compact local-composition backbone, while exact matching and alignment retain their distinct database-linked role. Global biochemical summaries provide the strongest global stability channel in the current grid. Multi-scale positional property pooling uses the same biochemical property family to add coarse layout summaries to an otherwise order-poor k-mer frequency vector and accounts for most of the grouped local-change readout gain. It is not a larger k-mer vocabulary, a learned token mapping or a reconstruction of full positional structure. Full-position matrices, by contrast, define what can be gained when positional information is preserved almost explicitly. They are useful diagnostic upper bounds but are not the preferred compact representation.</w:t>
       </w:r>
     </w:p>
     <w:p>
       <w:r>
-        <w:t>The additional analyses sharpen this interpretation. Same-dimension PCA/SVD controls show that the compact mixed representation is not simply benefiting from a larger feature budget. Dimension-matched high-k compressed baselines show that the stability result is not limited to comparisons with short contiguous k-mer counts: CK4P-MSP remained more stable than k=15 MinHash, hashed and random-projection controls at a comparable feature budget, although shallow readout differences were modest. Block-weight audits show that the conclusion is not tied to one arbitrary identity/property scaling. Paired Wilcoxon tests verify that the main stability contrasts are reproducible across matched analysis cells. The empirical MI and k-nearest-neighbor MI audits indicate that P/MSP distance summaries retain perturbation-relevant information beyond CK4 distance in the tested local-mutation regime. The direct P/MSP contribution audit showed that both CK4+P and CK4+MSP reduced drift relative to CK4, whereas MSP carried most of the local delta-readout gain. The redundancy audit further showed that P and MSP share a strong global property component but are not interchangeable: MSP has higher numerical rank and incomplete row-wise alignment with P. The P/MSP counterfactual audit separates sequence-linked biochemical information from feature-space expansion: permuted P/MSP blocks approach some stability behavior but do not reproduce the strongest delta-readout, whereas Gaussian auxiliary blocks fail both stability and readout. These analyses do not provide a general mathematical guarantee, but they reduce the likelihood that the geometric pattern is explained only by mixed-space dilution, feature count, redundancy or a single weighting choice.</w:t>
+        <w:t>The additional analyses sharpen this interpretation. Same-dimension PCA/SVD controls show that the compact mixed representation is not simply benefiting from a larger feature budget. Dimension-matched k=15 hashing-trick and sparse-projection controls were less stable than CK4P-MSP at the same 222-feature budget, although shallow-readout differences were modest. MinHash was evaluated separately in its native Jaccard geometry. The KSG-style audit indicated estimator-dependent local-versus-noise separability beyond the CK4 distance summary. In the seven-group ablation, property-only summaries were numerically stable but weakened nearest-clean retrieval; conditional contrasts assigned P primarily to global stability, MSP to local-change readability and K to composition-linked retrieval. These are metric-specific conditional contributions, not evidence of statistical independence or universal necessity.</w:t>
       </w:r>
     </w:p>
     <w:p>
       <w:r>
-        <w:t>The perturbation analyses also clarify the scope of the evidence. Uniform substitutions and local mutation sweeps provide controlled tests of representation behavior. ART adds a simulator-derived Illumina-like layer, and the quality-stratified ART audit shows that the main pattern persists across read-quality strata. CAMI_TOY_low provides a labelled external metagenomic readout probe, whereas the CAMI II marine subset provides a more complex anonymous-read external stability probe without read-level taxonomic labels in this lightweight analysis. Together, these data form a consistent body of evidence for representation-level robustness and readability. The manuscript reports the scale of each data layer so that controlled grids, simulator checks, labelled lightweight readout probes and anonymous-read stability probes are not conflated. These data do not constitute clinical validation, and they should not be described as such.</w:t>
+        <w:t>The direct P/MSP contribution audit showed that both CK4+P and CK4+MSP reduced drift relative to CK4, whereas MSP carried most of the grouped local delta-readout gain. The relation audit showed that P and MSP share a strong global property component, as expected from their shared source channels. Their functional roles were nevertheless not interchangeable in the ablation: P favoured global stability and MSP favoured local readout. This is an empirical decomposition under the current construction, not a claim of physical orthogonality or an independent-components proof.</w:t>
       </w:r>
     </w:p>
     <w:p>
       <w:r>
-        <w:t>A useful outcome of the boundary analyses is that they prevent overgeneralization. CSP and spaced-seed controls help interpret which matching-oriented priors transfer into dense read-level representations, but they do not become universal replacements for compact identity-property features. Context and ARG/SNP probes show that compact stability is not the same as allele-level or functional interpretation. Those tasks require database identity, annotation, sufficient context and downstream biological evidence.</w:t>
+        <w:t>The perturbation analyses also clarify the scope of the evidence. Uniform substitutions and local mutation sweeps provide controlled tests of representation behavior. The shared-template 50-75 bp sweep shows that the CK4P-MSP stability-readability profile persists across the lower short-read range without an abrupt 69-bp-specific discontinuity. The 100, 125 and 150 bp conditions remain broader anchors rather than part of a dense continuous sweep. ART adds current-contract Illumina-like simulator context: CK4P-MSP retained approximately 58-60% of CK4 drift within each tested length and preserved the same ordering across quality strata. Because the selected ART profile generated non-monotonic error loads across cycle lengths, these results support within-length consistency rather than a universal physical length law. CAMI_TOY_low provides labelled external readout probes: CK4P-MSP showed a small advantage on target-versus-background readout, but no advantage on the weak 30-label task. The CAMI II marine subset provides a more complex anonymous-read external stability probe without read-level taxonomic labels in this lightweight analysis. Its different composition makes the retained stability ordering informative, but does not turn it into pathogen-rich or clinical validation.</w:t>
+      </w:r>
+    </w:p>
+    <w:p>
+      <w:r>
+        <w:t>A useful outcome of the boundary analyses is that they prevent overgeneralization. CSP and spaced-seed controls help interpret which matching-oriented priors transfer into dense read-level representations, but they do not become general substitutes for compact identity-property features. Context and ARG/SNP probes show that compact stability is not the same as allele-level or functional interpretation. Those tasks require database identity, annotation, sufficient context and downstream biological evidence.</w:t>
       </w:r>
     </w:p>
     <w:p>
@@ -5922,37 +5774,37 @@
     </w:p>
     <w:p>
       <w:r>
-        <w:t>The first limitation is that the study evaluates representation diagnostics, not an operational mNGS classifier. Kraken 2, Centrifuge, CLARK, Kaiju and related systems remain the appropriate reference frame for database-linked taxonomic assignment. The present work asks a different question: what information remains visible before or alongside such assignment systems. Direct integration with production classifiers, including downstream false-hit reduction or classifier-output auditing, remains future work and is not evaluated here.</w:t>
+        <w:t>The first limitation is task scope. The study evaluates representation diagnostics, whereas Kraken 2, Centrifuge, CLARK, Kaiju and related systems remain the appropriate reference frame for database-linked taxonomic assignment. The present work asks what information remains visible before or alongside such assignment systems. Direct integration with production classifiers, including downstream false-hit reduction or classifier-output auditing, remains future work and is not evaluated here.</w:t>
       </w:r>
     </w:p>
     <w:p>
       <w:r>
-        <w:t>The second limitation is the perturbation model and external benchmark scale. Controlled substitutions, ambiguous-base perturbations and local mutation sweeps are useful because they isolate representation behavior, but they do not reproduce every physical process in sequencing data. ART and the quality-stratified ART audit partly address this issue by adding simulator-derived and quality-aware evidence. CAMI_TOY_low and CAMI II marine add external metagenomic resources, but with different roles: the former supports lightweight labelled readout, and the latter supports only paired stability because read-level taxonomic labels were not reconstructed for the anonymous reads in this lightweight probe. The resulting conclusions therefore remain bounded to controlled short-read, simulator-supported and external stability/readout settings, not to production-scale community profiling or unobserved clinical error distributions.</w:t>
+        <w:t>The second limitation is the perturbation model and external benchmark scale. Controlled substitutions, ambiguous-base perturbations and local mutation sweeps are useful because they isolate representation behavior, but they do not reproduce every physical process in sequencing data. ART adds current-contract simulator-derived context, although its cycle-specific error load prevents treating the seven ART lengths as a clean causal length experiment. CAMI_TOY_low and CAMI II marine add external metagenomic resources, but with different roles: the former supports lightweight labelled readout, and the latter supports only paired stability because read-level taxonomic labels were not reconstructed for the anonymous reads in this lightweight probe. The resulting conclusions therefore remain bounded to controlled short-read, simulator-contextualized and external stability/readout settings, not to production-scale community profiling or unobserved clinical error distributions.</w:t>
       </w:r>
     </w:p>
     <w:p>
       <w:r>
-        <w:t>The third limitation concerns data provenance. The 69 and 75 bp settings were selected as ultra-short read lengths that fall within a commonly reported post-QC mNGS range, and the restricted clinical reads themselves were not used in this study or publicly shared. This is compliant with the manuscript's current claim because the experiments use only the length conditions, not patient-level reads or patient-derived labels. Before submission, the authors should still confirm the institutional wording for describing the data-governance boundary.</w:t>
+        <w:t>The third limitation concerns read-length coverage and data provenance. The dense shared-template audit covers the lower 50-75 bp range, while 100, 125 and 150 bp are discrete broader anchors; the study therefore does not estimate a continuous response over the intervening 75-150 bp interval. The 69 and 75 bp conditions also reflect aggregate local sequencing context, but restricted local records were not used as study inputs or publicly shared. The experiments use length conditions, not patient-level reads or patient-derived labels. The final submission will include institutionally approved wording for this data-governance boundary.</w:t>
       </w:r>
     </w:p>
     <w:p>
       <w:r>
-        <w:t>The fourth limitation is that the MI and conditional-MI analyses are empirical. They support additional perturbation information in the tested feature channels, especially after the k-nearest-neighbor robustness audit, but they are not a general proof that a property-augmented representation always has higher mutual information than an identity-only representation. Likewise, the mixed L2 distance should be read as a standardized diagnostic drift after block construction and normalization, not as a natural metric that equates biochemical properties and k-mer counts as identical physical units. The correct claim is therefore conditional: under the tested local-perturbation grid and estimators, property-aware distance summaries carried additional mutation-relevant information relative to identity-only and permutation controls.</w:t>
+        <w:t>The fourth limitation is that the MI analyses are empirical. They support perturbation-associated signal in the tested distance summaries, especially after the KSG-style robustness audit, but they are not general evidence that a property-augmented representation always has higher mutual information than a composition-only representation. Likewise, mixed L2 should be read as standardized diagnostic drift after block construction and normalization, not as a natural metric that equates biochemical properties and k-mer counts as identical physical units. The correct claim is therefore conditional: under the tested local-perturbation grid and estimator, blockwise summaries showed additional local-versus-noise separability relative to CK4 alone.</w:t>
       </w:r>
     </w:p>
     <w:p>
       <w:r>
-        <w:t>The fifth limitation concerns MSP weighting and scale. The short-bin audit did not show catastrophic collapse at 69-75 bp, and finer multi-scale pooling improved delta-readout rather than immediately degrading it. Even so, the current MSP channel remains a static coarse summary. It is not an optimized variance-aware estimator, and the manuscript does not claim that its present binset or gamma weighting is universally optimal across read lengths, perturbation types or sequencing platforms.</w:t>
+        <w:t>The fifth limitation concerns MSP weighting and scale. The short-bin audit did not show an immediate loss of reliability across the 50-75 bp sweep, and finer multi-scale pooling increased delta-readout rather than immediately degrading it. Even so, the current MSP channel remains a static coarse summary. It is not an optimized variance-aware estimator, and the manuscript does not claim that its present binset or gamma weighting is universally optimal across read lengths, perturbation types or sequencing platforms.</w:t>
       </w:r>
     </w:p>
     <w:p>
       <w:r>
-        <w:t>The sixth limitation is computational scope. CK4P-MSP remained lightweight in absolute terms in the local implementation, but it was slower to extract than CK4 and simple high-k hashed or MinHash summaries. The method should therefore not be described as an engineering speed-up. Its value in this manuscript is interpretability and perturbation diagnostics under compact dimensionality; large-scale deployment would require optimized implementation and pipeline-level cost-benefit testing.</w:t>
+        <w:t>The sixth limitation is computational scope. CK4P-MSP remained compact but was slower to extract than hashed k=15 counts in the local implementation. Its value in this manuscript is interpretability and perturbation diagnostics under a fixed feature budget rather than engineering speed-up. Large-scale deployment would require optimized implementation and pipeline-level cost-benefit testing.</w:t>
       </w:r>
     </w:p>
     <w:p>
       <w:r>
-        <w:t>The seventh limitation is model scope. Large DNA language models and learned metagenomic classifiers provide powerful sequence representations, but they were not used as direct comparators here. This choice follows from the study's diagnostic goal. The paper evaluates decomposable identity, biochemical and positional channels under controlled short-read perturbation, whereas foundation-model embeddings are high-dimensional learned representations optimized for different transfer or prediction objectives. A direct comparison with such models would require a separate benchmark design.</w:t>
+        <w:t>The seventh limitation is model scope. Large DNA language models and learned metagenomic classifiers provide powerful sequence representations. They may outperform CK4P-MSP in predictive probes, especially when sufficient training data, pretraining and compute are available. CK4P-MSP instead provides a low-dimensional, training-free and block-decomposable coordinate system for auditing local composition, biochemical and coarse positional information under controlled short-read perturbation. Direct comparison with learned embeddings would require a separate benchmark design that reports both predictive accuracy and auditability.</w:t>
       </w:r>
     </w:p>
     <w:p>
@@ -5965,7 +5817,7 @@
     </w:p>
     <w:p>
       <w:r>
-        <w:t>Future work should test whether CK4P-MSP or related compact summaries improve failure-mode detection when placed alongside database-centered pipelines. Pipeline-facing false-hit reduction or classifier-output auditing would require downstream classifier outputs and explicit operating-point analysis. The most useful next step is not to replace exact matching, but to add representation-level diagnostics that report when identity evidence is fragile, when biochemical stability remains high, and when local-change sensitivity is preserved.</w:t>
+        <w:t>Future work should test whether CK4P-MSP or related compact summaries improve failure-mode detection when placed alongside database-centered pipelines. Pipeline-facing false-hit reduction or classifier-output auditing would require downstream classifier outputs and explicit operating-point analysis. The most useful next step is to add representation-level diagnostics that report when identity evidence is fragile, when biochemical stability remains high and when local-change sensitivity is preserved.</w:t>
       </w:r>
     </w:p>
     <w:p>
@@ -5980,7 +5832,7 @@
     </w:p>
     <w:p>
       <w:r>
-        <w:t>A fourth direction is to connect compact diagnostics with learned models. Full-position matrices and DNA foundation-model embeddings are natural candidates for follow-up studies because they may recover richer context than compact summaries. The present work suggests where such models should be audited: not only by final classification accuracy, but also by identity retention, perturbation stability, positional readability and local-change sensitivity.</w:t>
+        <w:t>A fourth direction is to connect compact diagnostics with learned models. Full-position matrices and DNA foundation-model embeddings are natural candidates for follow-up studies because they may recover richer context and stronger predictive signal than compact summaries. The present work suggests where such models should be audited: not only by final classification accuracy, but also by identity retention, perturbation stability, positional readability and local-change sensitivity.</w:t>
       </w:r>
     </w:p>
     <w:p>
@@ -5993,7 +5845,7 @@
     </w:p>
     <w:p>
       <w:r>
-        <w:t>This study shows that compact short-read representations can be evaluated as interpretable diagnostic objects. In controlled short-read settings, CK4P-MSP retained an exact identity backbone while adding global biochemical and positionalized biochemical channels that improved perturbation stability and preserved local-change readability. The evidence supports a bounded practical implication: biochemical and position-aware summaries may serve as auxiliary channels for representation-level robustness auditing alongside, rather than instead of, exact matching and curated database methods.</w:t>
+        <w:t>This study shows that compact short-read representations can be evaluated as interpretable audit objects. In controlled short-read settings, CK4P-MSP combined a canonical local k-mer composition block with global biochemical and positionalized biochemical channels to reduce drift relative to CK4/CK5 while preserving grouped local-change readability. The evidence supports a bounded implication: compact biochemical and coarse position-aware summaries can provide block-decomposable coordinates for representation-level perturbation auditing alongside database-linked exact matching and curated reference methods.</w:t>
       </w:r>
     </w:p>
     <w:p>
@@ -6006,12 +5858,12 @@
     </w:p>
     <w:p>
       <w:r>
-        <w:t>All processed data tables, figure source summaries and analysis outputs generated for this study are available in the project result folders and will be deposited in a public repository before submission. The current local source locations are info/results, info/paper/figures, info/paper/tables and info/scripts. The final public repository name, DOI/accession and licence are to be inserted before journal submission.</w:t>
+        <w:t>All processed data tables, figure source summaries and analysis outputs generated for this study are maintained in a private GitHub review repository under the FairYJmrx account, in the ultrashort-dna-representation-diagnostics repository on the release branch. Reviewer access will be provided through the submission system or by adding a journal-supplied account as a read-only collaborator. A public archival DOI will be minted from the frozen release when the authors make the repository public.</w:t>
       </w:r>
     </w:p>
     <w:p>
       <w:r>
-        <w:t>Publicly reused resources include simulator- and benchmark-derived materials used for ART, CAMI_TOY_low and CAMI II marine analyses, which should be cited through the corresponding primary publications and public resource records in the final reference list. The CAMI II marine lightweight probe used the public short-read sample 0 archive (https://frl.publisso.de/data/frl:6425521/marine/short_read/marmgCAMI2_sample_0_reads.tar.gz) and setup archive (https://frl.publisso.de/data/frl:6425521/marine/short_read/marmgCAMI2_setup.tar.gz). Only a streamed prefix was parsed for the lightweight stability probe, and read-level taxonomic labels were not reconstructed from the separate truth resources for this analysis; the generated subset tables, stability summaries and source figure table should be released with the processed data package. The restricted clinical sequencing provenance was used only to motivate the 69 and 75 bp read-length conditions, and the underlying clinical sequencing reads were not used as experimental input, are not part of the study data package, and cannot be publicly shared because they derive from a restricted clinical sequencing context.</w:t>
+        <w:t>Publicly reused resources include simulator- and benchmark-derived materials used for ART, CAMI_TOY_low and CAMI II marine analyses, which will be cited through the corresponding primary publications and public resource records in the final reference list. The CAMI II marine lightweight probe used the public CAMI II marine short-read sample 0 reads archive and its corresponding setup archive; exact resource URLs are listed in the review-access repository and will be included in the public archived release. Only a streamed prefix was parsed for the lightweight stability probe, and read-level taxonomic labels were not reconstructed from the separate truth resources for this analysis. The generated subset tables, stability summaries and source figure table are included in the review-access repository and will be included in the public release. Local restricted sequencing records were used only as read-length provenance for the 69 and 75 bp conditions. The underlying clinical sequencing reads were not used as experimental input, are not part of the study data package, and cannot be publicly shared.</w:t>
       </w:r>
     </w:p>
     <w:p>
@@ -6024,7 +5876,29 @@
     </w:p>
     <w:p>
       <w:r>
-        <w:t>The analysis scripts used to generate tables, figures and reviewer-response audits are maintained under info/scripts and will be released with the processed data package before submission. Key audit scripts include run_knn_mi_robustness_audit.py, run_high_k_compressed_baselines.py, run_p_msp_contribution_audit.py, run_property_redundancy_and_runtime_audit.py, generate_supp_fig_s8_redundancy_runtime_audit.py, run_p_channel_counterfactual_audit.py, run_msp_bin_gamma_sensitivity_audit.py, run_cami2_marine_lightweight_probe.py and generate_supp_fig_s10_cami2_marine_probe.py. The final repository URL, software licence and archived release identifier are to be inserted before journal submission.</w:t>
+        <w:t>The analysis scripts used to generate tables, figures and reviewer-response audits are maintained in the same private review-access repository under an MIT licence. The repository README and release manifest map each manuscript figure, table and supplementary audit to its source script, input tables and generated outputs. Reviewer access will be provided during submission, and a public archived release identifier will be added after public release.</w:t>
+      </w:r>
+    </w:p>
+    <w:p>
+      <w:pPr>
+        <w:pStyle w:val="Heading2"/>
+      </w:pPr>
+      <w:r>
+        <w:t>Supplementary Data</w:t>
+      </w:r>
+    </w:p>
+    <w:p>
+      <w:r>
+        <w:t xml:space="preserve">Supplementary Data are available at </w:t>
+      </w:r>
+      <w:r>
+        <w:rPr>
+          <w:i/>
+        </w:rPr>
+        <w:t>NAR Genomics and Bioinformatics</w:t>
+      </w:r>
+      <w:r>
+        <w:t xml:space="preserve"> Online. The supplementary file includes Supplementary Figures S1-S10 and Supplementary Tables S1 and S2. The underlying machine-readable source tables and figure-generation inputs are included in the review-access repository and will be included in the public archived release.</w:t>
       </w:r>
     </w:p>
     <w:p>
@@ -6037,7 +5911,7 @@
     </w:p>
     <w:p>
       <w:r>
-        <w:t>No patient-level clinical sequencing reads, patient identifiers or patient-derived labels were analyzed in this study. The authors should confirm the institutional wording for this boundary statement before submission.</w:t>
+        <w:t>No patient-level clinical sequencing reads, patient identifiers or patient-derived labels were analyzed in this study. Institutional wording for this boundary statement must be finalized before submission.</w:t>
       </w:r>
     </w:p>
     <w:p>
@@ -6050,7 +5924,7 @@
     </w:p>
     <w:p>
       <w:r>
-        <w:t>TBD before submission. Suggested CRediT-style roles to confirm: conceptualization; methodology; software; formal analysis; investigation; data curation; writing - original draft; writing - review and editing; visualization; supervision; funding acquisition.</w:t>
+        <w:t>Ruixiang Mei: Conceptualization, methodology, software, formal analysis, investigation, data curation, visualization, writing - original draft, and writing - review and editing. Jianhua Huang: Supervision and writing - review and editing. Ruixiang Mei ORCID: https://orcid.org/0009-0003-2128-0726.</w:t>
       </w:r>
     </w:p>
     <w:p>
@@ -6063,7 +5937,7 @@
     </w:p>
     <w:p>
       <w:r>
-        <w:t>TBD before submission. Insert grant numbers and funder names exactly as required by NAR/OUP.</w:t>
+        <w:t>Funding information will be finalized before submission.</w:t>
       </w:r>
     </w:p>
     <w:p>
@@ -6076,7 +5950,7 @@
     </w:p>
     <w:p>
       <w:r>
-        <w:t>TBD before submission. Include only contributors who meet acknowledgement criteria and do not meet authorship criteria.</w:t>
+        <w:t>Acknowledgements, if any, will be finalized before submission.</w:t>
       </w:r>
     </w:p>
     <w:p>
@@ -6089,7 +5963,7 @@
     </w:p>
     <w:p>
       <w:r>
-        <w:t>The authors should confirm the final statement before submission. If accurate, use: The authors declare no competing interests.</w:t>
+        <w:t>The authors declare no competing interests.</w:t>
       </w:r>
     </w:p>
     <w:p>
@@ -6153,7 +6027,7 @@
         <w:ind w:hanging="360" w:left="360"/>
       </w:pPr>
       <w:r>
-        <w:t>7. Wood, Derrick E.; Salzberg, Steven L. Kraken: Ultrafast Metagenomic Sequence Classification Using Exact Alignments. Genome Biology 2014;15:R46. doi:10.1186/gb-2014-15-3-r46</w:t>
+        <w:t>7. Wommack2008. Reference metadata to be verified before submission.</w:t>
       </w:r>
     </w:p>
     <w:p>
@@ -6161,7 +6035,7 @@
         <w:ind w:hanging="360" w:left="360"/>
       </w:pPr>
       <w:r>
-        <w:t>8. Wood, Derrick E.; Lu, Jennifer; Langmead, Ben Improved Metagenomic Analysis with Kraken 2. Genome Biology 2019;20:257. doi:10.1186/s13059-019-1891-0</w:t>
+        <w:t>8. Pearman2020. Reference metadata to be verified before submission.</w:t>
       </w:r>
     </w:p>
     <w:p>
@@ -6169,7 +6043,7 @@
         <w:ind w:hanging="360" w:left="360"/>
       </w:pPr>
       <w:r>
-        <w:t>9. Ounit, Rachid; Wanamaker, Steve; Close, Timothy J.; Lonardi, Stefano CLARK: Fast and Accurate Classification of Metagenomic and Genomic Sequences Using Discriminative k-mers. BMC Genomics 2015;16:236. doi:10.1186/s12864-015-1419-2</w:t>
+        <w:t>9. Wood, Derrick E.; Salzberg, Steven L. Kraken: Ultrafast Metagenomic Sequence Classification Using Exact Alignments. Genome Biology 2014;15:R46. doi:10.1186/gb-2014-15-3-r46</w:t>
       </w:r>
     </w:p>
     <w:p>
@@ -6177,7 +6051,7 @@
         <w:ind w:hanging="360" w:left="360"/>
       </w:pPr>
       <w:r>
-        <w:t>10. Kim, Daehwan; Song, Li; Breitwieser, Florian P.; Salzberg, Steven L. Centrifuge: Rapid and Sensitive Classification of Metagenomic Sequences. Genome Research 2016;26:1721--1729. doi:10.1101/gr.210641.116</w:t>
+        <w:t>10. Menzel, Peter; Ng, Kim Lee; Krogh, Anders Fast and Sensitive Taxonomic Classification for Metagenomics with Kaiju. Nature Communications 2016;7:11257. doi:10.1038/ncomms11257</w:t>
       </w:r>
     </w:p>
     <w:p>
@@ -6185,7 +6059,7 @@
         <w:ind w:hanging="360" w:left="360"/>
       </w:pPr>
       <w:r>
-        <w:t>11. Menzel, Peter; Ng, Kim Lee; Krogh, Anders Fast and Sensitive Taxonomic Classification for Metagenomics with Kaiju. Nature Communications 2016;7:11257. doi:10.1038/ncomms11257</w:t>
+        <w:t>11. Wood, Derrick E.; Lu, Jennifer; Langmead, Ben Improved Metagenomic Analysis with Kraken 2. Genome Biology 2019;20:257. doi:10.1186/s13059-019-1891-0</w:t>
       </w:r>
     </w:p>
     <w:p>
@@ -6193,7 +6067,7 @@
         <w:ind w:hanging="360" w:left="360"/>
       </w:pPr>
       <w:r>
-        <w:t>12. Sczyrba, Alexander; Hofmann, Peter; Belmann, Peter; Koslicki, David; Janssen, Stefan; Droege, Johannes; Gregor, Ivan; Majda, Stephan; Fiedler, Jessika; Dahms, Eik; Bremges, Andreas; Fritz, Adrian; Garrido-Oter, Ruben; Jorgensen, Tue Sparholt; Shapiro, Nicole; Blood, Philip D.; Gurevich, Alexey; Bai, Yang; Turaev, Dmitrij; DeMaere, Matthew Z.; Chikhi, Rayan; Nagarajan, Niranjan; Quince, Christopher; Meyer, Fernando; Balvociute, Monika; Hansen, Lars Hestbjerg; Sorensen, Soren J.; Chia, Nicholas; Denis, Bertrand; Froula, Jeff L.; Wang, Zhong; Egan, Rob; Don Kang, Dongwan; Cook, Jeffrey J.; Deltel, Charles; Beckstette, Michael; Lemaitre, Claire; Peterlongo, Pierre; Rizk, Guillaume; Lavenier, Dominique; Wu, Yu-Wei; Singer, Steven W.; Jain, Chirag; Strous, Marc; Klingenberg, Heiner; Meinicke, Peter; Barton, Michael D.; Lingner, Thomas; Lin, Hsin-Hung; Liao, Yu-Chieh; Silva, Genivaldo Gueiros Z.; Cuevas, Daniel A.; Edwards, Robert A.; Saha, Surya; Piro, Vitor C.; Renard, Bernhard Y.; Pop, Mihai; Klenk, Hans-Peter; Goeker, Markus; Kyrpides, Nikos C.; Woyke, Tanja; Vorholt, Julia A.; Schulze-Lefert, Paul; Rubin, Edward M.; Darling, Aaron E.; Rattei, Thomas; McHardy, Alice C. Critical Assessment of Metagenome Interpretation - a Benchmark of Metagenomics Software. Nature Methods 2017;14:1063--1071. doi:10.1038/nmeth.4458</w:t>
+        <w:t>12. Ounit, Rachid; Wanamaker, Steve; Close, Timothy J.; Lonardi, Stefano CLARK: Fast and Accurate Classification of Metagenomic and Genomic Sequences Using Discriminative k-mers. BMC Genomics 2015;16:236. doi:10.1186/s12864-015-1419-2</w:t>
       </w:r>
     </w:p>
     <w:p>
@@ -6201,7 +6075,7 @@
         <w:ind w:hanging="360" w:left="360"/>
       </w:pPr>
       <w:r>
-        <w:t>13. Meyer, Fernando; Fritz, Adrian; Deng, Zhi-Luo; Koslicki, David; Gurevich, Alexey; Robertson, Gary; Alser, Mohammed; Antipov, Dmitry; Beghini, Francesco; Bertrand, Denis; Brito, Jaqueline J.; Brown, C. Titus; Buchmann, Jan; Buluc, Aydin; Chen, Bo; Chikhi, Rayan; Clausen, Philip T. L. C.; Cristian, Alesia; Dabrowski, Piotr W.; Darling, Aaron E.; Egan, Rob; Eskin, Eleazar; Georganas, Evangelos; Goltsman, Eugene; Gray, Melissa A.; Hansen, Lars Hestbjerg; Hofmeyr, Steven; Huang, Pingqin; Irber, Luiz; Jia, Hongying; Jorgensen, Tue Sparholt; Karim, Md. Rezaul; Klemetsen, Terje; Kola, Axel; Koren, Sergey; Kwan, Jason; LaPierre, Nathan; Lemaitre, Claire; Li, Chen; Limasset, Antoine; Malcher-Miranda, Fabio; Mangul, Serghei; Marcelino, Vanessa R.; Marchet, Camille; Marijon, Pierre; Meleshko, Dmitry; Mende, Daniel R.; Milanese, Alessio; Nagarajan, Niranjan; Nissen, Jakob; Nurk, Sergey; Oliker, Leonid; Paez-Espino, David; Peterlongo, Pierre; Piro, Vitor C.; Porter, Jacob S.; Rasmussen, Simon; Rees, Evan R.; Reinert, Knut; Renard, Bernhard Y.; Robertsen, Espen M.; Rosen, Gail L.; Ruscheweyh, Hans-Joachim; Sarwal, Varuni; Segata, Nicola; Seiler, Enrico; Shi, Lizhen; Sun, Fengzhu; Sunagawa, Shinichi; Sorensen, Soren J.; Thomas, Torsten; Tong, Chengchen; Trajkovski, Mirko; Tremblay, Julien; Uritskiy, Gherman V.; Vicedomini, Riccardo; Wang, Zhong; Ye, Yuzhen; Yilmaz, Pelin; You, Ronghui; Zeller, Georg; Zhao, Sen; Zhu, Shanfeng; Zhu, Shaochun; Garrido-Oter, Ruben; Gastmeier, Petra; Hacquard, Stephane; Haussler, Susanne; Khaledi, Ariane; Maechler, Friederike; Mesny, Fantin; Radutoiu, Simona; Schulze-Lefert, Paul; Smit, Nathiana; Strowig, Till; Bremges, Andreas; Sczyrba, Alexander; McHardy, Alice C. Critical Assessment of Metagenome Interpretation: the Second Round of Challenges. Nature Methods 2022;19:429--440. doi:10.1038/s41592-022-01431-4</w:t>
+        <w:t>13. Kim, Daehwan; Song, Li; Breitwieser, Florian P.; Salzberg, Steven L. Centrifuge: Rapid and Sensitive Classification of Metagenomic Sequences. Genome Research 2016;26:1721--1729. doi:10.1101/gr.210641.116</w:t>
       </w:r>
     </w:p>
     <w:p>
@@ -6209,7 +6083,7 @@
         <w:ind w:hanging="360" w:left="360"/>
       </w:pPr>
       <w:r>
-        <w:t>14. Brinda, Karel; Sykulski, Michal; Kucherov, Gregory Spaced Seeds Improve k-mer-based Metagenomic Classification. Bioinformatics 2015;31:3584--3592. doi:10.1093/bioinformatics/btv419</w:t>
+        <w:t>14. Sczyrba, Alexander; Hofmann, Peter; Belmann, Peter; Koslicki, David; Janssen, Stefan; Droege, Johannes; Gregor, Ivan; Majda, Stephan; Fiedler, Jessika; Dahms, Eik; Bremges, Andreas; Fritz, Adrian; Garrido-Oter, Ruben; Jorgensen, Tue Sparholt; Shapiro, Nicole; Blood, Philip D.; Gurevich, Alexey; Bai, Yang; Turaev, Dmitrij; DeMaere, Matthew Z.; Chikhi, Rayan; Nagarajan, Niranjan; Quince, Christopher; Meyer, Fernando; Balvociute, Monika; Hansen, Lars Hestbjerg; Sorensen, Soren J.; Chia, Nicholas; Denis, Bertrand; Froula, Jeff L.; Wang, Zhong; Egan, Rob; Don Kang, Dongwan; Cook, Jeffrey J.; Deltel, Charles; Beckstette, Michael; Lemaitre, Claire; Peterlongo, Pierre; Rizk, Guillaume; Lavenier, Dominique; Wu, Yu-Wei; Singer, Steven W.; Jain, Chirag; Strous, Marc; Klingenberg, Heiner; Meinicke, Peter; Barton, Michael D.; Lingner, Thomas; Lin, Hsin-Hung; Liao, Yu-Chieh; Silva, Genivaldo Gueiros Z.; Cuevas, Daniel A.; Edwards, Robert A.; Saha, Surya; Piro, Vitor C.; Renard, Bernhard Y.; Pop, Mihai; Klenk, Hans-Peter; Goeker, Markus; Kyrpides, Nikos C.; Woyke, Tanja; Vorholt, Julia A.; Schulze-Lefert, Paul; Rubin, Edward M.; Darling, Aaron E.; Rattei, Thomas; McHardy, Alice C. Critical Assessment of Metagenome Interpretation - a Benchmark of Metagenomics Software. Nature Methods 2017;14:1063--1071. doi:10.1038/nmeth.4458</w:t>
       </w:r>
     </w:p>
     <w:p>
@@ -6217,7 +6091,7 @@
         <w:ind w:hanging="360" w:left="360"/>
       </w:pPr>
       <w:r>
-        <w:t>15. Krawczyk, Pawel S.; Lipinski, Leszek; Dziembowski, Andrzej PlasFlow: Predicting Plasmid Sequences in Metagenomic Data Using Genome Signatures. Nucleic Acids Research 2018;46:e35. doi:10.1093/nar/gkx1321</w:t>
+        <w:t>15. Meyer, Fernando; Fritz, Adrian; Deng, Zhi-Luo; Koslicki, David; Gurevich, Alexey; Robertson, Gary; Alser, Mohammed; Antipov, Dmitry; Beghini, Francesco; Bertrand, Denis; Brito, Jaqueline J.; Brown, C. Titus; Buchmann, Jan; Buluc, Aydin; Chen, Bo; Chikhi, Rayan; Clausen, Philip T. L. C.; Cristian, Alesia; Dabrowski, Piotr W.; Darling, Aaron E.; Egan, Rob; Eskin, Eleazar; Georganas, Evangelos; Goltsman, Eugene; Gray, Melissa A.; Hansen, Lars Hestbjerg; Hofmeyr, Steven; Huang, Pingqin; Irber, Luiz; Jia, Hongying; Jorgensen, Tue Sparholt; Karim, Md. Rezaul; Klemetsen, Terje; Kola, Axel; Koren, Sergey; Kwan, Jason; LaPierre, Nathan; Lemaitre, Claire; Li, Chen; Limasset, Antoine; Malcher-Miranda, Fabio; Mangul, Serghei; Marcelino, Vanessa R.; Marchet, Camille; Marijon, Pierre; Meleshko, Dmitry; Mende, Daniel R.; Milanese, Alessio; Nagarajan, Niranjan; Nissen, Jakob; Nurk, Sergey; Oliker, Leonid; Paez-Espino, David; Peterlongo, Pierre; Piro, Vitor C.; Porter, Jacob S.; Rasmussen, Simon; Rees, Evan R.; Reinert, Knut; Renard, Bernhard Y.; Robertsen, Espen M.; Rosen, Gail L.; Ruscheweyh, Hans-Joachim; Sarwal, Varuni; Segata, Nicola; Seiler, Enrico; Shi, Lizhen; Sun, Fengzhu; Sunagawa, Shinichi; Sorensen, Soren J.; Thomas, Torsten; Tong, Chengchen; Trajkovski, Mirko; Tremblay, Julien; Uritskiy, Gherman V.; Vicedomini, Riccardo; Wang, Zhong; Ye, Yuzhen; Yilmaz, Pelin; You, Ronghui; Zeller, Georg; Zhao, Sen; Zhu, Shanfeng; Zhu, Shaochun; Garrido-Oter, Ruben; Gastmeier, Petra; Hacquard, Stephane; Haussler, Susanne; Khaledi, Ariane; Maechler, Friederike; Mesny, Fantin; Radutoiu, Simona; Schulze-Lefert, Paul; Smit, Nathiana; Strowig, Till; Bremges, Andreas; Sczyrba, Alexander; McHardy, Alice C. Critical Assessment of Metagenome Interpretation: the Second Round of Challenges. Nature Methods 2022;19:429--440. doi:10.1038/s41592-022-01431-4</w:t>
       </w:r>
     </w:p>
     <w:p>
@@ -6225,7 +6099,7 @@
         <w:ind w:hanging="360" w:left="360"/>
       </w:pPr>
       <w:r>
-        <w:t>16. Fiannaca, Antonino; La Paglia, Laura; La Rosa, Massimo; Lo Bosco, Giosue'; Urso, Antonio; others Deep Learning Models for Bacteria Taxonomic Classification of Metagenomic Data. BMC Bioinformatics 2018;19:198. doi:10.1186/s12859-018-2182-6</w:t>
+        <w:t>16. Brinda, Karel; Sykulski, Michal; Kucherov, Gregory Spaced Seeds Improve k-mer-based Metagenomic Classification. Bioinformatics 2015;31:3584--3592. doi:10.1093/bioinformatics/btv419</w:t>
       </w:r>
     </w:p>
     <w:p>
@@ -6233,7 +6107,7 @@
         <w:ind w:hanging="360" w:left="360"/>
       </w:pPr>
       <w:r>
-        <w:t>17. Fuhl, Wolfgang; Zabel, Susanne; Nieselt, Kay Resource Saving Taxonomy Classification with k-mer Distributions and Machine Learning.  2023.</w:t>
+        <w:t>17. Krawczyk, Pawel S.; Lipinski, Leszek; Dziembowski, Andrzej PlasFlow: Predicting Plasmid Sequences in Metagenomic Data Using Genome Signatures. Nucleic Acids Research 2018;46:e35. doi:10.1093/nar/gkx1321</w:t>
       </w:r>
     </w:p>
     <w:p>
@@ -6241,7 +6115,7 @@
         <w:ind w:hanging="360" w:left="360"/>
       </w:pPr>
       <w:r>
-        <w:t>18. Ondov, Brian D.; Treangen, Todd J.; Melsted, Pall; Mallonee, Adam B.; Bergman, Nicholas H.; Koren, Sergey; Phillippy, Adam M. Mash: Fast Genome and Metagenome Distance Estimation Using MinHash. Genome Biology 2016;17:132. doi:10.1186/s13059-016-0997-x</w:t>
+        <w:t>18. Fiannaca, Antonino; La Paglia, Laura; La Rosa, Massimo; Lo Bosco, Giosue'; Urso, Antonio; others Deep Learning Models for Bacteria Taxonomic Classification of Metagenomic Data. BMC Bioinformatics 2018;19:198. doi:10.1186/s12859-018-2182-6</w:t>
       </w:r>
     </w:p>
     <w:p>
@@ -6249,7 +6123,7 @@
         <w:ind w:hanging="360" w:left="360"/>
       </w:pPr>
       <w:r>
-        <w:t>19. Zielezinski, Andrzej; Vinga, Susana; Almeida, Jonas; Karlowski, Wojciech M. Alignment-free Sequence Comparison: Benefits, Applications, and Tools. Genome Biology 2017;18:186. doi:10.1186/s13059-017-1319-7</w:t>
+        <w:t>19. Fuhl, Wolfgang; Zabel, Susanne; Nieselt, Kay Resource Saving Taxonomy Classification with k-mer Distributions and Machine Learning. arXiv 2023. doi:10.48550/arXiv.2303.06154</w:t>
       </w:r>
     </w:p>
     <w:p>
@@ -6257,7 +6131,7 @@
         <w:ind w:hanging="360" w:left="360"/>
       </w:pPr>
       <w:r>
-        <w:t>20. Jeffrey, H. Joel Chaos Game Representation of Gene Structure. Nucleic Acids Research 1990;18:2163--2170. doi:10.1093/nar/18.8.2163</w:t>
+        <w:t>20. Ondov, Brian D.; Treangen, Todd J.; Melsted, Pall; Mallonee, Adam B.; Bergman, Nicholas H.; Koren, Sergey; Phillippy, Adam M. Mash: Fast Genome and Metagenome Distance Estimation Using MinHash. Genome Biology 2016;17:132. doi:10.1186/s13059-016-0997-x</w:t>
       </w:r>
     </w:p>
     <w:p>
@@ -6265,7 +6139,7 @@
         <w:ind w:hanging="360" w:left="360"/>
       </w:pPr>
       <w:r>
-        <w:t>21. Voss, Richard F. Evolution of Long-range Fractal Correlations and 1/f Noise in DNA Base Sequences. Physical Review Letters 1992;68:3805--3808. doi:10.1103/PhysRevLett.68.3805</w:t>
+        <w:t>21. Zielezinski, Andrzej; Vinga, Susana; Almeida, Jonas; Karlowski, Wojciech M. Alignment-free Sequence Comparison: Benefits, Applications, and Tools. Genome Biology 2017;18:186. doi:10.1186/s13059-017-1319-7</w:t>
       </w:r>
     </w:p>
     <w:p>
@@ -6273,7 +6147,7 @@
         <w:ind w:hanging="360" w:left="360"/>
       </w:pPr>
       <w:r>
-        <w:t>22. Anastassiou, Dimitris Genomic Signal Processing. IEEE Signal Processing Magazine 2001;18:8--20. doi:10.1109/79.939833</w:t>
+        <w:t>22. Jeffrey, H. Joel Chaos Game Representation of Gene Structure. Nucleic Acids Research 1990;18:2163--2170. doi:10.1093/nar/18.8.2163</w:t>
       </w:r>
     </w:p>
     <w:p>
@@ -6281,7 +6155,7 @@
         <w:ind w:hanging="360" w:left="360"/>
       </w:pPr>
       <w:r>
-        <w:t>23. Cristea, Paul D. Conversion of Nucleotides Sequences into Genomic Signals. Journal of Cellular and Molecular Medicine 2002;6:279--303. doi:10.1111/j.1582-4934.2002.tb00196.x</w:t>
+        <w:t>23. Voss, Richard F. Evolution of Long-range Fractal Correlations and 1/f Noise in DNA Base Sequences. Physical Review Letters 1992;68:3805--3808. doi:10.1103/PhysRevLett.68.3805</w:t>
       </w:r>
     </w:p>
     <w:p>
@@ -6289,7 +6163,7 @@
         <w:ind w:hanging="360" w:left="360"/>
       </w:pPr>
       <w:r>
-        <w:t>24. Mendizabal-Ruiz, Gerardo; Rom{\'a}n-God{\'i}nez, Israel; Torres-Ramos, Sulema; Salido-Ruiz, Ricardo A.; Morales, J. Alejandro On DNA Numerical Representations for Genomic Similarity Computation. PLOS ONE 2017;12:e0173288. doi:10.1371/journal.pone.0173288</w:t>
+        <w:t>24. Anastassiou, Dimitris Genomic Signal Processing. IEEE Signal Processing Magazine 2001;18:8--20. doi:10.1109/79.939833</w:t>
       </w:r>
     </w:p>
     <w:p>
@@ -6297,7 +6171,7 @@
         <w:ind w:hanging="360" w:left="360"/>
       </w:pPr>
       <w:r>
-        <w:t>25. Mendizabal-Ruiz, Gerardo; Rom{\'a}n-God{\'i}nez, Israel; Torres-Ramos, Sulema; Salido-Ruiz, Ricardo A.; Morales, J. Alejandro Genomic Signal Processing for DNA Sequence Clustering. PeerJ 2018;6:e4264. doi:10.7717/peerj.4264</w:t>
+        <w:t>25. Cristea, Paul D. Conversion of Nucleotides Sequences into Genomic Signals. Journal of Cellular and Molecular Medicine 2002;6:279--303. doi:10.1111/j.1582-4934.2002.tb00196.x</w:t>
       </w:r>
     </w:p>
     <w:p>
@@ -6305,7 +6179,7 @@
         <w:ind w:hanging="360" w:left="360"/>
       </w:pPr>
       <w:r>
-        <w:t>26. Nair, Achuthsankar S.; Sreenadhan, Sivarama Pillai A Coding Measure Scheme Employing Electron-Ion Interaction Pseudopotential. Bioinformation 2006;1:197--202.</w:t>
+        <w:t>26. Mendizabal-Ruiz, Gerardo; Rom{\'a}n-God{\'i}nez, Israel; Torres-Ramos, Sulema; Salido-Ruiz, Ricardo A.; Morales, J. Alejandro On DNA Numerical Representations for Genomic Similarity Computation. PLOS ONE 2017;12:e0173288. doi:10.1371/journal.pone.0173288</w:t>
       </w:r>
     </w:p>
     <w:p>
@@ -6313,7 +6187,7 @@
         <w:ind w:hanging="360" w:left="360"/>
       </w:pPr>
       <w:r>
-        <w:t>27. Liang, Qiaoxing; Bible, Paul W.; Liu, Youping; Zou, Bin; Wei, Li DeepMicrobes: Taxonomic Classification for Metagenomics with Deep Learning. NAR Genomics and Bioinformatics 2020;2:lqaa009. doi:10.1093/nargab/lqaa009</w:t>
+        <w:t>27. Mendizabal-Ruiz, Gerardo; Rom{\'a}n-God{\'i}nez, Israel; Torres-Ramos, Sulema; Salido-Ruiz, Ricardo A.; Morales, J. Alejandro Genomic Signal Processing for DNA Sequence Clustering. PeerJ 2018;6:e4264. doi:10.7717/peerj.4264</w:t>
       </w:r>
     </w:p>
     <w:p>
@@ -6321,7 +6195,7 @@
         <w:ind w:hanging="360" w:left="360"/>
       </w:pPr>
       <w:r>
-        <w:t>28. Wichmann, Felix; Zamudio, Jose R.; Eils, Roland; Schlesner, Matthias MetaTransformer: Deep Metagenomic Sequencing Read Classification Using Self-attention Models. NAR Genomics and Bioinformatics 2023;5:lqad082. doi:10.1093/nargab/lqad082</w:t>
+        <w:t>28. Nair, Achuthsankar S.; Sreenadhan, Sivarama Pillai A Coding Measure Scheme Employing Electron-Ion Interaction Pseudopotential. Bioinformation 2006;1:197--202.</w:t>
       </w:r>
     </w:p>
     <w:p>
@@ -6329,7 +6203,7 @@
         <w:ind w:hanging="360" w:left="360"/>
       </w:pPr>
       <w:r>
-        <w:t>29. Mock, Florian; Kretschmer, Fleming; Kriese, Anton; B{\"o}cker, Sebastian; Marz, Manja Taxonomic Classification of DNA Sequences Beyond Sequence Similarity Using Deep Neural Networks. Proceedings of the National Academy of Sciences 2022;119:e2122636119. doi:10.1073/pnas.2122636119</w:t>
+        <w:t>29. Liang, Qiaoxing; Bible, Paul W.; Liu, Youping; Zou, Bin; Wei, Li DeepMicrobes: Taxonomic Classification for Metagenomics with Deep Learning. NAR Genomics and Bioinformatics 2020;2:lqaa009. doi:10.1093/nargab/lqaa009</w:t>
       </w:r>
     </w:p>
     <w:p>
@@ -6337,7 +6211,7 @@
         <w:ind w:hanging="360" w:left="360"/>
       </w:pPr>
       <w:r>
-        <w:t>30. Millan Arias, Pablo; Sadjadi, Niousha; Safari, Monireh; Gong, ZeMing; Wang, Austin T.; Haurum, Joakim Bruslund; Zarubiieva, Iuliia; Steinke, Dirk; Kari, Lila; Chang, Angel X.; Lowe, Scott C.; Taylor, Graham W. BarcodeBERT: Transformers for Biodiversity Analyses. Bioinformatics Advances 2026;6:vbag054. doi:10.1093/bioadv/vbag054</w:t>
+        <w:t>30. Wichmann, Felix; Zamudio, Jose R.; Eils, Roland; Schlesner, Matthias MetaTransformer: Deep Metagenomic Sequencing Read Classification Using Self-attention Models. NAR Genomics and Bioinformatics 2023;5:lqad082. doi:10.1093/nargab/lqad082</w:t>
       </w:r>
     </w:p>
     <w:p>
@@ -6345,7 +6219,7 @@
         <w:ind w:hanging="360" w:left="360"/>
       </w:pPr>
       <w:r>
-        <w:t>31. Zhou, Zhihan; Ji, Yanrong; Li, Weijian; Dutta, Pratik; Davuluri, Ramana V.; Liu, Han DNABERT-2: Efficient Foundation Model and Benchmark for Multi-Species Genome.  2024. doi:10.48550/arXiv.2306.15006</w:t>
+        <w:t>31. Mock, Florian; Kretschmer, Fleming; Kriese, Anton; B{\"o}cker, Sebastian; Marz, Manja Taxonomic Classification of DNA Sequences Beyond Sequence Similarity Using Deep Neural Networks. Proceedings of the National Academy of Sciences 2022;119:e2122636119. doi:10.1073/pnas.2122636119</w:t>
       </w:r>
     </w:p>
     <w:p>
@@ -6353,7 +6227,7 @@
         <w:ind w:hanging="360" w:left="360"/>
       </w:pPr>
       <w:r>
-        <w:t>32. Dalla-Torre, Hugo; Gonzalez, Liam; Mendoza-Revilla, Javier; Carranza, Nicolas Lopez; Grzywaczewski, Adam H.; Oteri, Francesco; Dallago, Christian; Trop, Evan; Sirelkhatim, Hassan; Richard, Guillaume; Skwark, Marcin J.; Beguir, Karim; Lopez, Monica; Pierrot, Thomas Nucleotide Transformer: Building and Evaluating Robust Foundation Models for Human Genomics. Nature Methods 2025;22:287--297. doi:10.1038/s41592-024-02523-z</w:t>
+        <w:t>32. Millan Arias, Pablo; Sadjadi, Niousha; Safari, Monireh; Gong, ZeMing; Wang, Austin T.; Haurum, Joakim Bruslund; Zarubiieva, Iuliia; Steinke, Dirk; Kari, Lila; Chang, Angel X.; Lowe, Scott C.; Taylor, Graham W. BarcodeBERT: Transformers for Biodiversity Analyses. Bioinformatics Advances 2026;6:vbag054. doi:10.1093/bioadv/vbag054</w:t>
       </w:r>
     </w:p>
     <w:p>
@@ -6361,7 +6235,7 @@
         <w:ind w:hanging="360" w:left="360"/>
       </w:pPr>
       <w:r>
-        <w:t>33. Nguyen, Eric; Poli, Michael; Faizi, Marjan; Thomas, Armin W.; Birch-Sykes, Camden; Wornow, Michael; Patel, Aman; Rabideau, Charles; Massaroli, Stefano; Bengio, Yoshua; Ermon, Stefano; Baccus, Stephen A.; Re, Christopher HyenaDNA: Long-Range Genomic Sequence Modeling at Single Nucleotide Resolution.  2023.</w:t>
+        <w:t>33. Zhou, Zhihan; Ji, Yanrong; Li, Weijian; Dutta, Pratik; Davuluri, Ramana V.; Liu, Han DNABERT-2: Efficient Foundation Model and Benchmark for Multi-Species Genome. arXiv 2024. doi:10.48550/arXiv.2306.15006</w:t>
       </w:r>
     </w:p>
     <w:p>
@@ -6369,7 +6243,7 @@
         <w:ind w:hanging="360" w:left="360"/>
       </w:pPr>
       <w:r>
-        <w:t>34. Nguyen, Eric; Poli, Michael; Durrant, Matthew G.; Kang, Brian; Katrekar, Dhruva; Li, David B.; Bartie, Liam J.; Thomas, Armin W.; King, Samuel H.; Brixi, Garyk; Sullivan, Jeremy; Ng, Madelena Y.; Lewis, Ashley; Lou, Aaron; Ermon, Stefano; Baccus, Stephen A.; Hernandez-Boussard, Tina; Re, Christopher; Hsu, Patrick D.; Hie, Brian L. Sequence Modeling and Design from Molecular to Genome Scale with Evo. Science 2024;386:eado9336. doi:10.1126/science.ado9336</w:t>
+        <w:t>34. Dalla-Torre, Hugo; Gonzalez, Liam; Mendoza-Revilla, Javier; Carranza, Nicolas Lopez; Grzywaczewski, Adam H.; Oteri, Francesco; Dallago, Christian; Trop, Evan; Sirelkhatim, Hassan; Richard, Guillaume; Skwark, Marcin J.; Beguir, Karim; Lopez, Monica; Pierrot, Thomas Nucleotide Transformer: Building and Evaluating Robust Foundation Models for Human Genomics. Nature Methods 2025;22:287--297. doi:10.1038/s41592-024-02523-z</w:t>
       </w:r>
     </w:p>
     <w:p>
@@ -6377,7 +6251,7 @@
         <w:ind w:hanging="360" w:left="360"/>
       </w:pPr>
       <w:r>
-        <w:t>35. Fishman, Veniamin; Kuratov, Yuri; Shmelev, Aleksei; Petrov, Maxim; Penzar, Dmitry; Shepelin, Denis; Chekanov, Nikolay; Kardymon, Olga; Burtsev, Mikhail GENA-LM: A Family of Open-source Foundational DNA Language Models for Long Sequences. Nucleic Acids Research 2025;53:gkae1310. doi:10.1093/nar/gkae1310</w:t>
+        <w:t>35. Nguyen, Eric; Poli, Michael; Faizi, Marjan; Thomas, Armin W.; Birch-Sykes, Camden; Wornow, Michael; Patel, Aman; Rabideau, Charles; Massaroli, Stefano; Bengio, Yoshua; Ermon, Stefano; Baccus, Stephen A.; Re, Christopher HyenaDNA: Long-Range Genomic Sequence Modeling at Single Nucleotide Resolution. arXiv 2023. doi:10.48550/arXiv.2306.15794</w:t>
       </w:r>
     </w:p>
     <w:p>
@@ -6385,7 +6259,7 @@
         <w:ind w:hanging="360" w:left="360"/>
       </w:pPr>
       <w:r>
-        <w:t>36. Rojas-Carulla, Mateo; Tolstikhin, Ilya; Luque, Guillermo; Youngblut, Nicholas; Ley, Ruth; Sch{\"o}lkopf, Bernhard GeNet: Deep Representations for Metagenomics.  2019.</w:t>
+        <w:t>36. Nguyen, Eric; Poli, Michael; Durrant, Matthew G.; Kang, Brian; Katrekar, Dhruva; Li, David B.; Bartie, Liam J.; Thomas, Armin W.; King, Samuel H.; Brixi, Garyk; Sullivan, Jeremy; Ng, Madelena Y.; Lewis, Ashley; Lou, Aaron; Ermon, Stefano; Baccus, Stephen A.; Hernandez-Boussard, Tina; Re, Christopher; Hsu, Patrick D.; Hie, Brian L. Sequence Modeling and Design from Molecular to Genome Scale with Evo. Science 2024;386:eado9336. doi:10.1126/science.ado9336</w:t>
       </w:r>
     </w:p>
     <w:p>
@@ -6393,7 +6267,7 @@
         <w:ind w:hanging="360" w:left="360"/>
       </w:pPr>
       <w:r>
-        <w:t>37. Ren, Jie; Song, Kai; Deng, Chao; Ahlgren, Nathan A.; Fuhrman, Jed A.; Li, Yi; Xie, Xiaohui; Poplin, Ryan; Sun, Fengzhu Identifying Viruses from Metagenomic Data Using Deep Learning. Quantitative Biology 2020;8:64--77. doi:10.1007/s40484-019-0187-4</w:t>
+        <w:t>37. Fishman, Veniamin; Kuratov, Yuri; Shmelev, Aleksei; Petrov, Maxim; Penzar, Dmitry; Shepelin, Denis; Chekanov, Nikolay; Kardymon, Olga; Burtsev, Mikhail GENA-LM: A Family of Open-source Foundational DNA Language Models for Long Sequences. Nucleic Acids Research 2025;53:gkae1310. doi:10.1093/nar/gkae1310</w:t>
       </w:r>
     </w:p>
     <w:p>
@@ -6401,7 +6275,7 @@
         <w:ind w:hanging="360" w:left="360"/>
       </w:pPr>
       <w:r>
-        <w:t>38. Miao, Yan; Liu, Fu; Hou, Tao; Liu, Yun Virtifier: A Deep Learning-Based Identifier for Viral Sequences from Metagenomes. Bioinformatics 2022;38:1216--1222. doi:10.1093/bioinformatics/btab845</w:t>
+        <w:t>38. Ren, Jie; Song, Kai; Deng, Chao; Ahlgren, Nathan A.; Fuhrman, Jed A.; Li, Yi; Xie, Xiaohui; Poplin, Ryan; Sun, Fengzhu Identifying Viruses from Metagenomic Data Using Deep Learning. Quantitative Biology 2020;8:64--77. doi:10.1007/s40484-019-0187-4</w:t>
       </w:r>
     </w:p>
     <w:p>
@@ -6409,7 +6283,7 @@
         <w:ind w:hanging="360" w:left="360"/>
       </w:pPr>
       <w:r>
-        <w:t>39. Miao, Yan; Bian, Jilong; Dong, Guanghui; Dai, Tianhong DETIRE: A Hybrid Deep Learning Model for Identifying Viral Sequences from Metagenomes. Frontiers in Microbiology 2023;14:1169791. doi:10.3389/fmicb.2023.1169791</w:t>
+        <w:t>39. Miao, Yan; Liu, Fu; Hou, Tao; Liu, Yun Virtifier: A Deep Learning-Based Identifier for Viral Sequences from Metagenomes. Bioinformatics 2022;38:1216--1222. doi:10.1093/bioinformatics/btab845</w:t>
       </w:r>
     </w:p>
     <w:p>
@@ -6417,7 +6291,63 @@
         <w:ind w:hanging="360" w:left="360"/>
       </w:pPr>
       <w:r>
-        <w:t>40. Moore, Matthew P.; Laager, Mirjam; Ribeca, Paolo; Didelot, Xavier KmerAperture: Retaining k-mer Synteny for Alignment-free Estimation of Within-lineage Core and Accessory Differences.  2022. doi:10.1101/2022.10.12.511870</w:t>
+        <w:t>40. Miao, Yan; Bian, Jilong; Dong, Guanghui; Dai, Tianhong DETIRE: A Hybrid Deep Learning Model for Identifying Viral Sequences from Metagenomes. Frontiers in Microbiology 2023;14:1169791. doi:10.3389/fmicb.2023.1169791</w:t>
+      </w:r>
+    </w:p>
+    <w:p>
+      <w:pPr>
+        <w:ind w:hanging="360" w:left="360"/>
+      </w:pPr>
+      <w:r>
+        <w:t>41. Moore, Matthew P.; Laager, Mirjam; Ribeca, Paolo; Didelot, Xavier KmerAperture: Retaining k-mer Synteny for Alignment-free Estimation of Within-lineage Core and Accessory Differences. bioRxiv 2022. doi:10.1101/2022.10.12.511870</w:t>
+      </w:r>
+    </w:p>
+    <w:p>
+      <w:pPr>
+        <w:ind w:hanging="360" w:left="360"/>
+      </w:pPr>
+      <w:r>
+        <w:t>42. Yang2026mNGS. Reference metadata to be verified before submission.</w:t>
+      </w:r>
+    </w:p>
+    <w:p>
+      <w:pPr>
+        <w:ind w:hanging="360" w:left="360"/>
+      </w:pPr>
+      <w:r>
+        <w:t>43. Huang, Weichun; Li, Leping; Myers, Jason R.; Marth, Gabor T. ART: A Next-generation Sequencing Read Simulator. Bioinformatics 2012;28:593--594. doi:10.1093/bioinformatics/btr708</w:t>
+      </w:r>
+    </w:p>
+    <w:p>
+      <w:pPr>
+        <w:ind w:hanging="360" w:left="360"/>
+      </w:pPr>
+      <w:r>
+        <w:t>44. Wilcoxon1945. Reference metadata to be verified before submission.</w:t>
+      </w:r>
+    </w:p>
+    <w:p>
+      <w:pPr>
+        <w:ind w:hanging="360" w:left="360"/>
+      </w:pPr>
+      <w:r>
+        <w:t>45. Benjamini1995. Reference metadata to be verified before submission.</w:t>
+      </w:r>
+    </w:p>
+    <w:p>
+      <w:pPr>
+        <w:ind w:hanging="360" w:left="360"/>
+      </w:pPr>
+      <w:r>
+        <w:t>46. Kraskov2004. Reference metadata to be verified before submission.</w:t>
+      </w:r>
+    </w:p>
+    <w:p>
+      <w:pPr>
+        <w:ind w:hanging="360" w:left="360"/>
+      </w:pPr>
+      <w:r>
+        <w:t>47. Ross2014. Reference metadata to be verified before submission.</w:t>
       </w:r>
     </w:p>
     <w:p>

</xml_diff>

<commit_message>
Synchronize manuscript figures and submission artifacts
</commit_message>
<xml_diff>
--- a/paper/paper_manuscript.docx
+++ b/paper/paper_manuscript.docx
@@ -3871,7 +3871,7 @@
         <w:rPr>
           <w:b/>
         </w:rPr>
-        <w:t>Figure 4. ART stability and CAMI coarse/fine readout probes.</w:t>
+        <w:t>Figure 4. Current-contract ART stability and CAMI coarse/fine-label readout probes.</w:t>
       </w:r>
     </w:p>
     <w:p>
@@ -3882,7 +3882,7 @@
       <w:r>
         <w:drawing>
           <wp:inline xmlns:a="http://schemas.openxmlformats.org/drawingml/2006/main" xmlns:pic="http://schemas.openxmlformats.org/drawingml/2006/picture">
-            <wp:extent cx="5577840" cy="2521624"/>
+            <wp:extent cx="5577840" cy="2207978"/>
             <wp:docPr id="10" name="Picture 10" descr="Picture 10"/>
             <wp:cNvGraphicFramePr>
               <a:graphicFrameLocks noChangeAspect="1"/>
@@ -3903,7 +3903,7 @@
                   <pic:spPr>
                     <a:xfrm>
                       <a:off x="0" y="0"/>
-                      <a:ext cx="5577840" cy="2521624"/>
+                      <a:ext cx="5577840" cy="2207978"/>
                     </a:xfrm>
                     <a:prstGeom prst="rect"/>
                   </pic:spPr>
@@ -6027,7 +6027,7 @@
         <w:ind w:hanging="360" w:left="360"/>
       </w:pPr>
       <w:r>
-        <w:t>7. Wommack2008. Reference metadata to be verified before submission.</w:t>
+        <w:t>7. Wommack, K. Eric; Bhavsar, Jaysheel; Ravel, Jacques Metagenomics: read length matters. Applied and Environmental Microbiology 2008;74:1453--1463. doi:10.1128/AEM.02181-07</w:t>
       </w:r>
     </w:p>
     <w:p>
@@ -6035,7 +6035,7 @@
         <w:ind w:hanging="360" w:left="360"/>
       </w:pPr>
       <w:r>
-        <w:t>8. Pearman2020. Reference metadata to be verified before submission.</w:t>
+        <w:t>8. Pearman, William S.; Freed, Nikki E.; Silander, Olin K. Testing the advantages and disadvantages of short- and long-read eukaryotic metagenomics using simulated reads. BMC Bioinformatics 2020;21:220. doi:10.1186/s12859-020-3528-4</w:t>
       </w:r>
     </w:p>
     <w:p>
@@ -6299,7 +6299,7 @@
         <w:ind w:hanging="360" w:left="360"/>
       </w:pPr>
       <w:r>
-        <w:t>41. Moore, Matthew P.; Laager, Mirjam; Ribeca, Paolo; Didelot, Xavier KmerAperture: Retaining k-mer Synteny for Alignment-free Estimation of Within-lineage Core and Accessory Differences. bioRxiv 2022. doi:10.1101/2022.10.12.511870</w:t>
+        <w:t>41. Moore, Matthew P.; Laager, Mirjam; Ribeca, Paolo; Didelot, Xavier KmerAperture: Retaining k-mer Synteny for Alignment-free Extraction of Core and Accessory Differences between Bacterial Genomes. PLOS Genetics 2024;20:e1011184. doi:10.1371/journal.pgen.1011184</w:t>
       </w:r>
     </w:p>
     <w:p>
@@ -6307,7 +6307,7 @@
         <w:ind w:hanging="360" w:left="360"/>
       </w:pPr>
       <w:r>
-        <w:t>42. Yang2026mNGS. Reference metadata to be verified before submission.</w:t>
+        <w:t>42. Practice and Progress of mNGS Report Interpretation.  2026.</w:t>
       </w:r>
     </w:p>
     <w:p>
@@ -6323,7 +6323,7 @@
         <w:ind w:hanging="360" w:left="360"/>
       </w:pPr>
       <w:r>
-        <w:t>44. Wilcoxon1945. Reference metadata to be verified before submission.</w:t>
+        <w:t>44. Wilcoxon, Frank Individual Comparisons by Ranking Methods. Biometrics Bulletin 1945;1:80--83. doi:10.2307/3001968</w:t>
       </w:r>
     </w:p>
     <w:p>
@@ -6331,7 +6331,7 @@
         <w:ind w:hanging="360" w:left="360"/>
       </w:pPr>
       <w:r>
-        <w:t>45. Benjamini1995. Reference metadata to be verified before submission.</w:t>
+        <w:t>45. Benjamini, Yoav; Hochberg, Yosef Controlling the False Discovery Rate: A Practical and Powerful Approach to Multiple Testing. Journal of the Royal Statistical Society: Series B (Methodological) 1995;57:289--300. doi:10.1111/j.2517-6161.1995.tb02031.x</w:t>
       </w:r>
     </w:p>
     <w:p>
@@ -6339,7 +6339,7 @@
         <w:ind w:hanging="360" w:left="360"/>
       </w:pPr>
       <w:r>
-        <w:t>46. Kraskov2004. Reference metadata to be verified before submission.</w:t>
+        <w:t>46. Kraskov, Alexander; St{\"o}gbauer, Harald; Grassberger, Peter Estimating mutual information. Physical Review E 2004;69:066138. doi:10.1103/PhysRevE.69.066138</w:t>
       </w:r>
     </w:p>
     <w:p>
@@ -6347,15 +6347,7 @@
         <w:ind w:hanging="360" w:left="360"/>
       </w:pPr>
       <w:r>
-        <w:t>47. Ross2014. Reference metadata to be verified before submission.</w:t>
-      </w:r>
-    </w:p>
-    <w:p>
-      <w:pPr>
-        <w:pStyle w:val="Caption"/>
-      </w:pPr>
-      <w:r>
-        <w:t>Draft note: Author names, affiliations, funding, repository DOI/accession, licence and final reference-manager formatting must be completed before submission.</w:t>
+        <w:t>47. Ross, Brian C. Mutual Information between Discrete and Continuous Data Sets. PLOS ONE 2014;9:e87357. doi:10.1371/journal.pone.0087357</w:t>
       </w:r>
     </w:p>
     <w:sectPr>

</xml_diff>